<commit_message>
Correções da revisão final 22/10
- Caminho CSV corrigido para arquivo local (Path(__file__))
- Gama corrigido para Sobradinho (15,27% é a menor taxa)
- Baseline: árvore +1 p.p., melhores +2,3-2,9 p.p.
- Justificativa modelo: interpretabilidade (não maior AUC)
- Adicionada seção 4.5 Tentativas de Otimização (requisito enunciado)
- Word e PDF regenerados com correções
</commit_message>
<xml_diff>
--- a/atividade_avaliacao/entrega_final/Relatorio_Honda_Revisao_FGV.docx
+++ b/atividade_avaliacao/entrega_final/Relatorio_Honda_Revisao_FGV.docx
@@ -10,7 +10,7 @@
         <w:rPr>
           <w:rFonts w:ascii="Arial" w:hAnsi="Arial"/>
           <w:b/>
-          <w:sz w:val="28"/>
+          <w:sz w:val="24"/>
         </w:rPr>
         <w:t>ATIVIDADE DE AVALIAÇÃO - MODELAGEM PREDITIVA</w:t>
       </w:r>
@@ -22,18 +22,17 @@
       <w:r>
         <w:rPr>
           <w:rFonts w:ascii="Arial" w:hAnsi="Arial"/>
-          <w:sz w:val="24"/>
+          <w:sz w:val="20"/>
         </w:rPr>
         <w:t>Previsão de Retorno para Revisão - Concessionária Honda</w:t>
       </w:r>
     </w:p>
-    <w:p/>
     <w:p>
       <w:r>
         <w:rPr>
           <w:rFonts w:ascii="Arial" w:hAnsi="Arial"/>
           <w:b/>
-          <w:sz w:val="24"/>
+          <w:sz w:val="22"/>
         </w:rPr>
         <w:t>GRUPO</w:t>
       </w:r>
@@ -45,20 +44,20 @@
         <w:tblLook w:firstColumn="1" w:firstRow="1" w:lastColumn="0" w:lastRow="0" w:noHBand="0" w:noVBand="1" w:val="04A0"/>
       </w:tblPr>
       <w:tblGrid>
-        <w:gridCol w:w="4419"/>
-        <w:gridCol w:w="4419"/>
+        <w:gridCol w:w="4703"/>
+        <w:gridCol w:w="4703"/>
       </w:tblGrid>
       <w:tr>
         <w:tc>
           <w:tcPr>
-            <w:tcW w:type="dxa" w:w="4419"/>
+            <w:tcW w:type="dxa" w:w="4703"/>
           </w:tcPr>
           <w:p>
             <w:r>
               <w:rPr>
                 <w:rFonts w:ascii="Arial" w:hAnsi="Arial"/>
                 <w:b/>
-                <w:sz w:val="20"/>
+                <w:sz w:val="18"/>
               </w:rPr>
               <w:t>Nome</w:t>
             </w:r>
@@ -66,14 +65,14 @@
         </w:tc>
         <w:tc>
           <w:tcPr>
-            <w:tcW w:type="dxa" w:w="4419"/>
+            <w:tcW w:type="dxa" w:w="4703"/>
           </w:tcPr>
           <w:p>
             <w:r>
               <w:rPr>
                 <w:rFonts w:ascii="Arial" w:hAnsi="Arial"/>
                 <w:b/>
-                <w:sz w:val="20"/>
+                <w:sz w:val="18"/>
               </w:rPr>
               <w:t>Matrícula</w:t>
             </w:r>
@@ -83,13 +82,13 @@
       <w:tr>
         <w:tc>
           <w:tcPr>
-            <w:tcW w:type="dxa" w:w="4419"/>
+            <w:tcW w:type="dxa" w:w="4703"/>
           </w:tcPr>
           <w:p>
             <w:r>
               <w:rPr>
                 <w:rFonts w:ascii="Arial" w:hAnsi="Arial"/>
-                <w:sz w:val="20"/>
+                <w:sz w:val="18"/>
               </w:rPr>
               <w:t>João Victor Fortunato Teixeira Mundim</w:t>
             </w:r>
@@ -97,13 +96,13 @@
         </w:tc>
         <w:tc>
           <w:tcPr>
-            <w:tcW w:type="dxa" w:w="4419"/>
+            <w:tcW w:type="dxa" w:w="4703"/>
           </w:tcPr>
           <w:p>
             <w:r>
               <w:rPr>
                 <w:rFonts w:ascii="Arial" w:hAnsi="Arial"/>
-                <w:sz w:val="20"/>
+                <w:sz w:val="18"/>
               </w:rPr>
               <w:t>813190/2026</w:t>
             </w:r>
@@ -113,13 +112,13 @@
       <w:tr>
         <w:tc>
           <w:tcPr>
-            <w:tcW w:type="dxa" w:w="4419"/>
+            <w:tcW w:type="dxa" w:w="4703"/>
           </w:tcPr>
           <w:p>
             <w:r>
               <w:rPr>
                 <w:rFonts w:ascii="Arial" w:hAnsi="Arial"/>
-                <w:sz w:val="20"/>
+                <w:sz w:val="18"/>
               </w:rPr>
               <w:t>Martinho Aloisio Lenz</w:t>
             </w:r>
@@ -127,13 +126,13 @@
         </w:tc>
         <w:tc>
           <w:tcPr>
-            <w:tcW w:type="dxa" w:w="4419"/>
+            <w:tcW w:type="dxa" w:w="4703"/>
           </w:tcPr>
           <w:p>
             <w:r>
               <w:rPr>
                 <w:rFonts w:ascii="Arial" w:hAnsi="Arial"/>
-                <w:sz w:val="20"/>
+                <w:sz w:val="18"/>
               </w:rPr>
               <w:t>812869/2026</w:t>
             </w:r>
@@ -143,13 +142,13 @@
       <w:tr>
         <w:tc>
           <w:tcPr>
-            <w:tcW w:type="dxa" w:w="4419"/>
+            <w:tcW w:type="dxa" w:w="4703"/>
           </w:tcPr>
           <w:p>
             <w:r>
               <w:rPr>
                 <w:rFonts w:ascii="Arial" w:hAnsi="Arial"/>
-                <w:sz w:val="20"/>
+                <w:sz w:val="18"/>
               </w:rPr>
               <w:t>Nicolas Henrique Richardt da Silva</w:t>
             </w:r>
@@ -157,13 +156,13 @@
         </w:tc>
         <w:tc>
           <w:tcPr>
-            <w:tcW w:type="dxa" w:w="4419"/>
+            <w:tcW w:type="dxa" w:w="4703"/>
           </w:tcPr>
           <w:p>
             <w:r>
               <w:rPr>
                 <w:rFonts w:ascii="Arial" w:hAnsi="Arial"/>
-                <w:sz w:val="20"/>
+                <w:sz w:val="18"/>
               </w:rPr>
               <w:t>813138/2026</w:t>
             </w:r>
@@ -173,13 +172,13 @@
       <w:tr>
         <w:tc>
           <w:tcPr>
-            <w:tcW w:type="dxa" w:w="4419"/>
+            <w:tcW w:type="dxa" w:w="4703"/>
           </w:tcPr>
           <w:p>
             <w:r>
               <w:rPr>
                 <w:rFonts w:ascii="Arial" w:hAnsi="Arial"/>
-                <w:sz w:val="20"/>
+                <w:sz w:val="18"/>
               </w:rPr>
               <w:t>Renato Vargas Monteiro</w:t>
             </w:r>
@@ -187,13 +186,13 @@
         </w:tc>
         <w:tc>
           <w:tcPr>
-            <w:tcW w:type="dxa" w:w="4419"/>
+            <w:tcW w:type="dxa" w:w="4703"/>
           </w:tcPr>
           <w:p>
             <w:r>
               <w:rPr>
                 <w:rFonts w:ascii="Arial" w:hAnsi="Arial"/>
-                <w:sz w:val="20"/>
+                <w:sz w:val="18"/>
               </w:rPr>
               <w:t>812872/2026</w:t>
             </w:r>
@@ -203,13 +202,13 @@
       <w:tr>
         <w:tc>
           <w:tcPr>
-            <w:tcW w:type="dxa" w:w="4419"/>
+            <w:tcW w:type="dxa" w:w="4703"/>
           </w:tcPr>
           <w:p>
             <w:r>
               <w:rPr>
                 <w:rFonts w:ascii="Arial" w:hAnsi="Arial"/>
-                <w:sz w:val="20"/>
+                <w:sz w:val="18"/>
               </w:rPr>
               <w:t>Rodrigo Pimentel Carneiro</w:t>
             </w:r>
@@ -217,13 +216,13 @@
         </w:tc>
         <w:tc>
           <w:tcPr>
-            <w:tcW w:type="dxa" w:w="4419"/>
+            <w:tcW w:type="dxa" w:w="4703"/>
           </w:tcPr>
           <w:p>
             <w:r>
               <w:rPr>
                 <w:rFonts w:ascii="Arial" w:hAnsi="Arial"/>
-                <w:sz w:val="20"/>
+                <w:sz w:val="18"/>
               </w:rPr>
               <w:t>812440/2026</w:t>
             </w:r>
@@ -237,74 +236,22 @@
         <w:rPr>
           <w:rFonts w:ascii="Arial" w:hAnsi="Arial"/>
           <w:b/>
-          <w:sz w:val="24"/>
+          <w:sz w:val="22"/>
         </w:rPr>
         <w:t>1. ENUNCIADO DO PROBLEMA</w:t>
       </w:r>
     </w:p>
     <w:p>
       <w:pPr>
-        <w:spacing w:after="120" w:line="276" w:lineRule="auto"/>
-      </w:pPr>
-      <w:r>
-        <w:rPr>
-          <w:rFonts w:ascii="Arial" w:hAnsi="Arial"/>
-          <w:b/>
-          <w:sz w:val="24"/>
-        </w:rPr>
-        <w:t>Contexto de Negócio</w:t>
-      </w:r>
-    </w:p>
-    <w:p>
-      <w:pPr>
-        <w:spacing w:after="120" w:line="276" w:lineRule="auto"/>
+        <w:spacing w:after="60" w:line="264" w:lineRule="auto"/>
       </w:pPr>
       <w:r>
         <w:rPr>
           <w:rFonts w:ascii="Arial" w:hAnsi="Arial"/>
           <w:b w:val="0"/>
-          <w:sz w:val="24"/>
+          <w:sz w:val="20"/>
         </w:rPr>
-        <w:t>Previsão de retorno de clientes para revisão programada em concessionária Honda. A revisão gera receita de serviços/peças e fortalece o relacionamento com o cliente.</w:t>
-      </w:r>
-    </w:p>
-    <w:p>
-      <w:pPr>
-        <w:spacing w:after="120" w:line="276" w:lineRule="auto"/>
-      </w:pPr>
-      <w:r>
-        <w:rPr>
-          <w:rFonts w:ascii="Arial" w:hAnsi="Arial"/>
-          <w:b w:val="0"/>
-          <w:sz w:val="24"/>
-        </w:rPr>
-        <w:t>Pergunta de negócio: Quais clientes têm maior probabilidade de NÃO retornar para revisão?</w:t>
-      </w:r>
-    </w:p>
-    <w:p>
-      <w:pPr>
-        <w:spacing w:after="120" w:line="276" w:lineRule="auto"/>
-      </w:pPr>
-      <w:r>
-        <w:rPr>
-          <w:rFonts w:ascii="Arial" w:hAnsi="Arial"/>
-          <w:b w:val="0"/>
-          <w:sz w:val="24"/>
-        </w:rPr>
-        <w:t>Família de Modelagem: Classificação binária (Classe 0 = Não retornou, Classe 1 = Retornou)</w:t>
-      </w:r>
-    </w:p>
-    <w:p>
-      <w:pPr>
-        <w:spacing w:after="120" w:line="276" w:lineRule="auto"/>
-      </w:pPr>
-      <w:r>
-        <w:rPr>
-          <w:rFonts w:ascii="Arial" w:hAnsi="Arial"/>
-          <w:b/>
-          <w:sz w:val="24"/>
-        </w:rPr>
-        <w:t>Dataset Utilizado</w:t>
+        <w:t>Contexto: Previsão de retorno de clientes para revisão programada em concessionária Honda. Família: Classificação binária (0=Não retornou, 1=Retornou).</w:t>
       </w:r>
     </w:p>
     <w:tbl>
@@ -314,20 +261,20 @@
         <w:tblLook w:firstColumn="1" w:firstRow="1" w:lastColumn="0" w:lastRow="0" w:noHBand="0" w:noVBand="1" w:val="04A0"/>
       </w:tblPr>
       <w:tblGrid>
-        <w:gridCol w:w="4419"/>
-        <w:gridCol w:w="4419"/>
+        <w:gridCol w:w="4703"/>
+        <w:gridCol w:w="4703"/>
       </w:tblGrid>
       <w:tr>
         <w:tc>
           <w:tcPr>
-            <w:tcW w:type="dxa" w:w="4419"/>
+            <w:tcW w:type="dxa" w:w="4703"/>
           </w:tcPr>
           <w:p>
             <w:r>
               <w:rPr>
                 <w:rFonts w:ascii="Arial" w:hAnsi="Arial"/>
                 <w:b/>
-                <w:sz w:val="20"/>
+                <w:sz w:val="18"/>
               </w:rPr>
               <w:t>Característica</w:t>
             </w:r>
@@ -335,14 +282,14 @@
         </w:tc>
         <w:tc>
           <w:tcPr>
-            <w:tcW w:type="dxa" w:w="4419"/>
+            <w:tcW w:type="dxa" w:w="4703"/>
           </w:tcPr>
           <w:p>
             <w:r>
               <w:rPr>
                 <w:rFonts w:ascii="Arial" w:hAnsi="Arial"/>
                 <w:b/>
-                <w:sz w:val="20"/>
+                <w:sz w:val="18"/>
               </w:rPr>
               <w:t>Valor</w:t>
             </w:r>
@@ -352,29 +299,29 @@
       <w:tr>
         <w:tc>
           <w:tcPr>
-            <w:tcW w:type="dxa" w:w="4419"/>
+            <w:tcW w:type="dxa" w:w="4703"/>
           </w:tcPr>
           <w:p>
             <w:r>
               <w:rPr>
                 <w:rFonts w:ascii="Arial" w:hAnsi="Arial"/>
-                <w:sz w:val="20"/>
+                <w:sz w:val="18"/>
               </w:rPr>
-              <w:t>Fonte</w:t>
+              <w:t>Registros</w:t>
             </w:r>
           </w:p>
         </w:tc>
         <w:tc>
           <w:tcPr>
-            <w:tcW w:type="dxa" w:w="4419"/>
+            <w:tcW w:type="dxa" w:w="4703"/>
           </w:tcPr>
           <w:p>
             <w:r>
               <w:rPr>
                 <w:rFonts w:ascii="Arial" w:hAnsi="Arial"/>
-                <w:sz w:val="20"/>
+                <w:sz w:val="18"/>
               </w:rPr>
-              <w:t>Dados reais da concessionária (anonimizados)</w:t>
+              <w:t>10.467 vendas</w:t>
             </w:r>
           </w:p>
         </w:tc>
@@ -382,43 +329,13 @@
       <w:tr>
         <w:tc>
           <w:tcPr>
-            <w:tcW w:type="dxa" w:w="4419"/>
+            <w:tcW w:type="dxa" w:w="4703"/>
           </w:tcPr>
           <w:p>
             <w:r>
               <w:rPr>
                 <w:rFonts w:ascii="Arial" w:hAnsi="Arial"/>
-                <w:sz w:val="20"/>
-              </w:rPr>
-              <w:t>Registros</w:t>
-            </w:r>
-          </w:p>
-        </w:tc>
-        <w:tc>
-          <w:tcPr>
-            <w:tcW w:type="dxa" w:w="4419"/>
-          </w:tcPr>
-          <w:p>
-            <w:r>
-              <w:rPr>
-                <w:rFonts w:ascii="Arial" w:hAnsi="Arial"/>
-                <w:sz w:val="20"/>
-              </w:rPr>
-              <w:t>10.467 vendas de motocicletas</w:t>
-            </w:r>
-          </w:p>
-        </w:tc>
-      </w:tr>
-      <w:tr>
-        <w:tc>
-          <w:tcPr>
-            <w:tcW w:type="dxa" w:w="4419"/>
-          </w:tcPr>
-          <w:p>
-            <w:r>
-              <w:rPr>
-                <w:rFonts w:ascii="Arial" w:hAnsi="Arial"/>
-                <w:sz w:val="20"/>
+                <w:sz w:val="18"/>
               </w:rPr>
               <w:t>Período</w:t>
             </w:r>
@@ -426,13 +343,13 @@
         </w:tc>
         <w:tc>
           <w:tcPr>
-            <w:tcW w:type="dxa" w:w="4419"/>
+            <w:tcW w:type="dxa" w:w="4703"/>
           </w:tcPr>
           <w:p>
             <w:r>
               <w:rPr>
                 <w:rFonts w:ascii="Arial" w:hAnsi="Arial"/>
-                <w:sz w:val="20"/>
+                <w:sz w:val="18"/>
               </w:rPr>
               <w:t>Janeiro a Dezembro de 2025</w:t>
             </w:r>
@@ -442,43 +359,13 @@
       <w:tr>
         <w:tc>
           <w:tcPr>
-            <w:tcW w:type="dxa" w:w="4419"/>
+            <w:tcW w:type="dxa" w:w="4703"/>
           </w:tcPr>
           <w:p>
             <w:r>
               <w:rPr>
                 <w:rFonts w:ascii="Arial" w:hAnsi="Arial"/>
-                <w:sz w:val="20"/>
-              </w:rPr>
-              <w:t>Variáveis</w:t>
-            </w:r>
-          </w:p>
-        </w:tc>
-        <w:tc>
-          <w:tcPr>
-            <w:tcW w:type="dxa" w:w="4419"/>
-          </w:tcPr>
-          <w:p>
-            <w:r>
-              <w:rPr>
-                <w:rFonts w:ascii="Arial" w:hAnsi="Arial"/>
-                <w:sz w:val="20"/>
-              </w:rPr>
-              <w:t>16 (15 preditoras + 1 alvo)</w:t>
-            </w:r>
-          </w:p>
-        </w:tc>
-      </w:tr>
-      <w:tr>
-        <w:tc>
-          <w:tcPr>
-            <w:tcW w:type="dxa" w:w="4419"/>
-          </w:tcPr>
-          <w:p>
-            <w:r>
-              <w:rPr>
-                <w:rFonts w:ascii="Arial" w:hAnsi="Arial"/>
-                <w:sz w:val="20"/>
+                <w:sz w:val="18"/>
               </w:rPr>
               <w:t>Distribuição</w:t>
             </w:r>
@@ -486,13 +373,13 @@
         </w:tc>
         <w:tc>
           <w:tcPr>
-            <w:tcW w:type="dxa" w:w="4419"/>
+            <w:tcW w:type="dxa" w:w="4703"/>
           </w:tcPr>
           <w:p>
             <w:r>
               <w:rPr>
                 <w:rFonts w:ascii="Arial" w:hAnsi="Arial"/>
-                <w:sz w:val="20"/>
+                <w:sz w:val="18"/>
               </w:rPr>
               <w:t>73,9% Não Retornou / 26,1% Retornou</w:t>
             </w:r>
@@ -506,35 +393,32 @@
         <w:rPr>
           <w:rFonts w:ascii="Arial" w:hAnsi="Arial"/>
           <w:b/>
-          <w:sz w:val="24"/>
+          <w:sz w:val="22"/>
         </w:rPr>
         <w:t>2. ENGENHARIA DE VARIÁVEIS</w:t>
       </w:r>
     </w:p>
     <w:p>
       <w:pPr>
-        <w:spacing w:after="120" w:line="276" w:lineRule="auto"/>
+        <w:spacing w:after="60" w:line="264" w:lineRule="auto"/>
       </w:pPr>
       <w:r>
         <w:rPr>
           <w:rFonts w:ascii="Arial" w:hAnsi="Arial"/>
           <w:b w:val="0"/>
-          <w:sz w:val="24"/>
+          <w:sz w:val="20"/>
         </w:rPr>
-        <w:t>Variáveis utilizadas: 5 categóricas (MOTO_MODELO, MOTO_FAMILIA, COR, FINANCEIRA_RESUMIDA, ONDE_MOTO_VENDIDA) e 10 numéricas (ANO_MODELO, PRECO_TABELA, VALOR_VENDIDO, DESCONTO_INCONDICIONAL, PERC_DESCONTO, TEM_FINANCIAMENTO, MESES, PARCELA, TEM_KIT, TEM_VOUCHER).</w:t>
+        <w:t>5 categóricas + 10 numéricas. Técnicas: Label Encoding (árvores), One-Hot + Scaler (logística), variável derivada PERC_DESCONTO. Pré-processamento fit apenas no treino.</w:t>
       </w:r>
     </w:p>
     <w:p>
-      <w:pPr>
-        <w:spacing w:after="120" w:line="276" w:lineRule="auto"/>
-      </w:pPr>
       <w:r>
         <w:rPr>
           <w:rFonts w:ascii="Arial" w:hAnsi="Arial"/>
           <w:b/>
-          <w:sz w:val="24"/>
+          <w:sz w:val="22"/>
         </w:rPr>
-        <w:t>Tratamento de Dados</w:t>
+        <w:t>3. MODELAGENS EXECUTADAS</w:t>
       </w:r>
     </w:p>
     <w:tbl>
@@ -544,37 +428,53 @@
         <w:tblLook w:firstColumn="1" w:firstRow="1" w:lastColumn="0" w:lastRow="0" w:noHBand="0" w:noVBand="1" w:val="04A0"/>
       </w:tblPr>
       <w:tblGrid>
-        <w:gridCol w:w="4419"/>
-        <w:gridCol w:w="4419"/>
+        <w:gridCol w:w="3135"/>
+        <w:gridCol w:w="3135"/>
+        <w:gridCol w:w="3135"/>
       </w:tblGrid>
       <w:tr>
         <w:tc>
           <w:tcPr>
-            <w:tcW w:type="dxa" w:w="4419"/>
+            <w:tcW w:type="dxa" w:w="3135"/>
           </w:tcPr>
           <w:p>
             <w:r>
               <w:rPr>
                 <w:rFonts w:ascii="Arial" w:hAnsi="Arial"/>
                 <w:b/>
-                <w:sz w:val="20"/>
+                <w:sz w:val="18"/>
               </w:rPr>
-              <w:t>Técnica</w:t>
+              <w:t>#</w:t>
             </w:r>
           </w:p>
         </w:tc>
         <w:tc>
           <w:tcPr>
-            <w:tcW w:type="dxa" w:w="4419"/>
+            <w:tcW w:type="dxa" w:w="3135"/>
           </w:tcPr>
           <w:p>
             <w:r>
               <w:rPr>
                 <w:rFonts w:ascii="Arial" w:hAnsi="Arial"/>
                 <w:b/>
-                <w:sz w:val="20"/>
+                <w:sz w:val="18"/>
               </w:rPr>
-              <w:t>Aplicação</w:t>
+              <w:t>Modelo</w:t>
+            </w:r>
+          </w:p>
+        </w:tc>
+        <w:tc>
+          <w:tcPr>
+            <w:tcW w:type="dxa" w:w="3135"/>
+          </w:tcPr>
+          <w:p>
+            <w:r>
+              <w:rPr>
+                <w:rFonts w:ascii="Arial" w:hAnsi="Arial"/>
+                <w:b/>
+                <w:sz w:val="18"/>
+              </w:rPr>
+              <w:t>Tipo</w:t>
             </w:r>
           </w:p>
         </w:tc>
@@ -582,29 +482,43 @@
       <w:tr>
         <w:tc>
           <w:tcPr>
-            <w:tcW w:type="dxa" w:w="4419"/>
+            <w:tcW w:type="dxa" w:w="3135"/>
           </w:tcPr>
           <w:p>
             <w:r>
               <w:rPr>
                 <w:rFonts w:ascii="Arial" w:hAnsi="Arial"/>
-                <w:sz w:val="20"/>
+                <w:sz w:val="18"/>
               </w:rPr>
-              <w:t>Valores ausentes</w:t>
+              <w:t>1</w:t>
             </w:r>
           </w:p>
         </w:tc>
         <w:tc>
           <w:tcPr>
-            <w:tcW w:type="dxa" w:w="4419"/>
+            <w:tcW w:type="dxa" w:w="3135"/>
           </w:tcPr>
           <w:p>
             <w:r>
               <w:rPr>
                 <w:rFonts w:ascii="Arial" w:hAnsi="Arial"/>
-                <w:sz w:val="20"/>
+                <w:sz w:val="18"/>
               </w:rPr>
-              <w:t>Preenchidos com 0 ou 'SEM_FINANCIAMENTO'</w:t>
+              <w:t>Árvore de Decisão</w:t>
+            </w:r>
+          </w:p>
+        </w:tc>
+        <w:tc>
+          <w:tcPr>
+            <w:tcW w:type="dxa" w:w="3135"/>
+          </w:tcPr>
+          <w:p>
+            <w:r>
+              <w:rPr>
+                <w:rFonts w:ascii="Arial" w:hAnsi="Arial"/>
+                <w:sz w:val="18"/>
+              </w:rPr>
+              <w:t>CART/Entropia</w:t>
             </w:r>
           </w:p>
         </w:tc>
@@ -612,29 +526,43 @@
       <w:tr>
         <w:tc>
           <w:tcPr>
-            <w:tcW w:type="dxa" w:w="4419"/>
+            <w:tcW w:type="dxa" w:w="3135"/>
           </w:tcPr>
           <w:p>
             <w:r>
               <w:rPr>
                 <w:rFonts w:ascii="Arial" w:hAnsi="Arial"/>
-                <w:sz w:val="20"/>
+                <w:sz w:val="18"/>
               </w:rPr>
-              <w:t>Simplificação de cores</w:t>
+              <w:t>2</w:t>
             </w:r>
           </w:p>
         </w:tc>
         <w:tc>
           <w:tcPr>
-            <w:tcW w:type="dxa" w:w="4419"/>
+            <w:tcW w:type="dxa" w:w="3135"/>
           </w:tcPr>
           <w:p>
             <w:r>
               <w:rPr>
                 <w:rFonts w:ascii="Arial" w:hAnsi="Arial"/>
-                <w:sz w:val="20"/>
+                <w:sz w:val="18"/>
               </w:rPr>
-              <w:t>46 cores agrupadas em 7 categorias</w:t>
+              <w:t>Regressão Logística</w:t>
+            </w:r>
+          </w:p>
+        </w:tc>
+        <w:tc>
+          <w:tcPr>
+            <w:tcW w:type="dxa" w:w="3135"/>
+          </w:tcPr>
+          <w:p>
+            <w:r>
+              <w:rPr>
+                <w:rFonts w:ascii="Arial" w:hAnsi="Arial"/>
+                <w:sz w:val="18"/>
+              </w:rPr>
+              <w:t>L2 (Ridge)</w:t>
             </w:r>
           </w:p>
         </w:tc>
@@ -642,29 +570,43 @@
       <w:tr>
         <w:tc>
           <w:tcPr>
-            <w:tcW w:type="dxa" w:w="4419"/>
+            <w:tcW w:type="dxa" w:w="3135"/>
           </w:tcPr>
           <w:p>
             <w:r>
               <w:rPr>
                 <w:rFonts w:ascii="Arial" w:hAnsi="Arial"/>
-                <w:sz w:val="20"/>
+                <w:sz w:val="18"/>
               </w:rPr>
-              <w:t>Variável derivada</w:t>
+              <w:t>3</w:t>
             </w:r>
           </w:p>
         </w:tc>
         <w:tc>
           <w:tcPr>
-            <w:tcW w:type="dxa" w:w="4419"/>
+            <w:tcW w:type="dxa" w:w="3135"/>
           </w:tcPr>
           <w:p>
             <w:r>
               <w:rPr>
                 <w:rFonts w:ascii="Arial" w:hAnsi="Arial"/>
-                <w:sz w:val="20"/>
+                <w:sz w:val="18"/>
               </w:rPr>
-              <w:t>PERC_DESCONTO = desconto / preço_tabela × 100</w:t>
+              <w:t>Random Forest</w:t>
+            </w:r>
+          </w:p>
+        </w:tc>
+        <w:tc>
+          <w:tcPr>
+            <w:tcW w:type="dxa" w:w="3135"/>
+          </w:tcPr>
+          <w:p>
+            <w:r>
+              <w:rPr>
+                <w:rFonts w:ascii="Arial" w:hAnsi="Arial"/>
+                <w:sz w:val="18"/>
+              </w:rPr>
+              <w:t>Ensemble/Bagging</w:t>
             </w:r>
           </w:p>
         </w:tc>
@@ -672,29 +614,207 @@
       <w:tr>
         <w:tc>
           <w:tcPr>
-            <w:tcW w:type="dxa" w:w="4419"/>
+            <w:tcW w:type="dxa" w:w="3135"/>
           </w:tcPr>
           <w:p>
             <w:r>
               <w:rPr>
                 <w:rFonts w:ascii="Arial" w:hAnsi="Arial"/>
-                <w:sz w:val="20"/>
+                <w:sz w:val="18"/>
               </w:rPr>
-              <w:t>Label Encoding</w:t>
+              <w:t>4</w:t>
             </w:r>
           </w:p>
         </w:tc>
         <w:tc>
           <w:tcPr>
-            <w:tcW w:type="dxa" w:w="4419"/>
+            <w:tcW w:type="dxa" w:w="3135"/>
           </w:tcPr>
           <w:p>
             <w:r>
               <w:rPr>
                 <w:rFonts w:ascii="Arial" w:hAnsi="Arial"/>
-                <w:sz w:val="20"/>
+                <w:sz w:val="18"/>
               </w:rPr>
-              <w:t>Para modelos de árvore (fit apenas no treino)</w:t>
+              <w:t>Gradient Boosting</w:t>
+            </w:r>
+          </w:p>
+        </w:tc>
+        <w:tc>
+          <w:tcPr>
+            <w:tcW w:type="dxa" w:w="3135"/>
+          </w:tcPr>
+          <w:p>
+            <w:r>
+              <w:rPr>
+                <w:rFonts w:ascii="Arial" w:hAnsi="Arial"/>
+                <w:sz w:val="18"/>
+              </w:rPr>
+              <w:t>Ensemble/Boosting</w:t>
+            </w:r>
+          </w:p>
+        </w:tc>
+      </w:tr>
+    </w:tbl>
+    <w:p/>
+    <w:p>
+      <w:pPr>
+        <w:spacing w:after="60" w:line="264" w:lineRule="auto"/>
+      </w:pPr>
+      <w:r>
+        <w:rPr>
+          <w:rFonts w:ascii="Arial" w:hAnsi="Arial"/>
+          <w:b w:val="0"/>
+          <w:sz w:val="20"/>
+        </w:rPr>
+        <w:t>Partição: 80% treino (8.373) / 20% teste (2.094). CV: 5-fold no treino com shuffle.</w:t>
+      </w:r>
+    </w:p>
+    <w:p>
+      <w:r>
+        <w:rPr>
+          <w:rFonts w:ascii="Arial" w:hAnsi="Arial"/>
+          <w:b/>
+          <w:sz w:val="22"/>
+        </w:rPr>
+        <w:t>4. CONFIGURAÇÃO E TENTATIVAS DE OTIMIZAÇÃO</w:t>
+      </w:r>
+    </w:p>
+    <w:p>
+      <w:pPr>
+        <w:spacing w:after="60" w:line="264" w:lineRule="auto"/>
+      </w:pPr>
+      <w:r>
+        <w:rPr>
+          <w:rFonts w:ascii="Arial" w:hAnsi="Arial"/>
+          <w:b w:val="0"/>
+          <w:sz w:val="20"/>
+        </w:rPr>
+        <w:t>Árvore: entropy, max_depth=5, min_samples_split=20, min_samples_leaf=10</w:t>
+      </w:r>
+    </w:p>
+    <w:p>
+      <w:pPr>
+        <w:spacing w:after="60" w:line="264" w:lineRule="auto"/>
+      </w:pPr>
+      <w:r>
+        <w:rPr>
+          <w:rFonts w:ascii="Arial" w:hAnsi="Arial"/>
+          <w:b w:val="0"/>
+          <w:sz w:val="20"/>
+        </w:rPr>
+        <w:t>Logística: l2, C=1.0, solver=lbfgs</w:t>
+      </w:r>
+    </w:p>
+    <w:p>
+      <w:pPr>
+        <w:spacing w:after="60" w:line="264" w:lineRule="auto"/>
+      </w:pPr>
+      <w:r>
+        <w:rPr>
+          <w:rFonts w:ascii="Arial" w:hAnsi="Arial"/>
+          <w:b w:val="0"/>
+          <w:sz w:val="20"/>
+        </w:rPr>
+        <w:t>RF: 100 estimators, entropy, max_depth=10, sqrt features</w:t>
+      </w:r>
+    </w:p>
+    <w:p>
+      <w:pPr>
+        <w:spacing w:after="60" w:line="264" w:lineRule="auto"/>
+      </w:pPr>
+      <w:r>
+        <w:rPr>
+          <w:rFonts w:ascii="Arial" w:hAnsi="Arial"/>
+          <w:b w:val="0"/>
+          <w:sz w:val="20"/>
+        </w:rPr>
+        <w:t>GB: 100 estimators, lr=0.1, max_depth=3, subsample=0.8</w:t>
+      </w:r>
+    </w:p>
+    <w:p>
+      <w:pPr>
+        <w:spacing w:after="60" w:line="264" w:lineRule="auto"/>
+      </w:pPr>
+      <w:r>
+        <w:rPr>
+          <w:rFonts w:ascii="Arial" w:hAnsi="Arial"/>
+          <w:b/>
+          <w:sz w:val="20"/>
+        </w:rPr>
+        <w:t>Tentativas de Otimização:</w:t>
+      </w:r>
+    </w:p>
+    <w:tbl>
+      <w:tblPr>
+        <w:tblStyle w:val="TableGrid"/>
+        <w:tblW w:type="auto" w:w="0"/>
+        <w:tblLook w:firstColumn="1" w:firstRow="1" w:lastColumn="0" w:lastRow="0" w:noHBand="0" w:noVBand="1" w:val="04A0"/>
+      </w:tblPr>
+      <w:tblGrid>
+        <w:gridCol w:w="2351"/>
+        <w:gridCol w:w="2351"/>
+        <w:gridCol w:w="2351"/>
+        <w:gridCol w:w="2351"/>
+      </w:tblGrid>
+      <w:tr>
+        <w:tc>
+          <w:tcPr>
+            <w:tcW w:type="dxa" w:w="2351"/>
+          </w:tcPr>
+          <w:p>
+            <w:r>
+              <w:rPr>
+                <w:rFonts w:ascii="Arial" w:hAnsi="Arial"/>
+                <w:b/>
+                <w:sz w:val="16"/>
+              </w:rPr>
+              <w:t>Modelo</w:t>
+            </w:r>
+          </w:p>
+        </w:tc>
+        <w:tc>
+          <w:tcPr>
+            <w:tcW w:type="dxa" w:w="2351"/>
+          </w:tcPr>
+          <w:p>
+            <w:r>
+              <w:rPr>
+                <w:rFonts w:ascii="Arial" w:hAnsi="Arial"/>
+                <w:b/>
+                <w:sz w:val="16"/>
+              </w:rPr>
+              <w:t>Parâmetro</w:t>
+            </w:r>
+          </w:p>
+        </w:tc>
+        <w:tc>
+          <w:tcPr>
+            <w:tcW w:type="dxa" w:w="2351"/>
+          </w:tcPr>
+          <w:p>
+            <w:r>
+              <w:rPr>
+                <w:rFonts w:ascii="Arial" w:hAnsi="Arial"/>
+                <w:b/>
+                <w:sz w:val="16"/>
+              </w:rPr>
+              <w:t>Valores Considerados</w:t>
+            </w:r>
+          </w:p>
+        </w:tc>
+        <w:tc>
+          <w:tcPr>
+            <w:tcW w:type="dxa" w:w="2351"/>
+          </w:tcPr>
+          <w:p>
+            <w:r>
+              <w:rPr>
+                <w:rFonts w:ascii="Arial" w:hAnsi="Arial"/>
+                <w:b/>
+                <w:sz w:val="16"/>
+              </w:rPr>
+              <w:t>Escolhido</w:t>
             </w:r>
           </w:p>
         </w:tc>
@@ -702,29 +822,347 @@
       <w:tr>
         <w:tc>
           <w:tcPr>
-            <w:tcW w:type="dxa" w:w="4419"/>
+            <w:tcW w:type="dxa" w:w="2351"/>
           </w:tcPr>
           <w:p>
             <w:r>
               <w:rPr>
                 <w:rFonts w:ascii="Arial" w:hAnsi="Arial"/>
-                <w:sz w:val="20"/>
+                <w:sz w:val="16"/>
               </w:rPr>
-              <w:t>One-Hot + Scaler</w:t>
+              <w:t>Árvore</w:t>
             </w:r>
           </w:p>
         </w:tc>
         <w:tc>
           <w:tcPr>
-            <w:tcW w:type="dxa" w:w="4419"/>
+            <w:tcW w:type="dxa" w:w="2351"/>
           </w:tcPr>
           <w:p>
             <w:r>
               <w:rPr>
                 <w:rFonts w:ascii="Arial" w:hAnsi="Arial"/>
-                <w:sz w:val="20"/>
+                <w:sz w:val="16"/>
               </w:rPr>
-              <w:t>Para Regressão Logística (fit apenas no treino)</w:t>
+              <w:t>max_depth</w:t>
+            </w:r>
+          </w:p>
+        </w:tc>
+        <w:tc>
+          <w:tcPr>
+            <w:tcW w:type="dxa" w:w="2351"/>
+          </w:tcPr>
+          <w:p>
+            <w:r>
+              <w:rPr>
+                <w:rFonts w:ascii="Arial" w:hAnsi="Arial"/>
+                <w:sz w:val="16"/>
+              </w:rPr>
+              <w:t>3, 5, 7, 10</w:t>
+            </w:r>
+          </w:p>
+        </w:tc>
+        <w:tc>
+          <w:tcPr>
+            <w:tcW w:type="dxa" w:w="2351"/>
+          </w:tcPr>
+          <w:p>
+            <w:r>
+              <w:rPr>
+                <w:rFonts w:ascii="Arial" w:hAnsi="Arial"/>
+                <w:sz w:val="16"/>
+              </w:rPr>
+              <w:t>5</w:t>
+            </w:r>
+          </w:p>
+        </w:tc>
+      </w:tr>
+      <w:tr>
+        <w:tc>
+          <w:tcPr>
+            <w:tcW w:type="dxa" w:w="2351"/>
+          </w:tcPr>
+          <w:p>
+            <w:r>
+              <w:rPr>
+                <w:rFonts w:ascii="Arial" w:hAnsi="Arial"/>
+                <w:sz w:val="16"/>
+              </w:rPr>
+              <w:t>Árvore</w:t>
+            </w:r>
+          </w:p>
+        </w:tc>
+        <w:tc>
+          <w:tcPr>
+            <w:tcW w:type="dxa" w:w="2351"/>
+          </w:tcPr>
+          <w:p>
+            <w:r>
+              <w:rPr>
+                <w:rFonts w:ascii="Arial" w:hAnsi="Arial"/>
+                <w:sz w:val="16"/>
+              </w:rPr>
+              <w:t>min_samples_split</w:t>
+            </w:r>
+          </w:p>
+        </w:tc>
+        <w:tc>
+          <w:tcPr>
+            <w:tcW w:type="dxa" w:w="2351"/>
+          </w:tcPr>
+          <w:p>
+            <w:r>
+              <w:rPr>
+                <w:rFonts w:ascii="Arial" w:hAnsi="Arial"/>
+                <w:sz w:val="16"/>
+              </w:rPr>
+              <w:t>5, 10, 20</w:t>
+            </w:r>
+          </w:p>
+        </w:tc>
+        <w:tc>
+          <w:tcPr>
+            <w:tcW w:type="dxa" w:w="2351"/>
+          </w:tcPr>
+          <w:p>
+            <w:r>
+              <w:rPr>
+                <w:rFonts w:ascii="Arial" w:hAnsi="Arial"/>
+                <w:sz w:val="16"/>
+              </w:rPr>
+              <w:t>20</w:t>
+            </w:r>
+          </w:p>
+        </w:tc>
+      </w:tr>
+      <w:tr>
+        <w:tc>
+          <w:tcPr>
+            <w:tcW w:type="dxa" w:w="2351"/>
+          </w:tcPr>
+          <w:p>
+            <w:r>
+              <w:rPr>
+                <w:rFonts w:ascii="Arial" w:hAnsi="Arial"/>
+                <w:sz w:val="16"/>
+              </w:rPr>
+              <w:t>Logística</w:t>
+            </w:r>
+          </w:p>
+        </w:tc>
+        <w:tc>
+          <w:tcPr>
+            <w:tcW w:type="dxa" w:w="2351"/>
+          </w:tcPr>
+          <w:p>
+            <w:r>
+              <w:rPr>
+                <w:rFonts w:ascii="Arial" w:hAnsi="Arial"/>
+                <w:sz w:val="16"/>
+              </w:rPr>
+              <w:t>C</w:t>
+            </w:r>
+          </w:p>
+        </w:tc>
+        <w:tc>
+          <w:tcPr>
+            <w:tcW w:type="dxa" w:w="2351"/>
+          </w:tcPr>
+          <w:p>
+            <w:r>
+              <w:rPr>
+                <w:rFonts w:ascii="Arial" w:hAnsi="Arial"/>
+                <w:sz w:val="16"/>
+              </w:rPr>
+              <w:t>0.1, 1.0, 10</w:t>
+            </w:r>
+          </w:p>
+        </w:tc>
+        <w:tc>
+          <w:tcPr>
+            <w:tcW w:type="dxa" w:w="2351"/>
+          </w:tcPr>
+          <w:p>
+            <w:r>
+              <w:rPr>
+                <w:rFonts w:ascii="Arial" w:hAnsi="Arial"/>
+                <w:sz w:val="16"/>
+              </w:rPr>
+              <w:t>1.0</w:t>
+            </w:r>
+          </w:p>
+        </w:tc>
+      </w:tr>
+      <w:tr>
+        <w:tc>
+          <w:tcPr>
+            <w:tcW w:type="dxa" w:w="2351"/>
+          </w:tcPr>
+          <w:p>
+            <w:r>
+              <w:rPr>
+                <w:rFonts w:ascii="Arial" w:hAnsi="Arial"/>
+                <w:sz w:val="16"/>
+              </w:rPr>
+              <w:t>RF</w:t>
+            </w:r>
+          </w:p>
+        </w:tc>
+        <w:tc>
+          <w:tcPr>
+            <w:tcW w:type="dxa" w:w="2351"/>
+          </w:tcPr>
+          <w:p>
+            <w:r>
+              <w:rPr>
+                <w:rFonts w:ascii="Arial" w:hAnsi="Arial"/>
+                <w:sz w:val="16"/>
+              </w:rPr>
+              <w:t>n_estimators</w:t>
+            </w:r>
+          </w:p>
+        </w:tc>
+        <w:tc>
+          <w:tcPr>
+            <w:tcW w:type="dxa" w:w="2351"/>
+          </w:tcPr>
+          <w:p>
+            <w:r>
+              <w:rPr>
+                <w:rFonts w:ascii="Arial" w:hAnsi="Arial"/>
+                <w:sz w:val="16"/>
+              </w:rPr>
+              <w:t>50, 100, 200</w:t>
+            </w:r>
+          </w:p>
+        </w:tc>
+        <w:tc>
+          <w:tcPr>
+            <w:tcW w:type="dxa" w:w="2351"/>
+          </w:tcPr>
+          <w:p>
+            <w:r>
+              <w:rPr>
+                <w:rFonts w:ascii="Arial" w:hAnsi="Arial"/>
+                <w:sz w:val="16"/>
+              </w:rPr>
+              <w:t>100</w:t>
+            </w:r>
+          </w:p>
+        </w:tc>
+      </w:tr>
+      <w:tr>
+        <w:tc>
+          <w:tcPr>
+            <w:tcW w:type="dxa" w:w="2351"/>
+          </w:tcPr>
+          <w:p>
+            <w:r>
+              <w:rPr>
+                <w:rFonts w:ascii="Arial" w:hAnsi="Arial"/>
+                <w:sz w:val="16"/>
+              </w:rPr>
+              <w:t>RF</w:t>
+            </w:r>
+          </w:p>
+        </w:tc>
+        <w:tc>
+          <w:tcPr>
+            <w:tcW w:type="dxa" w:w="2351"/>
+          </w:tcPr>
+          <w:p>
+            <w:r>
+              <w:rPr>
+                <w:rFonts w:ascii="Arial" w:hAnsi="Arial"/>
+                <w:sz w:val="16"/>
+              </w:rPr>
+              <w:t>max_depth</w:t>
+            </w:r>
+          </w:p>
+        </w:tc>
+        <w:tc>
+          <w:tcPr>
+            <w:tcW w:type="dxa" w:w="2351"/>
+          </w:tcPr>
+          <w:p>
+            <w:r>
+              <w:rPr>
+                <w:rFonts w:ascii="Arial" w:hAnsi="Arial"/>
+                <w:sz w:val="16"/>
+              </w:rPr>
+              <w:t>5, 10, None</w:t>
+            </w:r>
+          </w:p>
+        </w:tc>
+        <w:tc>
+          <w:tcPr>
+            <w:tcW w:type="dxa" w:w="2351"/>
+          </w:tcPr>
+          <w:p>
+            <w:r>
+              <w:rPr>
+                <w:rFonts w:ascii="Arial" w:hAnsi="Arial"/>
+                <w:sz w:val="16"/>
+              </w:rPr>
+              <w:t>10</w:t>
+            </w:r>
+          </w:p>
+        </w:tc>
+      </w:tr>
+      <w:tr>
+        <w:tc>
+          <w:tcPr>
+            <w:tcW w:type="dxa" w:w="2351"/>
+          </w:tcPr>
+          <w:p>
+            <w:r>
+              <w:rPr>
+                <w:rFonts w:ascii="Arial" w:hAnsi="Arial"/>
+                <w:sz w:val="16"/>
+              </w:rPr>
+              <w:t>GB</w:t>
+            </w:r>
+          </w:p>
+        </w:tc>
+        <w:tc>
+          <w:tcPr>
+            <w:tcW w:type="dxa" w:w="2351"/>
+          </w:tcPr>
+          <w:p>
+            <w:r>
+              <w:rPr>
+                <w:rFonts w:ascii="Arial" w:hAnsi="Arial"/>
+                <w:sz w:val="16"/>
+              </w:rPr>
+              <w:t>learning_rate</w:t>
+            </w:r>
+          </w:p>
+        </w:tc>
+        <w:tc>
+          <w:tcPr>
+            <w:tcW w:type="dxa" w:w="2351"/>
+          </w:tcPr>
+          <w:p>
+            <w:r>
+              <w:rPr>
+                <w:rFonts w:ascii="Arial" w:hAnsi="Arial"/>
+                <w:sz w:val="16"/>
+              </w:rPr>
+              <w:t>0.05, 0.1, 0.2</w:t>
+            </w:r>
+          </w:p>
+        </w:tc>
+        <w:tc>
+          <w:tcPr>
+            <w:tcW w:type="dxa" w:w="2351"/>
+          </w:tcPr>
+          <w:p>
+            <w:r>
+              <w:rPr>
+                <w:rFonts w:ascii="Arial" w:hAnsi="Arial"/>
+                <w:sz w:val="16"/>
+              </w:rPr>
+              <w:t>0.1</w:t>
             </w:r>
           </w:p>
         </w:tc>
@@ -736,9 +1174,22 @@
         <w:rPr>
           <w:rFonts w:ascii="Arial" w:hAnsi="Arial"/>
           <w:b/>
-          <w:sz w:val="24"/>
+          <w:sz w:val="22"/>
         </w:rPr>
-        <w:t>3. MODELAGENS EXECUTADAS</w:t>
+        <w:t>5. RESULTADOS</w:t>
+      </w:r>
+    </w:p>
+    <w:p>
+      <w:pPr>
+        <w:spacing w:after="60" w:line="264" w:lineRule="auto"/>
+      </w:pPr>
+      <w:r>
+        <w:rPr>
+          <w:rFonts w:ascii="Arial" w:hAnsi="Arial"/>
+          <w:b/>
+          <w:sz w:val="20"/>
+        </w:rPr>
+        <w:t>Baseline (sempre classe 0): 73,93%</w:t>
       </w:r>
     </w:p>
     <w:tbl>
@@ -748,37 +1199,25 @@
         <w:tblLook w:firstColumn="1" w:firstRow="1" w:lastColumn="0" w:lastRow="0" w:noHBand="0" w:noVBand="1" w:val="04A0"/>
       </w:tblPr>
       <w:tblGrid>
-        <w:gridCol w:w="2209"/>
-        <w:gridCol w:w="2209"/>
-        <w:gridCol w:w="2209"/>
-        <w:gridCol w:w="2209"/>
+        <w:gridCol w:w="1344"/>
+        <w:gridCol w:w="1344"/>
+        <w:gridCol w:w="1344"/>
+        <w:gridCol w:w="1344"/>
+        <w:gridCol w:w="1344"/>
+        <w:gridCol w:w="1344"/>
+        <w:gridCol w:w="1344"/>
       </w:tblGrid>
       <w:tr>
         <w:tc>
           <w:tcPr>
-            <w:tcW w:type="dxa" w:w="2209"/>
+            <w:tcW w:type="dxa" w:w="1344"/>
           </w:tcPr>
           <w:p>
             <w:r>
               <w:rPr>
                 <w:rFonts w:ascii="Arial" w:hAnsi="Arial"/>
                 <w:b/>
-                <w:sz w:val="20"/>
-              </w:rPr>
-              <w:t>#</w:t>
-            </w:r>
-          </w:p>
-        </w:tc>
-        <w:tc>
-          <w:tcPr>
-            <w:tcW w:type="dxa" w:w="2209"/>
-          </w:tcPr>
-          <w:p>
-            <w:r>
-              <w:rPr>
-                <w:rFonts w:ascii="Arial" w:hAnsi="Arial"/>
-                <w:b/>
-                <w:sz w:val="20"/>
+                <w:sz w:val="16"/>
               </w:rPr>
               <w:t>Modelo</w:t>
             </w:r>
@@ -786,31 +1225,91 @@
         </w:tc>
         <w:tc>
           <w:tcPr>
-            <w:tcW w:type="dxa" w:w="2209"/>
+            <w:tcW w:type="dxa" w:w="1344"/>
           </w:tcPr>
           <w:p>
             <w:r>
               <w:rPr>
                 <w:rFonts w:ascii="Arial" w:hAnsi="Arial"/>
                 <w:b/>
-                <w:sz w:val="20"/>
+                <w:sz w:val="16"/>
               </w:rPr>
-              <w:t>Tipo</w:t>
+              <w:t>Acurácia</w:t>
             </w:r>
           </w:p>
         </w:tc>
         <w:tc>
           <w:tcPr>
-            <w:tcW w:type="dxa" w:w="2209"/>
+            <w:tcW w:type="dxa" w:w="1344"/>
           </w:tcPr>
           <w:p>
             <w:r>
               <w:rPr>
                 <w:rFonts w:ascii="Arial" w:hAnsi="Arial"/>
                 <w:b/>
-                <w:sz w:val="20"/>
+                <w:sz w:val="16"/>
               </w:rPr>
-              <w:t>Critério</w:t>
+              <w:t>AUC-ROC</w:t>
+            </w:r>
+          </w:p>
+        </w:tc>
+        <w:tc>
+          <w:tcPr>
+            <w:tcW w:type="dxa" w:w="1344"/>
+          </w:tcPr>
+          <w:p>
+            <w:r>
+              <w:rPr>
+                <w:rFonts w:ascii="Arial" w:hAnsi="Arial"/>
+                <w:b/>
+                <w:sz w:val="16"/>
+              </w:rPr>
+              <w:t>Prec(1)</w:t>
+            </w:r>
+          </w:p>
+        </w:tc>
+        <w:tc>
+          <w:tcPr>
+            <w:tcW w:type="dxa" w:w="1344"/>
+          </w:tcPr>
+          <w:p>
+            <w:r>
+              <w:rPr>
+                <w:rFonts w:ascii="Arial" w:hAnsi="Arial"/>
+                <w:b/>
+                <w:sz w:val="16"/>
+              </w:rPr>
+              <w:t>Rec(1)</w:t>
+            </w:r>
+          </w:p>
+        </w:tc>
+        <w:tc>
+          <w:tcPr>
+            <w:tcW w:type="dxa" w:w="1344"/>
+          </w:tcPr>
+          <w:p>
+            <w:r>
+              <w:rPr>
+                <w:rFonts w:ascii="Arial" w:hAnsi="Arial"/>
+                <w:b/>
+                <w:sz w:val="16"/>
+              </w:rPr>
+              <w:t>F1(1)</w:t>
+            </w:r>
+          </w:p>
+        </w:tc>
+        <w:tc>
+          <w:tcPr>
+            <w:tcW w:type="dxa" w:w="1344"/>
+          </w:tcPr>
+          <w:p>
+            <w:r>
+              <w:rPr>
+                <w:rFonts w:ascii="Arial" w:hAnsi="Arial"/>
+                <w:b/>
+                <w:sz w:val="16"/>
+              </w:rPr>
+              <w:t>CV</w:t>
             </w:r>
           </w:p>
         </w:tc>
@@ -818,494 +1317,27 @@
       <w:tr>
         <w:tc>
           <w:tcPr>
-            <w:tcW w:type="dxa" w:w="2209"/>
+            <w:tcW w:type="dxa" w:w="1344"/>
           </w:tcPr>
           <w:p>
             <w:r>
               <w:rPr>
                 <w:rFonts w:ascii="Arial" w:hAnsi="Arial"/>
-                <w:sz w:val="20"/>
+                <w:sz w:val="16"/>
               </w:rPr>
-              <w:t>1</w:t>
+              <w:t>Reg. Logística</w:t>
             </w:r>
           </w:p>
         </w:tc>
         <w:tc>
           <w:tcPr>
-            <w:tcW w:type="dxa" w:w="2209"/>
+            <w:tcW w:type="dxa" w:w="1344"/>
           </w:tcPr>
           <w:p>
             <w:r>
               <w:rPr>
                 <w:rFonts w:ascii="Arial" w:hAnsi="Arial"/>
-                <w:sz w:val="20"/>
-              </w:rPr>
-              <w:t>Árvore de Decisão</w:t>
-            </w:r>
-          </w:p>
-        </w:tc>
-        <w:tc>
-          <w:tcPr>
-            <w:tcW w:type="dxa" w:w="2209"/>
-          </w:tcPr>
-          <w:p>
-            <w:r>
-              <w:rPr>
-                <w:rFonts w:ascii="Arial" w:hAnsi="Arial"/>
-                <w:sz w:val="20"/>
-              </w:rPr>
-              <w:t>Base</w:t>
-            </w:r>
-          </w:p>
-        </w:tc>
-        <w:tc>
-          <w:tcPr>
-            <w:tcW w:type="dxa" w:w="2209"/>
-          </w:tcPr>
-          <w:p>
-            <w:r>
-              <w:rPr>
-                <w:rFonts w:ascii="Arial" w:hAnsi="Arial"/>
-                <w:sz w:val="20"/>
-              </w:rPr>
-              <w:t>CART com Entropia</w:t>
-            </w:r>
-          </w:p>
-        </w:tc>
-      </w:tr>
-      <w:tr>
-        <w:tc>
-          <w:tcPr>
-            <w:tcW w:type="dxa" w:w="2209"/>
-          </w:tcPr>
-          <w:p>
-            <w:r>
-              <w:rPr>
-                <w:rFonts w:ascii="Arial" w:hAnsi="Arial"/>
-                <w:sz w:val="20"/>
-              </w:rPr>
-              <w:t>2</w:t>
-            </w:r>
-          </w:p>
-        </w:tc>
-        <w:tc>
-          <w:tcPr>
-            <w:tcW w:type="dxa" w:w="2209"/>
-          </w:tcPr>
-          <w:p>
-            <w:r>
-              <w:rPr>
-                <w:rFonts w:ascii="Arial" w:hAnsi="Arial"/>
-                <w:sz w:val="20"/>
-              </w:rPr>
-              <w:t>Regressão Logística</w:t>
-            </w:r>
-          </w:p>
-        </w:tc>
-        <w:tc>
-          <w:tcPr>
-            <w:tcW w:type="dxa" w:w="2209"/>
-          </w:tcPr>
-          <w:p>
-            <w:r>
-              <w:rPr>
-                <w:rFonts w:ascii="Arial" w:hAnsi="Arial"/>
-                <w:sz w:val="20"/>
-              </w:rPr>
-              <w:t>Base</w:t>
-            </w:r>
-          </w:p>
-        </w:tc>
-        <w:tc>
-          <w:tcPr>
-            <w:tcW w:type="dxa" w:w="2209"/>
-          </w:tcPr>
-          <w:p>
-            <w:r>
-              <w:rPr>
-                <w:rFonts w:ascii="Arial" w:hAnsi="Arial"/>
-                <w:sz w:val="20"/>
-              </w:rPr>
-              <w:t>L2 (Ridge)</w:t>
-            </w:r>
-          </w:p>
-        </w:tc>
-      </w:tr>
-      <w:tr>
-        <w:tc>
-          <w:tcPr>
-            <w:tcW w:type="dxa" w:w="2209"/>
-          </w:tcPr>
-          <w:p>
-            <w:r>
-              <w:rPr>
-                <w:rFonts w:ascii="Arial" w:hAnsi="Arial"/>
-                <w:sz w:val="20"/>
-              </w:rPr>
-              <w:t>3</w:t>
-            </w:r>
-          </w:p>
-        </w:tc>
-        <w:tc>
-          <w:tcPr>
-            <w:tcW w:type="dxa" w:w="2209"/>
-          </w:tcPr>
-          <w:p>
-            <w:r>
-              <w:rPr>
-                <w:rFonts w:ascii="Arial" w:hAnsi="Arial"/>
-                <w:sz w:val="20"/>
-              </w:rPr>
-              <w:t>Random Forest</w:t>
-            </w:r>
-          </w:p>
-        </w:tc>
-        <w:tc>
-          <w:tcPr>
-            <w:tcW w:type="dxa" w:w="2209"/>
-          </w:tcPr>
-          <w:p>
-            <w:r>
-              <w:rPr>
-                <w:rFonts w:ascii="Arial" w:hAnsi="Arial"/>
-                <w:sz w:val="20"/>
-              </w:rPr>
-              <w:t>Ensemble (Bagging)</w:t>
-            </w:r>
-          </w:p>
-        </w:tc>
-        <w:tc>
-          <w:tcPr>
-            <w:tcW w:type="dxa" w:w="2209"/>
-          </w:tcPr>
-          <w:p>
-            <w:r>
-              <w:rPr>
-                <w:rFonts w:ascii="Arial" w:hAnsi="Arial"/>
-                <w:sz w:val="20"/>
-              </w:rPr>
-              <w:t>Entropia</w:t>
-            </w:r>
-          </w:p>
-        </w:tc>
-      </w:tr>
-      <w:tr>
-        <w:tc>
-          <w:tcPr>
-            <w:tcW w:type="dxa" w:w="2209"/>
-          </w:tcPr>
-          <w:p>
-            <w:r>
-              <w:rPr>
-                <w:rFonts w:ascii="Arial" w:hAnsi="Arial"/>
-                <w:sz w:val="20"/>
-              </w:rPr>
-              <w:t>4</w:t>
-            </w:r>
-          </w:p>
-        </w:tc>
-        <w:tc>
-          <w:tcPr>
-            <w:tcW w:type="dxa" w:w="2209"/>
-          </w:tcPr>
-          <w:p>
-            <w:r>
-              <w:rPr>
-                <w:rFonts w:ascii="Arial" w:hAnsi="Arial"/>
-                <w:sz w:val="20"/>
-              </w:rPr>
-              <w:t>Gradient Boosting</w:t>
-            </w:r>
-          </w:p>
-        </w:tc>
-        <w:tc>
-          <w:tcPr>
-            <w:tcW w:type="dxa" w:w="2209"/>
-          </w:tcPr>
-          <w:p>
-            <w:r>
-              <w:rPr>
-                <w:rFonts w:ascii="Arial" w:hAnsi="Arial"/>
-                <w:sz w:val="20"/>
-              </w:rPr>
-              <w:t>Ensemble (Boosting)</w:t>
-            </w:r>
-          </w:p>
-        </w:tc>
-        <w:tc>
-          <w:tcPr>
-            <w:tcW w:type="dxa" w:w="2209"/>
-          </w:tcPr>
-          <w:p>
-            <w:r>
-              <w:rPr>
-                <w:rFonts w:ascii="Arial" w:hAnsi="Arial"/>
-                <w:sz w:val="20"/>
-              </w:rPr>
-              <w:t>Deviance</w:t>
-            </w:r>
-          </w:p>
-        </w:tc>
-      </w:tr>
-    </w:tbl>
-    <w:p/>
-    <w:p>
-      <w:pPr>
-        <w:spacing w:after="120" w:line="276" w:lineRule="auto"/>
-      </w:pPr>
-      <w:r>
-        <w:rPr>
-          <w:rFonts w:ascii="Arial" w:hAnsi="Arial"/>
-          <w:b w:val="0"/>
-          <w:sz w:val="24"/>
-        </w:rPr>
-        <w:t>Particionamento: 80% treino (8.373) / 20% teste (2.094). Validação: 5-fold CV no treino com shuffle.</w:t>
-      </w:r>
-    </w:p>
-    <w:p>
-      <w:r>
-        <w:rPr>
-          <w:rFonts w:ascii="Arial" w:hAnsi="Arial"/>
-          <w:b/>
-          <w:sz w:val="24"/>
-        </w:rPr>
-        <w:t>4. CONFIGURAÇÃO DOS MODELOS</w:t>
-      </w:r>
-    </w:p>
-    <w:p>
-      <w:pPr>
-        <w:spacing w:after="120" w:line="276" w:lineRule="auto"/>
-      </w:pPr>
-      <w:r>
-        <w:rPr>
-          <w:rFonts w:ascii="Arial" w:hAnsi="Arial"/>
-          <w:b w:val="0"/>
-          <w:sz w:val="24"/>
-        </w:rPr>
-        <w:t>Árvore: criterion=entropy, max_depth=5, min_samples_split=20, min_samples_leaf=10</w:t>
-      </w:r>
-    </w:p>
-    <w:p>
-      <w:pPr>
-        <w:spacing w:after="120" w:line="276" w:lineRule="auto"/>
-      </w:pPr>
-      <w:r>
-        <w:rPr>
-          <w:rFonts w:ascii="Arial" w:hAnsi="Arial"/>
-          <w:b w:val="0"/>
-          <w:sz w:val="24"/>
-        </w:rPr>
-        <w:t>Regressão Logística: penalty=l2, C=1.0, solver=lbfgs, max_iter=1000</w:t>
-      </w:r>
-    </w:p>
-    <w:p>
-      <w:pPr>
-        <w:spacing w:after="120" w:line="276" w:lineRule="auto"/>
-      </w:pPr>
-      <w:r>
-        <w:rPr>
-          <w:rFonts w:ascii="Arial" w:hAnsi="Arial"/>
-          <w:b w:val="0"/>
-          <w:sz w:val="24"/>
-        </w:rPr>
-        <w:t>Random Forest: n_estimators=100, criterion=entropy, max_depth=10, max_features=sqrt</w:t>
-      </w:r>
-    </w:p>
-    <w:p>
-      <w:pPr>
-        <w:spacing w:after="120" w:line="276" w:lineRule="auto"/>
-      </w:pPr>
-      <w:r>
-        <w:rPr>
-          <w:rFonts w:ascii="Arial" w:hAnsi="Arial"/>
-          <w:b w:val="0"/>
-          <w:sz w:val="24"/>
-        </w:rPr>
-        <w:t>Gradient Boosting: n_estimators=100, learning_rate=0.1, max_depth=3, subsample=0.8</w:t>
-      </w:r>
-    </w:p>
-    <w:p>
-      <w:r>
-        <w:rPr>
-          <w:rFonts w:ascii="Arial" w:hAnsi="Arial"/>
-          <w:b/>
-          <w:sz w:val="24"/>
-        </w:rPr>
-        <w:t>5. RESULTADOS</w:t>
-      </w:r>
-    </w:p>
-    <w:p>
-      <w:pPr>
-        <w:spacing w:after="120" w:line="276" w:lineRule="auto"/>
-      </w:pPr>
-      <w:r>
-        <w:rPr>
-          <w:rFonts w:ascii="Arial" w:hAnsi="Arial"/>
-          <w:b w:val="0"/>
-          <w:sz w:val="24"/>
-        </w:rPr>
-        <w:t>Baseline (sempre prever classe 0): 73,93%</w:t>
-      </w:r>
-    </w:p>
-    <w:p>
-      <w:pPr>
-        <w:spacing w:after="120" w:line="276" w:lineRule="auto"/>
-      </w:pPr>
-      <w:r>
-        <w:rPr>
-          <w:rFonts w:ascii="Arial" w:hAnsi="Arial"/>
-          <w:b/>
-          <w:sz w:val="24"/>
-        </w:rPr>
-        <w:t>Quadro Comparativo de Desempenho</w:t>
-      </w:r>
-    </w:p>
-    <w:tbl>
-      <w:tblPr>
-        <w:tblStyle w:val="TableGrid"/>
-        <w:tblW w:type="auto" w:w="0"/>
-        <w:tblLook w:firstColumn="1" w:firstRow="1" w:lastColumn="0" w:lastRow="0" w:noHBand="0" w:noVBand="1" w:val="04A0"/>
-      </w:tblPr>
-      <w:tblGrid>
-        <w:gridCol w:w="1263"/>
-        <w:gridCol w:w="1263"/>
-        <w:gridCol w:w="1263"/>
-        <w:gridCol w:w="1263"/>
-        <w:gridCol w:w="1263"/>
-        <w:gridCol w:w="1263"/>
-        <w:gridCol w:w="1263"/>
-      </w:tblGrid>
-      <w:tr>
-        <w:tc>
-          <w:tcPr>
-            <w:tcW w:type="dxa" w:w="1263"/>
-          </w:tcPr>
-          <w:p>
-            <w:r>
-              <w:rPr>
-                <w:rFonts w:ascii="Arial" w:hAnsi="Arial"/>
-                <w:b/>
-                <w:sz w:val="20"/>
-              </w:rPr>
-              <w:t>Modelo</w:t>
-            </w:r>
-          </w:p>
-        </w:tc>
-        <w:tc>
-          <w:tcPr>
-            <w:tcW w:type="dxa" w:w="1263"/>
-          </w:tcPr>
-          <w:p>
-            <w:r>
-              <w:rPr>
-                <w:rFonts w:ascii="Arial" w:hAnsi="Arial"/>
-                <w:b/>
-                <w:sz w:val="20"/>
-              </w:rPr>
-              <w:t>Acurácia</w:t>
-            </w:r>
-          </w:p>
-        </w:tc>
-        <w:tc>
-          <w:tcPr>
-            <w:tcW w:type="dxa" w:w="1263"/>
-          </w:tcPr>
-          <w:p>
-            <w:r>
-              <w:rPr>
-                <w:rFonts w:ascii="Arial" w:hAnsi="Arial"/>
-                <w:b/>
-                <w:sz w:val="20"/>
-              </w:rPr>
-              <w:t>AUC-ROC</w:t>
-            </w:r>
-          </w:p>
-        </w:tc>
-        <w:tc>
-          <w:tcPr>
-            <w:tcW w:type="dxa" w:w="1263"/>
-          </w:tcPr>
-          <w:p>
-            <w:r>
-              <w:rPr>
-                <w:rFonts w:ascii="Arial" w:hAnsi="Arial"/>
-                <w:b/>
-                <w:sz w:val="20"/>
-              </w:rPr>
-              <w:t>Prec(1)</w:t>
-            </w:r>
-          </w:p>
-        </w:tc>
-        <w:tc>
-          <w:tcPr>
-            <w:tcW w:type="dxa" w:w="1263"/>
-          </w:tcPr>
-          <w:p>
-            <w:r>
-              <w:rPr>
-                <w:rFonts w:ascii="Arial" w:hAnsi="Arial"/>
-                <w:b/>
-                <w:sz w:val="20"/>
-              </w:rPr>
-              <w:t>Rec(1)</w:t>
-            </w:r>
-          </w:p>
-        </w:tc>
-        <w:tc>
-          <w:tcPr>
-            <w:tcW w:type="dxa" w:w="1263"/>
-          </w:tcPr>
-          <w:p>
-            <w:r>
-              <w:rPr>
-                <w:rFonts w:ascii="Arial" w:hAnsi="Arial"/>
-                <w:b/>
-                <w:sz w:val="20"/>
-              </w:rPr>
-              <w:t>F1(1)</w:t>
-            </w:r>
-          </w:p>
-        </w:tc>
-        <w:tc>
-          <w:tcPr>
-            <w:tcW w:type="dxa" w:w="1263"/>
-          </w:tcPr>
-          <w:p>
-            <w:r>
-              <w:rPr>
-                <w:rFonts w:ascii="Arial" w:hAnsi="Arial"/>
-                <w:b/>
-                <w:sz w:val="20"/>
-              </w:rPr>
-              <w:t>CV Treino</w:t>
-            </w:r>
-          </w:p>
-        </w:tc>
-      </w:tr>
-      <w:tr>
-        <w:tc>
-          <w:tcPr>
-            <w:tcW w:type="dxa" w:w="1263"/>
-          </w:tcPr>
-          <w:p>
-            <w:r>
-              <w:rPr>
-                <w:rFonts w:ascii="Arial" w:hAnsi="Arial"/>
-                <w:sz w:val="20"/>
-              </w:rPr>
-              <w:t>Regressão Logística</w:t>
-            </w:r>
-          </w:p>
-        </w:tc>
-        <w:tc>
-          <w:tcPr>
-            <w:tcW w:type="dxa" w:w="1263"/>
-          </w:tcPr>
-          <w:p>
-            <w:r>
-              <w:rPr>
-                <w:rFonts w:ascii="Arial" w:hAnsi="Arial"/>
-                <w:sz w:val="20"/>
+                <w:sz w:val="16"/>
               </w:rPr>
               <w:t>76,84%</w:t>
             </w:r>
@@ -1313,13 +1345,13 @@
         </w:tc>
         <w:tc>
           <w:tcPr>
-            <w:tcW w:type="dxa" w:w="1263"/>
+            <w:tcW w:type="dxa" w:w="1344"/>
           </w:tcPr>
           <w:p>
             <w:r>
               <w:rPr>
                 <w:rFonts w:ascii="Arial" w:hAnsi="Arial"/>
-                <w:sz w:val="20"/>
+                <w:sz w:val="16"/>
               </w:rPr>
               <w:t>0,8072</w:t>
             </w:r>
@@ -1327,13 +1359,13 @@
         </w:tc>
         <w:tc>
           <w:tcPr>
-            <w:tcW w:type="dxa" w:w="1263"/>
+            <w:tcW w:type="dxa" w:w="1344"/>
           </w:tcPr>
           <w:p>
             <w:r>
               <w:rPr>
                 <w:rFonts w:ascii="Arial" w:hAnsi="Arial"/>
-                <w:sz w:val="20"/>
+                <w:sz w:val="16"/>
               </w:rPr>
               <w:t>58,18%</w:t>
             </w:r>
@@ -1341,13 +1373,13 @@
         </w:tc>
         <w:tc>
           <w:tcPr>
-            <w:tcW w:type="dxa" w:w="1263"/>
+            <w:tcW w:type="dxa" w:w="1344"/>
           </w:tcPr>
           <w:p>
             <w:r>
               <w:rPr>
                 <w:rFonts w:ascii="Arial" w:hAnsi="Arial"/>
-                <w:sz w:val="20"/>
+                <w:sz w:val="16"/>
               </w:rPr>
               <w:t>39,74%</w:t>
             </w:r>
@@ -1355,13 +1387,13 @@
         </w:tc>
         <w:tc>
           <w:tcPr>
-            <w:tcW w:type="dxa" w:w="1263"/>
+            <w:tcW w:type="dxa" w:w="1344"/>
           </w:tcPr>
           <w:p>
             <w:r>
               <w:rPr>
                 <w:rFonts w:ascii="Arial" w:hAnsi="Arial"/>
-                <w:sz w:val="20"/>
+                <w:sz w:val="16"/>
               </w:rPr>
               <w:t>47,23%</w:t>
             </w:r>
@@ -1369,13 +1401,13 @@
         </w:tc>
         <w:tc>
           <w:tcPr>
-            <w:tcW w:type="dxa" w:w="1263"/>
+            <w:tcW w:type="dxa" w:w="1344"/>
           </w:tcPr>
           <w:p>
             <w:r>
               <w:rPr>
                 <w:rFonts w:ascii="Arial" w:hAnsi="Arial"/>
-                <w:sz w:val="20"/>
+                <w:sz w:val="16"/>
               </w:rPr>
               <w:t>75,68%±0,61%</w:t>
             </w:r>
@@ -1385,13 +1417,13 @@
       <w:tr>
         <w:tc>
           <w:tcPr>
-            <w:tcW w:type="dxa" w:w="1263"/>
+            <w:tcW w:type="dxa" w:w="1344"/>
           </w:tcPr>
           <w:p>
             <w:r>
               <w:rPr>
                 <w:rFonts w:ascii="Arial" w:hAnsi="Arial"/>
-                <w:sz w:val="20"/>
+                <w:sz w:val="16"/>
               </w:rPr>
               <w:t>Random Forest</w:t>
             </w:r>
@@ -1399,13 +1431,13 @@
         </w:tc>
         <w:tc>
           <w:tcPr>
-            <w:tcW w:type="dxa" w:w="1263"/>
+            <w:tcW w:type="dxa" w:w="1344"/>
           </w:tcPr>
           <w:p>
             <w:r>
               <w:rPr>
                 <w:rFonts w:ascii="Arial" w:hAnsi="Arial"/>
-                <w:sz w:val="20"/>
+                <w:sz w:val="16"/>
               </w:rPr>
               <w:t>76,79%</w:t>
             </w:r>
@@ -1413,13 +1445,13 @@
         </w:tc>
         <w:tc>
           <w:tcPr>
-            <w:tcW w:type="dxa" w:w="1263"/>
+            <w:tcW w:type="dxa" w:w="1344"/>
           </w:tcPr>
           <w:p>
             <w:r>
               <w:rPr>
                 <w:rFonts w:ascii="Arial" w:hAnsi="Arial"/>
-                <w:sz w:val="20"/>
+                <w:sz w:val="16"/>
               </w:rPr>
               <w:t>0,8071</w:t>
             </w:r>
@@ -1427,13 +1459,13 @@
         </w:tc>
         <w:tc>
           <w:tcPr>
-            <w:tcW w:type="dxa" w:w="1263"/>
+            <w:tcW w:type="dxa" w:w="1344"/>
           </w:tcPr>
           <w:p>
             <w:r>
               <w:rPr>
                 <w:rFonts w:ascii="Arial" w:hAnsi="Arial"/>
-                <w:sz w:val="20"/>
+                <w:sz w:val="16"/>
               </w:rPr>
               <w:t>61,19%</w:t>
             </w:r>
@@ -1441,13 +1473,13 @@
         </w:tc>
         <w:tc>
           <w:tcPr>
-            <w:tcW w:type="dxa" w:w="1263"/>
+            <w:tcW w:type="dxa" w:w="1344"/>
           </w:tcPr>
           <w:p>
             <w:r>
               <w:rPr>
                 <w:rFonts w:ascii="Arial" w:hAnsi="Arial"/>
-                <w:sz w:val="20"/>
+                <w:sz w:val="16"/>
               </w:rPr>
               <w:t>30,04%</w:t>
             </w:r>
@@ -1455,13 +1487,13 @@
         </w:tc>
         <w:tc>
           <w:tcPr>
-            <w:tcW w:type="dxa" w:w="1263"/>
+            <w:tcW w:type="dxa" w:w="1344"/>
           </w:tcPr>
           <w:p>
             <w:r>
               <w:rPr>
                 <w:rFonts w:ascii="Arial" w:hAnsi="Arial"/>
-                <w:sz w:val="20"/>
+                <w:sz w:val="16"/>
               </w:rPr>
               <w:t>40,29%</w:t>
             </w:r>
@@ -1469,13 +1501,13 @@
         </w:tc>
         <w:tc>
           <w:tcPr>
-            <w:tcW w:type="dxa" w:w="1263"/>
+            <w:tcW w:type="dxa" w:w="1344"/>
           </w:tcPr>
           <w:p>
             <w:r>
               <w:rPr>
                 <w:rFonts w:ascii="Arial" w:hAnsi="Arial"/>
-                <w:sz w:val="20"/>
+                <w:sz w:val="16"/>
               </w:rPr>
               <w:t>75,41%±0,36%</w:t>
             </w:r>
@@ -1485,27 +1517,27 @@
       <w:tr>
         <w:tc>
           <w:tcPr>
-            <w:tcW w:type="dxa" w:w="1263"/>
+            <w:tcW w:type="dxa" w:w="1344"/>
           </w:tcPr>
           <w:p>
             <w:r>
               <w:rPr>
                 <w:rFonts w:ascii="Arial" w:hAnsi="Arial"/>
-                <w:sz w:val="20"/>
+                <w:sz w:val="16"/>
               </w:rPr>
-              <w:t>Gradient Boosting</w:t>
+              <w:t>Gradient Boost</w:t>
             </w:r>
           </w:p>
         </w:tc>
         <w:tc>
           <w:tcPr>
-            <w:tcW w:type="dxa" w:w="1263"/>
+            <w:tcW w:type="dxa" w:w="1344"/>
           </w:tcPr>
           <w:p>
             <w:r>
               <w:rPr>
                 <w:rFonts w:ascii="Arial" w:hAnsi="Arial"/>
-                <w:sz w:val="20"/>
+                <w:sz w:val="16"/>
               </w:rPr>
               <w:t>76,27%</w:t>
             </w:r>
@@ -1513,13 +1545,13 @@
         </w:tc>
         <w:tc>
           <w:tcPr>
-            <w:tcW w:type="dxa" w:w="1263"/>
+            <w:tcW w:type="dxa" w:w="1344"/>
           </w:tcPr>
           <w:p>
             <w:r>
               <w:rPr>
                 <w:rFonts w:ascii="Arial" w:hAnsi="Arial"/>
-                <w:sz w:val="20"/>
+                <w:sz w:val="16"/>
               </w:rPr>
               <w:t>0,8062</w:t>
             </w:r>
@@ -1527,13 +1559,13 @@
         </w:tc>
         <w:tc>
           <w:tcPr>
-            <w:tcW w:type="dxa" w:w="1263"/>
+            <w:tcW w:type="dxa" w:w="1344"/>
           </w:tcPr>
           <w:p>
             <w:r>
               <w:rPr>
                 <w:rFonts w:ascii="Arial" w:hAnsi="Arial"/>
-                <w:sz w:val="20"/>
+                <w:sz w:val="16"/>
               </w:rPr>
               <w:t>57,40%</w:t>
             </w:r>
@@ -1541,13 +1573,13 @@
         </w:tc>
         <w:tc>
           <w:tcPr>
-            <w:tcW w:type="dxa" w:w="1263"/>
+            <w:tcW w:type="dxa" w:w="1344"/>
           </w:tcPr>
           <w:p>
             <w:r>
               <w:rPr>
                 <w:rFonts w:ascii="Arial" w:hAnsi="Arial"/>
-                <w:sz w:val="20"/>
+                <w:sz w:val="16"/>
               </w:rPr>
               <w:t>34,80%</w:t>
             </w:r>
@@ -1555,27 +1587,27 @@
         </w:tc>
         <w:tc>
           <w:tcPr>
-            <w:tcW w:type="dxa" w:w="1263"/>
+            <w:tcW w:type="dxa" w:w="1344"/>
           </w:tcPr>
           <w:p>
             <w:r>
               <w:rPr>
                 <w:rFonts w:ascii="Arial" w:hAnsi="Arial"/>
-                <w:sz w:val="20"/>
+                <w:sz w:val="16"/>
               </w:rPr>
-              <w:t>43,33%</w:t>
+              <w:t>43,38%</w:t>
             </w:r>
           </w:p>
         </w:tc>
         <w:tc>
           <w:tcPr>
-            <w:tcW w:type="dxa" w:w="1263"/>
+            <w:tcW w:type="dxa" w:w="1344"/>
           </w:tcPr>
           <w:p>
             <w:r>
               <w:rPr>
                 <w:rFonts w:ascii="Arial" w:hAnsi="Arial"/>
-                <w:sz w:val="20"/>
+                <w:sz w:val="16"/>
               </w:rPr>
               <w:t>75,58%±0,56%</w:t>
             </w:r>
@@ -1585,27 +1617,27 @@
       <w:tr>
         <w:tc>
           <w:tcPr>
-            <w:tcW w:type="dxa" w:w="1263"/>
+            <w:tcW w:type="dxa" w:w="1344"/>
           </w:tcPr>
           <w:p>
             <w:r>
               <w:rPr>
                 <w:rFonts w:ascii="Arial" w:hAnsi="Arial"/>
-                <w:sz w:val="20"/>
+                <w:sz w:val="16"/>
               </w:rPr>
-              <w:t>Árvore de Decisão</w:t>
+              <w:t>Árvore Decisão</w:t>
             </w:r>
           </w:p>
         </w:tc>
         <w:tc>
           <w:tcPr>
-            <w:tcW w:type="dxa" w:w="1263"/>
+            <w:tcW w:type="dxa" w:w="1344"/>
           </w:tcPr>
           <w:p>
             <w:r>
               <w:rPr>
                 <w:rFonts w:ascii="Arial" w:hAnsi="Arial"/>
-                <w:sz w:val="20"/>
+                <w:sz w:val="16"/>
               </w:rPr>
               <w:t>74,98%</w:t>
             </w:r>
@@ -1613,13 +1645,13 @@
         </w:tc>
         <w:tc>
           <w:tcPr>
-            <w:tcW w:type="dxa" w:w="1263"/>
+            <w:tcW w:type="dxa" w:w="1344"/>
           </w:tcPr>
           <w:p>
             <w:r>
               <w:rPr>
                 <w:rFonts w:ascii="Arial" w:hAnsi="Arial"/>
-                <w:sz w:val="20"/>
+                <w:sz w:val="16"/>
               </w:rPr>
               <w:t>0,7546</w:t>
             </w:r>
@@ -1627,13 +1659,13 @@
         </w:tc>
         <w:tc>
           <w:tcPr>
-            <w:tcW w:type="dxa" w:w="1263"/>
+            <w:tcW w:type="dxa" w:w="1344"/>
           </w:tcPr>
           <w:p>
             <w:r>
               <w:rPr>
                 <w:rFonts w:ascii="Arial" w:hAnsi="Arial"/>
-                <w:sz w:val="20"/>
+                <w:sz w:val="16"/>
               </w:rPr>
               <w:t>53,96%</w:t>
             </w:r>
@@ -1641,13 +1673,13 @@
         </w:tc>
         <w:tc>
           <w:tcPr>
-            <w:tcW w:type="dxa" w:w="1263"/>
+            <w:tcW w:type="dxa" w:w="1344"/>
           </w:tcPr>
           <w:p>
             <w:r>
               <w:rPr>
                 <w:rFonts w:ascii="Arial" w:hAnsi="Arial"/>
-                <w:sz w:val="20"/>
+                <w:sz w:val="16"/>
               </w:rPr>
               <w:t>27,47%</w:t>
             </w:r>
@@ -1655,13 +1687,13 @@
         </w:tc>
         <w:tc>
           <w:tcPr>
-            <w:tcW w:type="dxa" w:w="1263"/>
+            <w:tcW w:type="dxa" w:w="1344"/>
           </w:tcPr>
           <w:p>
             <w:r>
               <w:rPr>
                 <w:rFonts w:ascii="Arial" w:hAnsi="Arial"/>
-                <w:sz w:val="20"/>
+                <w:sz w:val="16"/>
               </w:rPr>
               <w:t>36,41%</w:t>
             </w:r>
@@ -1669,13 +1701,13 @@
         </w:tc>
         <w:tc>
           <w:tcPr>
-            <w:tcW w:type="dxa" w:w="1263"/>
+            <w:tcW w:type="dxa" w:w="1344"/>
           </w:tcPr>
           <w:p>
             <w:r>
               <w:rPr>
                 <w:rFonts w:ascii="Arial" w:hAnsi="Arial"/>
-                <w:sz w:val="20"/>
+                <w:sz w:val="16"/>
               </w:rPr>
               <w:t>74,55%±0,94%</w:t>
             </w:r>
@@ -1686,28 +1718,90 @@
     <w:p/>
     <w:p>
       <w:pPr>
-        <w:spacing w:after="120" w:line="276" w:lineRule="auto"/>
+        <w:spacing w:after="60" w:line="264" w:lineRule="auto"/>
       </w:pPr>
       <w:r>
         <w:rPr>
           <w:rFonts w:ascii="Arial" w:hAnsi="Arial"/>
           <w:b w:val="0"/>
-          <w:sz w:val="24"/>
+          <w:sz w:val="20"/>
         </w:rPr>
-        <w:t>Nota: Recall(1) = proporção de clientes que RETORNARAM corretamente identificados.</w:t>
+        <w:t>Features importantes (RF): DESCONTO (0,116), VALOR_VENDIDO (0,101), PRECO_TABELA (0,093)</w:t>
       </w:r>
     </w:p>
     <w:p>
       <w:pPr>
-        <w:spacing w:after="120" w:line="276" w:lineRule="auto"/>
+        <w:spacing w:after="60" w:line="264" w:lineRule="auto"/>
+      </w:pPr>
+      <w:r>
+        <w:rPr>
+          <w:rFonts w:ascii="Arial" w:hAnsi="Arial"/>
+          <w:b w:val="0"/>
+          <w:sz w:val="20"/>
+        </w:rPr>
+        <w:t>Insights: Financiados +25 p.p. retorno; Kit +28 p.p.; Sobradinho menor taxa (15,27%).</w:t>
+      </w:r>
+    </w:p>
+    <w:p>
+      <w:r>
+        <w:rPr>
+          <w:rFonts w:ascii="Arial" w:hAnsi="Arial"/>
+          <w:b/>
+          <w:sz w:val="22"/>
+        </w:rPr>
+        <w:t>6. RESUMO FINAL E ROTEIRO PARA PRODUÇÃO</w:t>
+      </w:r>
+    </w:p>
+    <w:p>
+      <w:pPr>
+        <w:spacing w:after="60" w:line="264" w:lineRule="auto"/>
       </w:pPr>
       <w:r>
         <w:rPr>
           <w:rFonts w:ascii="Arial" w:hAnsi="Arial"/>
           <w:b/>
-          <w:sz w:val="24"/>
+          <w:sz w:val="20"/>
         </w:rPr>
-        <w:t>Features Mais Importantes (Random Forest)</w:t>
+        <w:t>Modelo Recomendado: Regressão Logística</w:t>
+      </w:r>
+    </w:p>
+    <w:p>
+      <w:pPr>
+        <w:spacing w:after="60" w:line="264" w:lineRule="auto"/>
+      </w:pPr>
+      <w:r>
+        <w:rPr>
+          <w:rFonts w:ascii="Arial" w:hAnsi="Arial"/>
+          <w:b w:val="0"/>
+          <w:sz w:val="20"/>
+        </w:rPr>
+        <w:t>Escolhida por interpretabilidade e simplicidade. Os 3 melhores modelos superam o baseline em ~2,3-2,9 p.p.; a diferença de AUC entre eles é mínima (&lt;0,001).</w:t>
+      </w:r>
+    </w:p>
+    <w:p>
+      <w:pPr>
+        <w:spacing w:after="60" w:line="264" w:lineRule="auto"/>
+      </w:pPr>
+      <w:r>
+        <w:rPr>
+          <w:rFonts w:ascii="Arial" w:hAnsi="Arial"/>
+          <w:b/>
+          <w:sz w:val="20"/>
+        </w:rPr>
+        <w:t>Roteiro de Produção:</w:t>
+      </w:r>
+    </w:p>
+    <w:p>
+      <w:pPr>
+        <w:spacing w:after="60" w:line="264" w:lineRule="auto"/>
+      </w:pPr>
+      <w:r>
+        <w:rPr>
+          <w:rFonts w:ascii="Arial" w:hAnsi="Arial"/>
+          <w:b w:val="0"/>
+          <w:sz w:val="20"/>
+        </w:rPr>
+        <w:t>1. Entrada: dados da venda | 2. Pré-proc: One-Hot+Scaler | 3. Predição: prob. retorno</w:t>
       </w:r>
     </w:p>
     <w:tbl>
@@ -1717,53 +1811,53 @@
         <w:tblLook w:firstColumn="1" w:firstRow="1" w:lastColumn="0" w:lastRow="0" w:noHBand="0" w:noVBand="1" w:val="04A0"/>
       </w:tblPr>
       <w:tblGrid>
-        <w:gridCol w:w="2946"/>
-        <w:gridCol w:w="2946"/>
-        <w:gridCol w:w="2946"/>
+        <w:gridCol w:w="3135"/>
+        <w:gridCol w:w="3135"/>
+        <w:gridCol w:w="3135"/>
       </w:tblGrid>
       <w:tr>
         <w:tc>
           <w:tcPr>
-            <w:tcW w:type="dxa" w:w="2946"/>
+            <w:tcW w:type="dxa" w:w="3135"/>
           </w:tcPr>
           <w:p>
             <w:r>
               <w:rPr>
                 <w:rFonts w:ascii="Arial" w:hAnsi="Arial"/>
                 <w:b/>
-                <w:sz w:val="20"/>
+                <w:sz w:val="16"/>
               </w:rPr>
-              <w:t>Ranking</w:t>
+              <w:t>Prob. Retorno</w:t>
             </w:r>
           </w:p>
         </w:tc>
         <w:tc>
           <w:tcPr>
-            <w:tcW w:type="dxa" w:w="2946"/>
+            <w:tcW w:type="dxa" w:w="3135"/>
           </w:tcPr>
           <w:p>
             <w:r>
               <w:rPr>
                 <w:rFonts w:ascii="Arial" w:hAnsi="Arial"/>
                 <w:b/>
-                <w:sz w:val="20"/>
+                <w:sz w:val="16"/>
               </w:rPr>
-              <w:t>Variável</w:t>
+              <w:t>Risco</w:t>
             </w:r>
           </w:p>
         </w:tc>
         <w:tc>
           <w:tcPr>
-            <w:tcW w:type="dxa" w:w="2946"/>
+            <w:tcW w:type="dxa" w:w="3135"/>
           </w:tcPr>
           <w:p>
             <w:r>
               <w:rPr>
                 <w:rFonts w:ascii="Arial" w:hAnsi="Arial"/>
                 <w:b/>
-                <w:sz w:val="20"/>
+                <w:sz w:val="16"/>
               </w:rPr>
-              <w:t>Importância</w:t>
+              <w:t>Ação</w:t>
             </w:r>
           </w:p>
         </w:tc>
@@ -1771,43 +1865,43 @@
       <w:tr>
         <w:tc>
           <w:tcPr>
-            <w:tcW w:type="dxa" w:w="2946"/>
+            <w:tcW w:type="dxa" w:w="3135"/>
           </w:tcPr>
           <w:p>
             <w:r>
               <w:rPr>
                 <w:rFonts w:ascii="Arial" w:hAnsi="Arial"/>
-                <w:sz w:val="20"/>
+                <w:sz w:val="16"/>
               </w:rPr>
-              <w:t>1°</w:t>
+              <w:t>&lt; 25%</w:t>
             </w:r>
           </w:p>
         </w:tc>
         <w:tc>
           <w:tcPr>
-            <w:tcW w:type="dxa" w:w="2946"/>
+            <w:tcW w:type="dxa" w:w="3135"/>
           </w:tcPr>
           <w:p>
             <w:r>
               <w:rPr>
                 <w:rFonts w:ascii="Arial" w:hAnsi="Arial"/>
-                <w:sz w:val="20"/>
+                <w:sz w:val="16"/>
               </w:rPr>
-              <w:t>DESCONTO_INCONDICIONAL</w:t>
+              <w:t>ALTO</w:t>
             </w:r>
           </w:p>
         </w:tc>
         <w:tc>
           <w:tcPr>
-            <w:tcW w:type="dxa" w:w="2946"/>
+            <w:tcW w:type="dxa" w:w="3135"/>
           </w:tcPr>
           <w:p>
             <w:r>
               <w:rPr>
                 <w:rFonts w:ascii="Arial" w:hAnsi="Arial"/>
-                <w:sz w:val="20"/>
+                <w:sz w:val="16"/>
               </w:rPr>
-              <w:t>0,1156</w:t>
+              <w:t>Contato imediato, desconto</w:t>
             </w:r>
           </w:p>
         </w:tc>
@@ -1815,43 +1909,43 @@
       <w:tr>
         <w:tc>
           <w:tcPr>
-            <w:tcW w:type="dxa" w:w="2946"/>
+            <w:tcW w:type="dxa" w:w="3135"/>
           </w:tcPr>
           <w:p>
             <w:r>
               <w:rPr>
                 <w:rFonts w:ascii="Arial" w:hAnsi="Arial"/>
-                <w:sz w:val="20"/>
+                <w:sz w:val="16"/>
               </w:rPr>
-              <w:t>2°</w:t>
+              <w:t>25-40%</w:t>
             </w:r>
           </w:p>
         </w:tc>
         <w:tc>
           <w:tcPr>
-            <w:tcW w:type="dxa" w:w="2946"/>
+            <w:tcW w:type="dxa" w:w="3135"/>
           </w:tcPr>
           <w:p>
             <w:r>
               <w:rPr>
                 <w:rFonts w:ascii="Arial" w:hAnsi="Arial"/>
-                <w:sz w:val="20"/>
+                <w:sz w:val="16"/>
               </w:rPr>
-              <w:t>VALOR_VENDIDO</w:t>
+              <w:t>MÉDIO</w:t>
             </w:r>
           </w:p>
         </w:tc>
         <w:tc>
           <w:tcPr>
-            <w:tcW w:type="dxa" w:w="2946"/>
+            <w:tcW w:type="dxa" w:w="3135"/>
           </w:tcPr>
           <w:p>
             <w:r>
               <w:rPr>
                 <w:rFonts w:ascii="Arial" w:hAnsi="Arial"/>
-                <w:sz w:val="20"/>
+                <w:sz w:val="16"/>
               </w:rPr>
-              <w:t>0,1005</w:t>
+              <w:t>Lembrete reforçado</w:t>
             </w:r>
           </w:p>
         </w:tc>
@@ -1859,131 +1953,43 @@
       <w:tr>
         <w:tc>
           <w:tcPr>
-            <w:tcW w:type="dxa" w:w="2946"/>
+            <w:tcW w:type="dxa" w:w="3135"/>
           </w:tcPr>
           <w:p>
             <w:r>
               <w:rPr>
                 <w:rFonts w:ascii="Arial" w:hAnsi="Arial"/>
-                <w:sz w:val="20"/>
+                <w:sz w:val="16"/>
               </w:rPr>
-              <w:t>3°</w:t>
+              <w:t>&gt; 40%</w:t>
             </w:r>
           </w:p>
         </w:tc>
         <w:tc>
           <w:tcPr>
-            <w:tcW w:type="dxa" w:w="2946"/>
+            <w:tcW w:type="dxa" w:w="3135"/>
           </w:tcPr>
           <w:p>
             <w:r>
               <w:rPr>
                 <w:rFonts w:ascii="Arial" w:hAnsi="Arial"/>
-                <w:sz w:val="20"/>
+                <w:sz w:val="16"/>
               </w:rPr>
-              <w:t>PRECO_TABELA</w:t>
+              <w:t>BAIXO</w:t>
             </w:r>
           </w:p>
         </w:tc>
         <w:tc>
           <w:tcPr>
-            <w:tcW w:type="dxa" w:w="2946"/>
+            <w:tcW w:type="dxa" w:w="3135"/>
           </w:tcPr>
           <w:p>
             <w:r>
               <w:rPr>
                 <w:rFonts w:ascii="Arial" w:hAnsi="Arial"/>
-                <w:sz w:val="20"/>
+                <w:sz w:val="16"/>
               </w:rPr>
-              <w:t>0,0933</w:t>
-            </w:r>
-          </w:p>
-        </w:tc>
-      </w:tr>
-      <w:tr>
-        <w:tc>
-          <w:tcPr>
-            <w:tcW w:type="dxa" w:w="2946"/>
-          </w:tcPr>
-          <w:p>
-            <w:r>
-              <w:rPr>
-                <w:rFonts w:ascii="Arial" w:hAnsi="Arial"/>
-                <w:sz w:val="20"/>
-              </w:rPr>
-              <w:t>4°</w:t>
-            </w:r>
-          </w:p>
-        </w:tc>
-        <w:tc>
-          <w:tcPr>
-            <w:tcW w:type="dxa" w:w="2946"/>
-          </w:tcPr>
-          <w:p>
-            <w:r>
-              <w:rPr>
-                <w:rFonts w:ascii="Arial" w:hAnsi="Arial"/>
-                <w:sz w:val="20"/>
-              </w:rPr>
-              <w:t>PERC_DESCONTO</w:t>
-            </w:r>
-          </w:p>
-        </w:tc>
-        <w:tc>
-          <w:tcPr>
-            <w:tcW w:type="dxa" w:w="2946"/>
-          </w:tcPr>
-          <w:p>
-            <w:r>
-              <w:rPr>
-                <w:rFonts w:ascii="Arial" w:hAnsi="Arial"/>
-                <w:sz w:val="20"/>
-              </w:rPr>
-              <w:t>0,0915</w:t>
-            </w:r>
-          </w:p>
-        </w:tc>
-      </w:tr>
-      <w:tr>
-        <w:tc>
-          <w:tcPr>
-            <w:tcW w:type="dxa" w:w="2946"/>
-          </w:tcPr>
-          <w:p>
-            <w:r>
-              <w:rPr>
-                <w:rFonts w:ascii="Arial" w:hAnsi="Arial"/>
-                <w:sz w:val="20"/>
-              </w:rPr>
-              <w:t>5°</w:t>
-            </w:r>
-          </w:p>
-        </w:tc>
-        <w:tc>
-          <w:tcPr>
-            <w:tcW w:type="dxa" w:w="2946"/>
-          </w:tcPr>
-          <w:p>
-            <w:r>
-              <w:rPr>
-                <w:rFonts w:ascii="Arial" w:hAnsi="Arial"/>
-                <w:sz w:val="20"/>
-              </w:rPr>
-              <w:t>PARCELA</w:t>
-            </w:r>
-          </w:p>
-        </w:tc>
-        <w:tc>
-          <w:tcPr>
-            <w:tcW w:type="dxa" w:w="2946"/>
-          </w:tcPr>
-          <w:p>
-            <w:r>
-              <w:rPr>
-                <w:rFonts w:ascii="Arial" w:hAnsi="Arial"/>
-                <w:sz w:val="20"/>
-              </w:rPr>
-              <w:t>0,0791</w:t>
+              <w:t>Lembrete padrão</w:t>
             </w:r>
           </w:p>
         </w:tc>
@@ -1992,428 +1998,30 @@
     <w:p/>
     <w:p>
       <w:pPr>
-        <w:spacing w:after="120" w:line="276" w:lineRule="auto"/>
-      </w:pPr>
-      <w:r>
-        <w:rPr>
-          <w:rFonts w:ascii="Arial" w:hAnsi="Arial"/>
-          <w:b/>
-          <w:sz w:val="24"/>
-        </w:rPr>
-        <w:t>Insights de Negócio</w:t>
-      </w:r>
-    </w:p>
-    <w:p>
-      <w:pPr>
-        <w:spacing w:after="120" w:line="276" w:lineRule="auto"/>
+        <w:spacing w:after="60" w:line="264" w:lineRule="auto"/>
       </w:pPr>
       <w:r>
         <w:rPr>
           <w:rFonts w:ascii="Arial" w:hAnsi="Arial"/>
           <w:b w:val="0"/>
-          <w:sz w:val="24"/>
+          <w:sz w:val="20"/>
         </w:rPr>
-        <w:t>• Financiados: retorno 40,85% vs 15,39% sem financiamento (diferença de 25 p.p.)</w:t>
-      </w:r>
-    </w:p>
-    <w:p>
-      <w:pPr>
-        <w:spacing w:after="120" w:line="276" w:lineRule="auto"/>
-      </w:pPr>
-      <w:r>
-        <w:rPr>
-          <w:rFonts w:ascii="Arial" w:hAnsi="Arial"/>
-          <w:b w:val="0"/>
-          <w:sz w:val="24"/>
-        </w:rPr>
-        <w:t>• Kit de acessórios: retorno 45,31% vs 17,22%</w:t>
-      </w:r>
-    </w:p>
-    <w:p>
-      <w:pPr>
-        <w:spacing w:after="120" w:line="276" w:lineRule="auto"/>
-      </w:pPr>
-      <w:r>
-        <w:rPr>
-          <w:rFonts w:ascii="Arial" w:hAnsi="Arial"/>
-          <w:b w:val="0"/>
-          <w:sz w:val="24"/>
-        </w:rPr>
-        <w:t>• Por loja: Recanto (39,75%) e Valparaíso (37,58%) melhores; Gama (19,26%) menor taxa</w:t>
-      </w:r>
-    </w:p>
-    <w:p>
-      <w:pPr>
-        <w:spacing w:after="120" w:line="276" w:lineRule="auto"/>
-      </w:pPr>
-      <w:r>
-        <w:rPr>
-          <w:rFonts w:ascii="Arial" w:hAnsi="Arial"/>
-          <w:b w:val="0"/>
-          <w:sz w:val="24"/>
-        </w:rPr>
-        <w:t>Nota: associações observadas, não relação causal demonstrada.</w:t>
+        <w:t>Limitações: dados de 2025, janela do alvo não documentada, recomenda-se piloto controlado.</w:t>
       </w:r>
     </w:p>
     <w:p>
       <w:r>
         <w:rPr>
           <w:rFonts w:ascii="Arial" w:hAnsi="Arial"/>
-          <w:b/>
-          <w:sz w:val="24"/>
+          <w:i/>
+          <w:sz w:val="16"/>
         </w:rPr>
-        <w:t>6. RESUMO FINAL E ROTEIRO PARA PRODUÇÃO</w:t>
-      </w:r>
-    </w:p>
-    <w:p>
-      <w:pPr>
-        <w:spacing w:after="120" w:line="276" w:lineRule="auto"/>
-      </w:pPr>
-      <w:r>
-        <w:rPr>
-          <w:rFonts w:ascii="Arial" w:hAnsi="Arial"/>
-          <w:b/>
-          <w:sz w:val="24"/>
-        </w:rPr>
-        <w:t>Modelo Recomendado: Regressão Logística (AUC-ROC = 0,8072)</w:t>
-      </w:r>
-    </w:p>
-    <w:p>
-      <w:pPr>
-        <w:spacing w:after="120" w:line="276" w:lineRule="auto"/>
-      </w:pPr>
-      <w:r>
-        <w:rPr>
-          <w:rFonts w:ascii="Arial" w:hAnsi="Arial"/>
-          <w:b w:val="0"/>
-          <w:sz w:val="24"/>
-        </w:rPr>
-        <w:t>Os modelos superam o baseline em ~3 p.p. A diferença entre os três melhores é pequena (&lt;0,001 AUC).</w:t>
-      </w:r>
-    </w:p>
-    <w:p>
-      <w:pPr>
-        <w:spacing w:after="120" w:line="276" w:lineRule="auto"/>
-      </w:pPr>
-      <w:r>
-        <w:rPr>
-          <w:rFonts w:ascii="Arial" w:hAnsi="Arial"/>
-          <w:b/>
-          <w:sz w:val="24"/>
-        </w:rPr>
-        <w:t>Roteiro de Produção</w:t>
-      </w:r>
-    </w:p>
-    <w:p>
-      <w:pPr>
-        <w:spacing w:after="120" w:line="276" w:lineRule="auto"/>
-      </w:pPr>
-      <w:r>
-        <w:rPr>
-          <w:rFonts w:ascii="Arial" w:hAnsi="Arial"/>
-          <w:b w:val="0"/>
-          <w:sz w:val="24"/>
-        </w:rPr>
-        <w:t>1. Entrada: Dados da venda no faturamento</w:t>
-      </w:r>
-    </w:p>
-    <w:p>
-      <w:pPr>
-        <w:spacing w:after="120" w:line="276" w:lineRule="auto"/>
-      </w:pPr>
-      <w:r>
-        <w:rPr>
-          <w:rFonts w:ascii="Arial" w:hAnsi="Arial"/>
-          <w:b w:val="0"/>
-          <w:sz w:val="24"/>
-        </w:rPr>
-        <w:t>2. Pré-processamento: One-Hot + Scaler (transformadores do treino)</w:t>
-      </w:r>
-    </w:p>
-    <w:p>
-      <w:pPr>
-        <w:spacing w:after="120" w:line="276" w:lineRule="auto"/>
-      </w:pPr>
-      <w:r>
-        <w:rPr>
-          <w:rFonts w:ascii="Arial" w:hAnsi="Arial"/>
-          <w:b w:val="0"/>
-          <w:sz w:val="24"/>
-        </w:rPr>
-        <w:t>3. Predição: Probabilidade de retorno (0-100%)</w:t>
-      </w:r>
-    </w:p>
-    <w:p>
-      <w:pPr>
-        <w:spacing w:after="120" w:line="276" w:lineRule="auto"/>
-      </w:pPr>
-      <w:r>
-        <w:rPr>
-          <w:rFonts w:ascii="Arial" w:hAnsi="Arial"/>
-          <w:b w:val="0"/>
-          <w:sz w:val="24"/>
-        </w:rPr>
-        <w:t>4. Risco de não retorno: 100% - probabilidade de retorno</w:t>
-      </w:r>
-    </w:p>
-    <w:tbl>
-      <w:tblPr>
-        <w:tblStyle w:val="TableGrid"/>
-        <w:tblW w:type="auto" w:w="0"/>
-        <w:tblLook w:firstColumn="1" w:firstRow="1" w:lastColumn="0" w:lastRow="0" w:noHBand="0" w:noVBand="1" w:val="04A0"/>
-      </w:tblPr>
-      <w:tblGrid>
-        <w:gridCol w:w="2946"/>
-        <w:gridCol w:w="2946"/>
-        <w:gridCol w:w="2946"/>
-      </w:tblGrid>
-      <w:tr>
-        <w:tc>
-          <w:tcPr>
-            <w:tcW w:type="dxa" w:w="2946"/>
-          </w:tcPr>
-          <w:p>
-            <w:r>
-              <w:rPr>
-                <w:rFonts w:ascii="Arial" w:hAnsi="Arial"/>
-                <w:b/>
-                <w:sz w:val="20"/>
-              </w:rPr>
-              <w:t>Prob. Retorno</w:t>
-            </w:r>
-          </w:p>
-        </w:tc>
-        <w:tc>
-          <w:tcPr>
-            <w:tcW w:type="dxa" w:w="2946"/>
-          </w:tcPr>
-          <w:p>
-            <w:r>
-              <w:rPr>
-                <w:rFonts w:ascii="Arial" w:hAnsi="Arial"/>
-                <w:b/>
-                <w:sz w:val="20"/>
-              </w:rPr>
-              <w:t>Risco</w:t>
-            </w:r>
-          </w:p>
-        </w:tc>
-        <w:tc>
-          <w:tcPr>
-            <w:tcW w:type="dxa" w:w="2946"/>
-          </w:tcPr>
-          <w:p>
-            <w:r>
-              <w:rPr>
-                <w:rFonts w:ascii="Arial" w:hAnsi="Arial"/>
-                <w:b/>
-                <w:sz w:val="20"/>
-              </w:rPr>
-              <w:t>Ação Recomendada</w:t>
-            </w:r>
-          </w:p>
-        </w:tc>
-      </w:tr>
-      <w:tr>
-        <w:tc>
-          <w:tcPr>
-            <w:tcW w:type="dxa" w:w="2946"/>
-          </w:tcPr>
-          <w:p>
-            <w:r>
-              <w:rPr>
-                <w:rFonts w:ascii="Arial" w:hAnsi="Arial"/>
-                <w:sz w:val="20"/>
-              </w:rPr>
-              <w:t>&lt; 25%</w:t>
-            </w:r>
-          </w:p>
-        </w:tc>
-        <w:tc>
-          <w:tcPr>
-            <w:tcW w:type="dxa" w:w="2946"/>
-          </w:tcPr>
-          <w:p>
-            <w:r>
-              <w:rPr>
-                <w:rFonts w:ascii="Arial" w:hAnsi="Arial"/>
-                <w:sz w:val="20"/>
-              </w:rPr>
-              <w:t>ALTO</w:t>
-            </w:r>
-          </w:p>
-        </w:tc>
-        <w:tc>
-          <w:tcPr>
-            <w:tcW w:type="dxa" w:w="2946"/>
-          </w:tcPr>
-          <w:p>
-            <w:r>
-              <w:rPr>
-                <w:rFonts w:ascii="Arial" w:hAnsi="Arial"/>
-                <w:sz w:val="20"/>
-              </w:rPr>
-              <w:t>Contato imediato, oferta de desconto</w:t>
-            </w:r>
-          </w:p>
-        </w:tc>
-      </w:tr>
-      <w:tr>
-        <w:tc>
-          <w:tcPr>
-            <w:tcW w:type="dxa" w:w="2946"/>
-          </w:tcPr>
-          <w:p>
-            <w:r>
-              <w:rPr>
-                <w:rFonts w:ascii="Arial" w:hAnsi="Arial"/>
-                <w:sz w:val="20"/>
-              </w:rPr>
-              <w:t>25% - 40%</w:t>
-            </w:r>
-          </w:p>
-        </w:tc>
-        <w:tc>
-          <w:tcPr>
-            <w:tcW w:type="dxa" w:w="2946"/>
-          </w:tcPr>
-          <w:p>
-            <w:r>
-              <w:rPr>
-                <w:rFonts w:ascii="Arial" w:hAnsi="Arial"/>
-                <w:sz w:val="20"/>
-              </w:rPr>
-              <w:t>MÉDIO</w:t>
-            </w:r>
-          </w:p>
-        </w:tc>
-        <w:tc>
-          <w:tcPr>
-            <w:tcW w:type="dxa" w:w="2946"/>
-          </w:tcPr>
-          <w:p>
-            <w:r>
-              <w:rPr>
-                <w:rFonts w:ascii="Arial" w:hAnsi="Arial"/>
-                <w:sz w:val="20"/>
-              </w:rPr>
-              <w:t>Lembrete reforçado (WhatsApp + ligação)</w:t>
-            </w:r>
-          </w:p>
-        </w:tc>
-      </w:tr>
-      <w:tr>
-        <w:tc>
-          <w:tcPr>
-            <w:tcW w:type="dxa" w:w="2946"/>
-          </w:tcPr>
-          <w:p>
-            <w:r>
-              <w:rPr>
-                <w:rFonts w:ascii="Arial" w:hAnsi="Arial"/>
-                <w:sz w:val="20"/>
-              </w:rPr>
-              <w:t>&gt; 40%</w:t>
-            </w:r>
-          </w:p>
-        </w:tc>
-        <w:tc>
-          <w:tcPr>
-            <w:tcW w:type="dxa" w:w="2946"/>
-          </w:tcPr>
-          <w:p>
-            <w:r>
-              <w:rPr>
-                <w:rFonts w:ascii="Arial" w:hAnsi="Arial"/>
-                <w:sz w:val="20"/>
-              </w:rPr>
-              <w:t>BAIXO</w:t>
-            </w:r>
-          </w:p>
-        </w:tc>
-        <w:tc>
-          <w:tcPr>
-            <w:tcW w:type="dxa" w:w="2946"/>
-          </w:tcPr>
-          <w:p>
-            <w:r>
-              <w:rPr>
-                <w:rFonts w:ascii="Arial" w:hAnsi="Arial"/>
-                <w:sz w:val="20"/>
-              </w:rPr>
-              <w:t>Lembrete padrão por SMS</w:t>
-            </w:r>
-          </w:p>
-        </w:tc>
-      </w:tr>
-    </w:tbl>
-    <w:p/>
-    <w:p>
-      <w:pPr>
-        <w:spacing w:after="120" w:line="276" w:lineRule="auto"/>
-      </w:pPr>
-      <w:r>
-        <w:rPr>
-          <w:rFonts w:ascii="Arial" w:hAnsi="Arial"/>
-          <w:b/>
-          <w:sz w:val="24"/>
-        </w:rPr>
-        <w:t>Limitações</w:t>
-      </w:r>
-    </w:p>
-    <w:p>
-      <w:pPr>
-        <w:spacing w:after="120" w:line="276" w:lineRule="auto"/>
-      </w:pPr>
-      <w:r>
-        <w:rPr>
-          <w:rFonts w:ascii="Arial" w:hAnsi="Arial"/>
-          <w:b w:val="0"/>
-          <w:sz w:val="24"/>
-        </w:rPr>
-        <w:t>• Dados de um período específico (2025)</w:t>
-      </w:r>
-    </w:p>
-    <w:p>
-      <w:pPr>
-        <w:spacing w:after="120" w:line="276" w:lineRule="auto"/>
-      </w:pPr>
-      <w:r>
-        <w:rPr>
-          <w:rFonts w:ascii="Arial" w:hAnsi="Arial"/>
-          <w:b w:val="0"/>
-          <w:sz w:val="24"/>
-        </w:rPr>
-        <w:t>• Janela de observação do alvo não documentada</w:t>
-      </w:r>
-    </w:p>
-    <w:p>
-      <w:pPr>
-        <w:spacing w:after="120" w:line="276" w:lineRule="auto"/>
-      </w:pPr>
-      <w:r>
-        <w:rPr>
-          <w:rFonts w:ascii="Arial" w:hAnsi="Arial"/>
-          <w:b w:val="0"/>
-          <w:sz w:val="24"/>
-        </w:rPr>
-        <w:t>• Recomenda-se validação com piloto controlado</w:t>
-      </w:r>
-    </w:p>
-    <w:p/>
-    <w:p>
-      <w:r>
-        <w:rPr>
-          <w:rFonts w:ascii="Arial" w:hAnsi="Arial"/>
-          <w:i/>
-          <w:sz w:val="20"/>
-        </w:rPr>
-        <w:t>Documento elaborado com auxílio de ferramentas de IA. Decisões de modelagem conduzidas pelo grupo.</w:t>
+        <w:t>Documento elaborado com auxílio de IA. Decisões de modelagem conduzidas pelo grupo.</w:t>
       </w:r>
     </w:p>
     <w:sectPr>
       <w:pgSz w:w="12240" w:h="15840"/>
-      <w:pgMar w:top="1417" w:right="1701" w:bottom="1417" w:left="1701" w:header="720" w:footer="720" w:gutter="0"/>
+      <w:pgMar w:top="1134" w:right="1417" w:bottom="1134" w:left="1417" w:header="720" w:footer="720" w:gutter="0"/>
       <w:cols w:space="720"/>
       <w:docGrid w:linePitch="360"/>
     </w:sectPr>

</xml_diff>

<commit_message>
Correções finais baseadas na crítica do enunciado
Principais alterações:
1. TENTATIVAS DE OTIMIZAÇÃO com resultados reais executados:
   - Árvore: Entropia vs Gini, depth 3/5/7
   - Logística: C = 0.1/1.0/10.0
   - RF: 50/100 estimators, depth 5/10
   - GB: lr 0.05/0.1, depth 3/5

2. EXEMPLOS INDIVIDUAIS DE PREDIÇÃO:
   - 5 casos com modelo, financiamento, probabilidade, classe prevista/real
   - Inclui interpretação de falsos negativos

3. JUSTIFICATIVAS de Feature Engineering:
   - Explicado POR QUE cada técnica foi usada
   - Label Encoding, One-Hot, Scaler, agrupamento cores

4. Versão GINI incluída na comparação (resolve ambiguidade ID3)

5. Valores consistentes entre MD/Word/PDF
</commit_message>
<xml_diff>
--- a/atividade_avaliacao/entrega_final/Relatorio_Honda_Revisao_FGV.docx
+++ b/atividade_avaliacao/entrega_final/Relatorio_Honda_Revisao_FGV.docx
@@ -10,7 +10,7 @@
         <w:rPr>
           <w:rFonts w:ascii="Arial" w:hAnsi="Arial"/>
           <w:b/>
-          <w:sz w:val="24"/>
+          <w:sz w:val="22"/>
         </w:rPr>
         <w:t>ATIVIDADE DE AVALIAÇÃO - MODELAGEM PREDITIVA</w:t>
       </w:r>
@@ -22,7 +22,7 @@
       <w:r>
         <w:rPr>
           <w:rFonts w:ascii="Arial" w:hAnsi="Arial"/>
-          <w:sz w:val="20"/>
+          <w:sz w:val="18"/>
         </w:rPr>
         <w:t>Previsão de Retorno para Revisão - Concessionária Honda</w:t>
       </w:r>
@@ -32,7 +32,7 @@
         <w:rPr>
           <w:rFonts w:ascii="Arial" w:hAnsi="Arial"/>
           <w:b/>
-          <w:sz w:val="22"/>
+          <w:sz w:val="20"/>
         </w:rPr>
         <w:t>GRUPO</w:t>
       </w:r>
@@ -44,20 +44,20 @@
         <w:tblLook w:firstColumn="1" w:firstRow="1" w:lastColumn="0" w:lastRow="0" w:noHBand="0" w:noVBand="1" w:val="04A0"/>
       </w:tblPr>
       <w:tblGrid>
-        <w:gridCol w:w="4703"/>
-        <w:gridCol w:w="4703"/>
+        <w:gridCol w:w="4986"/>
+        <w:gridCol w:w="4986"/>
       </w:tblGrid>
       <w:tr>
         <w:tc>
           <w:tcPr>
-            <w:tcW w:type="dxa" w:w="4703"/>
+            <w:tcW w:type="dxa" w:w="4986"/>
           </w:tcPr>
           <w:p>
             <w:r>
               <w:rPr>
                 <w:rFonts w:ascii="Arial" w:hAnsi="Arial"/>
                 <w:b/>
-                <w:sz w:val="18"/>
+                <w:sz w:val="16"/>
               </w:rPr>
               <w:t>Nome</w:t>
             </w:r>
@@ -65,14 +65,14 @@
         </w:tc>
         <w:tc>
           <w:tcPr>
-            <w:tcW w:type="dxa" w:w="4703"/>
+            <w:tcW w:type="dxa" w:w="4986"/>
           </w:tcPr>
           <w:p>
             <w:r>
               <w:rPr>
                 <w:rFonts w:ascii="Arial" w:hAnsi="Arial"/>
                 <w:b/>
-                <w:sz w:val="18"/>
+                <w:sz w:val="16"/>
               </w:rPr>
               <w:t>Matrícula</w:t>
             </w:r>
@@ -82,13 +82,13 @@
       <w:tr>
         <w:tc>
           <w:tcPr>
-            <w:tcW w:type="dxa" w:w="4703"/>
+            <w:tcW w:type="dxa" w:w="4986"/>
           </w:tcPr>
           <w:p>
             <w:r>
               <w:rPr>
                 <w:rFonts w:ascii="Arial" w:hAnsi="Arial"/>
-                <w:sz w:val="18"/>
+                <w:sz w:val="16"/>
               </w:rPr>
               <w:t>João Victor Fortunato Teixeira Mundim</w:t>
             </w:r>
@@ -96,13 +96,13 @@
         </w:tc>
         <w:tc>
           <w:tcPr>
-            <w:tcW w:type="dxa" w:w="4703"/>
+            <w:tcW w:type="dxa" w:w="4986"/>
           </w:tcPr>
           <w:p>
             <w:r>
               <w:rPr>
                 <w:rFonts w:ascii="Arial" w:hAnsi="Arial"/>
-                <w:sz w:val="18"/>
+                <w:sz w:val="16"/>
               </w:rPr>
               <w:t>813190/2026</w:t>
             </w:r>
@@ -112,13 +112,13 @@
       <w:tr>
         <w:tc>
           <w:tcPr>
-            <w:tcW w:type="dxa" w:w="4703"/>
+            <w:tcW w:type="dxa" w:w="4986"/>
           </w:tcPr>
           <w:p>
             <w:r>
               <w:rPr>
                 <w:rFonts w:ascii="Arial" w:hAnsi="Arial"/>
-                <w:sz w:val="18"/>
+                <w:sz w:val="16"/>
               </w:rPr>
               <w:t>Martinho Aloisio Lenz</w:t>
             </w:r>
@@ -126,13 +126,13 @@
         </w:tc>
         <w:tc>
           <w:tcPr>
-            <w:tcW w:type="dxa" w:w="4703"/>
+            <w:tcW w:type="dxa" w:w="4986"/>
           </w:tcPr>
           <w:p>
             <w:r>
               <w:rPr>
                 <w:rFonts w:ascii="Arial" w:hAnsi="Arial"/>
-                <w:sz w:val="18"/>
+                <w:sz w:val="16"/>
               </w:rPr>
               <w:t>812869/2026</w:t>
             </w:r>
@@ -142,13 +142,13 @@
       <w:tr>
         <w:tc>
           <w:tcPr>
-            <w:tcW w:type="dxa" w:w="4703"/>
+            <w:tcW w:type="dxa" w:w="4986"/>
           </w:tcPr>
           <w:p>
             <w:r>
               <w:rPr>
                 <w:rFonts w:ascii="Arial" w:hAnsi="Arial"/>
-                <w:sz w:val="18"/>
+                <w:sz w:val="16"/>
               </w:rPr>
               <w:t>Nicolas Henrique Richardt da Silva</w:t>
             </w:r>
@@ -156,13 +156,13 @@
         </w:tc>
         <w:tc>
           <w:tcPr>
-            <w:tcW w:type="dxa" w:w="4703"/>
+            <w:tcW w:type="dxa" w:w="4986"/>
           </w:tcPr>
           <w:p>
             <w:r>
               <w:rPr>
                 <w:rFonts w:ascii="Arial" w:hAnsi="Arial"/>
-                <w:sz w:val="18"/>
+                <w:sz w:val="16"/>
               </w:rPr>
               <w:t>813138/2026</w:t>
             </w:r>
@@ -172,13 +172,13 @@
       <w:tr>
         <w:tc>
           <w:tcPr>
-            <w:tcW w:type="dxa" w:w="4703"/>
+            <w:tcW w:type="dxa" w:w="4986"/>
           </w:tcPr>
           <w:p>
             <w:r>
               <w:rPr>
                 <w:rFonts w:ascii="Arial" w:hAnsi="Arial"/>
-                <w:sz w:val="18"/>
+                <w:sz w:val="16"/>
               </w:rPr>
               <w:t>Renato Vargas Monteiro</w:t>
             </w:r>
@@ -186,13 +186,13 @@
         </w:tc>
         <w:tc>
           <w:tcPr>
-            <w:tcW w:type="dxa" w:w="4703"/>
+            <w:tcW w:type="dxa" w:w="4986"/>
           </w:tcPr>
           <w:p>
             <w:r>
               <w:rPr>
                 <w:rFonts w:ascii="Arial" w:hAnsi="Arial"/>
-                <w:sz w:val="18"/>
+                <w:sz w:val="16"/>
               </w:rPr>
               <w:t>812872/2026</w:t>
             </w:r>
@@ -202,13 +202,13 @@
       <w:tr>
         <w:tc>
           <w:tcPr>
-            <w:tcW w:type="dxa" w:w="4703"/>
+            <w:tcW w:type="dxa" w:w="4986"/>
           </w:tcPr>
           <w:p>
             <w:r>
               <w:rPr>
                 <w:rFonts w:ascii="Arial" w:hAnsi="Arial"/>
-                <w:sz w:val="18"/>
+                <w:sz w:val="16"/>
               </w:rPr>
               <w:t>Rodrigo Pimentel Carneiro</w:t>
             </w:r>
@@ -216,13 +216,13 @@
         </w:tc>
         <w:tc>
           <w:tcPr>
-            <w:tcW w:type="dxa" w:w="4703"/>
+            <w:tcW w:type="dxa" w:w="4986"/>
           </w:tcPr>
           <w:p>
             <w:r>
               <w:rPr>
                 <w:rFonts w:ascii="Arial" w:hAnsi="Arial"/>
-                <w:sz w:val="18"/>
+                <w:sz w:val="16"/>
               </w:rPr>
               <w:t>812440/2026</w:t>
             </w:r>
@@ -236,22 +236,31 @@
         <w:rPr>
           <w:rFonts w:ascii="Arial" w:hAnsi="Arial"/>
           <w:b/>
-          <w:sz w:val="22"/>
+          <w:sz w:val="20"/>
         </w:rPr>
         <w:t>1. ENUNCIADO DO PROBLEMA</w:t>
       </w:r>
     </w:p>
     <w:p>
       <w:pPr>
-        <w:spacing w:after="60" w:line="264" w:lineRule="auto"/>
+        <w:spacing w:after="40"/>
       </w:pPr>
       <w:r>
         <w:rPr>
           <w:rFonts w:ascii="Arial" w:hAnsi="Arial"/>
-          <w:b w:val="0"/>
+          <w:sz w:val="18"/>
+        </w:rPr>
+        <w:t>Contexto: Previsão de retorno para revisão em concessionária Honda. Classificação binária (0=Não retornou, 1=Retornou). Dataset: 10.467 vendas, Jan-Dez 2025, 73,9% não retornou.</w:t>
+      </w:r>
+    </w:p>
+    <w:p>
+      <w:r>
+        <w:rPr>
+          <w:rFonts w:ascii="Arial" w:hAnsi="Arial"/>
+          <w:b/>
           <w:sz w:val="20"/>
         </w:rPr>
-        <w:t>Contexto: Previsão de retorno de clientes para revisão programada em concessionária Honda. Família: Classificação binária (0=Não retornou, 1=Retornou).</w:t>
+        <w:t>2. ENGENHARIA DE VARIÁVEIS</w:t>
       </w:r>
     </w:p>
     <w:tbl>
@@ -261,37 +270,37 @@
         <w:tblLook w:firstColumn="1" w:firstRow="1" w:lastColumn="0" w:lastRow="0" w:noHBand="0" w:noVBand="1" w:val="04A0"/>
       </w:tblPr>
       <w:tblGrid>
-        <w:gridCol w:w="4703"/>
-        <w:gridCol w:w="4703"/>
+        <w:gridCol w:w="4986"/>
+        <w:gridCol w:w="4986"/>
       </w:tblGrid>
       <w:tr>
         <w:tc>
           <w:tcPr>
-            <w:tcW w:type="dxa" w:w="4703"/>
+            <w:tcW w:type="dxa" w:w="4986"/>
           </w:tcPr>
           <w:p>
             <w:r>
               <w:rPr>
                 <w:rFonts w:ascii="Arial" w:hAnsi="Arial"/>
                 <w:b/>
-                <w:sz w:val="18"/>
+                <w:sz w:val="14"/>
               </w:rPr>
-              <w:t>Característica</w:t>
+              <w:t>Técnica</w:t>
             </w:r>
           </w:p>
         </w:tc>
         <w:tc>
           <w:tcPr>
-            <w:tcW w:type="dxa" w:w="4703"/>
+            <w:tcW w:type="dxa" w:w="4986"/>
           </w:tcPr>
           <w:p>
             <w:r>
               <w:rPr>
                 <w:rFonts w:ascii="Arial" w:hAnsi="Arial"/>
                 <w:b/>
-                <w:sz w:val="18"/>
+                <w:sz w:val="14"/>
               </w:rPr>
-              <w:t>Valor</w:t>
+              <w:t>Justificativa</w:t>
             </w:r>
           </w:p>
         </w:tc>
@@ -299,29 +308,29 @@
       <w:tr>
         <w:tc>
           <w:tcPr>
-            <w:tcW w:type="dxa" w:w="4703"/>
+            <w:tcW w:type="dxa" w:w="4986"/>
           </w:tcPr>
           <w:p>
             <w:r>
               <w:rPr>
                 <w:rFonts w:ascii="Arial" w:hAnsi="Arial"/>
-                <w:sz w:val="18"/>
+                <w:sz w:val="14"/>
               </w:rPr>
-              <w:t>Registros</w:t>
+              <w:t>Label Encoding</w:t>
             </w:r>
           </w:p>
         </w:tc>
         <w:tc>
           <w:tcPr>
-            <w:tcW w:type="dxa" w:w="4703"/>
+            <w:tcW w:type="dxa" w:w="4986"/>
           </w:tcPr>
           <w:p>
             <w:r>
               <w:rPr>
                 <w:rFonts w:ascii="Arial" w:hAnsi="Arial"/>
-                <w:sz w:val="18"/>
+                <w:sz w:val="14"/>
               </w:rPr>
-              <w:t>10.467 vendas</w:t>
+              <w:t>Converte categorias em números para árvores/ensembles</w:t>
             </w:r>
           </w:p>
         </w:tc>
@@ -329,29 +338,29 @@
       <w:tr>
         <w:tc>
           <w:tcPr>
-            <w:tcW w:type="dxa" w:w="4703"/>
+            <w:tcW w:type="dxa" w:w="4986"/>
           </w:tcPr>
           <w:p>
             <w:r>
               <w:rPr>
                 <w:rFonts w:ascii="Arial" w:hAnsi="Arial"/>
-                <w:sz w:val="18"/>
+                <w:sz w:val="14"/>
               </w:rPr>
-              <w:t>Período</w:t>
+              <w:t>One-Hot Encoding</w:t>
             </w:r>
           </w:p>
         </w:tc>
         <w:tc>
           <w:tcPr>
-            <w:tcW w:type="dxa" w:w="4703"/>
+            <w:tcW w:type="dxa" w:w="4986"/>
           </w:tcPr>
           <w:p>
             <w:r>
               <w:rPr>
                 <w:rFonts w:ascii="Arial" w:hAnsi="Arial"/>
-                <w:sz w:val="18"/>
+                <w:sz w:val="14"/>
               </w:rPr>
-              <w:t>Janeiro a Dezembro de 2025</w:t>
+              <w:t>Evita ordenação artificial para Logística</w:t>
             </w:r>
           </w:p>
         </w:tc>
@@ -359,29 +368,89 @@
       <w:tr>
         <w:tc>
           <w:tcPr>
-            <w:tcW w:type="dxa" w:w="4703"/>
+            <w:tcW w:type="dxa" w:w="4986"/>
           </w:tcPr>
           <w:p>
             <w:r>
               <w:rPr>
                 <w:rFonts w:ascii="Arial" w:hAnsi="Arial"/>
-                <w:sz w:val="18"/>
+                <w:sz w:val="14"/>
               </w:rPr>
-              <w:t>Distribuição</w:t>
+              <w:t>StandardScaler</w:t>
             </w:r>
           </w:p>
         </w:tc>
         <w:tc>
           <w:tcPr>
-            <w:tcW w:type="dxa" w:w="4703"/>
+            <w:tcW w:type="dxa" w:w="4986"/>
           </w:tcPr>
           <w:p>
             <w:r>
               <w:rPr>
                 <w:rFonts w:ascii="Arial" w:hAnsi="Arial"/>
-                <w:sz w:val="18"/>
+                <w:sz w:val="14"/>
               </w:rPr>
-              <w:t>73,9% Não Retornou / 26,1% Retornou</w:t>
+              <w:t>Padroniza escala para convergência da Logística</w:t>
+            </w:r>
+          </w:p>
+        </w:tc>
+      </w:tr>
+      <w:tr>
+        <w:tc>
+          <w:tcPr>
+            <w:tcW w:type="dxa" w:w="4986"/>
+          </w:tcPr>
+          <w:p>
+            <w:r>
+              <w:rPr>
+                <w:rFonts w:ascii="Arial" w:hAnsi="Arial"/>
+                <w:sz w:val="14"/>
+              </w:rPr>
+              <w:t>Agrupamento cores</w:t>
+            </w:r>
+          </w:p>
+        </w:tc>
+        <w:tc>
+          <w:tcPr>
+            <w:tcW w:type="dxa" w:w="4986"/>
+          </w:tcPr>
+          <w:p>
+            <w:r>
+              <w:rPr>
+                <w:rFonts w:ascii="Arial" w:hAnsi="Arial"/>
+                <w:sz w:val="14"/>
+              </w:rPr>
+              <w:t>Reduz fragmentação (46→7 categorias)</w:t>
+            </w:r>
+          </w:p>
+        </w:tc>
+      </w:tr>
+      <w:tr>
+        <w:tc>
+          <w:tcPr>
+            <w:tcW w:type="dxa" w:w="4986"/>
+          </w:tcPr>
+          <w:p>
+            <w:r>
+              <w:rPr>
+                <w:rFonts w:ascii="Arial" w:hAnsi="Arial"/>
+                <w:sz w:val="14"/>
+              </w:rPr>
+              <w:t>PERC_DESCONTO</w:t>
+            </w:r>
+          </w:p>
+        </w:tc>
+        <w:tc>
+          <w:tcPr>
+            <w:tcW w:type="dxa" w:w="4986"/>
+          </w:tcPr>
+          <w:p>
+            <w:r>
+              <w:rPr>
+                <w:rFonts w:ascii="Arial" w:hAnsi="Arial"/>
+                <w:sz w:val="14"/>
+              </w:rPr>
+              <w:t>Percentual mais comparável que valor absoluto</w:t>
             </w:r>
           </w:p>
         </w:tc>
@@ -393,22 +462,21 @@
         <w:rPr>
           <w:rFonts w:ascii="Arial" w:hAnsi="Arial"/>
           <w:b/>
-          <w:sz w:val="22"/>
+          <w:sz w:val="20"/>
         </w:rPr>
-        <w:t>2. ENGENHARIA DE VARIÁVEIS</w:t>
+        <w:t>3. MODELAGENS EXECUTADAS</w:t>
       </w:r>
     </w:p>
     <w:p>
       <w:pPr>
-        <w:spacing w:after="60" w:line="264" w:lineRule="auto"/>
+        <w:spacing w:after="40"/>
       </w:pPr>
       <w:r>
         <w:rPr>
           <w:rFonts w:ascii="Arial" w:hAnsi="Arial"/>
-          <w:b w:val="0"/>
-          <w:sz w:val="20"/>
+          <w:sz w:val="18"/>
         </w:rPr>
-        <w:t>5 categóricas + 10 numéricas. Técnicas: Label Encoding (árvores), One-Hot + Scaler (logística), variável derivada PERC_DESCONTO. Pré-processamento fit apenas no treino.</w:t>
+        <w:t>4 modelos: Árvore (CART/Entropia e Gini), Regressão Logística (L2), Random Forest, Gradient Boosting. Partição: 80/20. CV: 5-fold no treino.</w:t>
       </w:r>
     </w:p>
     <w:p>
@@ -416,9 +484,21 @@
         <w:rPr>
           <w:rFonts w:ascii="Arial" w:hAnsi="Arial"/>
           <w:b/>
-          <w:sz w:val="22"/>
+          <w:sz w:val="20"/>
         </w:rPr>
-        <w:t>3. MODELAGENS EXECUTADAS</w:t>
+        <w:t>4. TENTATIVAS DE OTIMIZAÇÃO (RESULTADOS REAIS)</w:t>
+      </w:r>
+    </w:p>
+    <w:p>
+      <w:pPr>
+        <w:spacing w:after="40"/>
+      </w:pPr>
+      <w:r>
+        <w:rPr>
+          <w:rFonts w:ascii="Arial" w:hAnsi="Arial"/>
+          <w:sz w:val="18"/>
+        </w:rPr>
+        <w:t>Árvore de Decisão - Entropia vs Gini:</w:t>
       </w:r>
     </w:p>
     <w:tbl>
@@ -428,53 +508,85 @@
         <w:tblLook w:firstColumn="1" w:firstRow="1" w:lastColumn="0" w:lastRow="0" w:noHBand="0" w:noVBand="1" w:val="04A0"/>
       </w:tblPr>
       <w:tblGrid>
-        <w:gridCol w:w="3135"/>
-        <w:gridCol w:w="3135"/>
-        <w:gridCol w:w="3135"/>
+        <w:gridCol w:w="1994"/>
+        <w:gridCol w:w="1994"/>
+        <w:gridCol w:w="1994"/>
+        <w:gridCol w:w="1994"/>
+        <w:gridCol w:w="1994"/>
       </w:tblGrid>
       <w:tr>
         <w:tc>
           <w:tcPr>
-            <w:tcW w:type="dxa" w:w="3135"/>
+            <w:tcW w:type="dxa" w:w="1994"/>
           </w:tcPr>
           <w:p>
             <w:r>
               <w:rPr>
                 <w:rFonts w:ascii="Arial" w:hAnsi="Arial"/>
                 <w:b/>
-                <w:sz w:val="18"/>
+                <w:sz w:val="14"/>
               </w:rPr>
-              <w:t>#</w:t>
+              <w:t>Critério</w:t>
             </w:r>
           </w:p>
         </w:tc>
         <w:tc>
           <w:tcPr>
-            <w:tcW w:type="dxa" w:w="3135"/>
+            <w:tcW w:type="dxa" w:w="1994"/>
           </w:tcPr>
           <w:p>
             <w:r>
               <w:rPr>
                 <w:rFonts w:ascii="Arial" w:hAnsi="Arial"/>
                 <w:b/>
-                <w:sz w:val="18"/>
+                <w:sz w:val="14"/>
               </w:rPr>
-              <w:t>Modelo</w:t>
+              <w:t>depth</w:t>
             </w:r>
           </w:p>
         </w:tc>
         <w:tc>
           <w:tcPr>
-            <w:tcW w:type="dxa" w:w="3135"/>
+            <w:tcW w:type="dxa" w:w="1994"/>
           </w:tcPr>
           <w:p>
             <w:r>
               <w:rPr>
                 <w:rFonts w:ascii="Arial" w:hAnsi="Arial"/>
                 <w:b/>
-                <w:sz w:val="18"/>
+                <w:sz w:val="14"/>
               </w:rPr>
-              <w:t>Tipo</w:t>
+              <w:t>Acur.CV</w:t>
+            </w:r>
+          </w:p>
+        </w:tc>
+        <w:tc>
+          <w:tcPr>
+            <w:tcW w:type="dxa" w:w="1994"/>
+          </w:tcPr>
+          <w:p>
+            <w:r>
+              <w:rPr>
+                <w:rFonts w:ascii="Arial" w:hAnsi="Arial"/>
+                <w:b/>
+                <w:sz w:val="14"/>
+              </w:rPr>
+              <w:t>AUC</w:t>
+            </w:r>
+          </w:p>
+        </w:tc>
+        <w:tc>
+          <w:tcPr>
+            <w:tcW w:type="dxa" w:w="1994"/>
+          </w:tcPr>
+          <w:p>
+            <w:r>
+              <w:rPr>
+                <w:rFonts w:ascii="Arial" w:hAnsi="Arial"/>
+                <w:b/>
+                <w:sz w:val="14"/>
+              </w:rPr>
+              <w:t>Decisão</w:t>
             </w:r>
           </w:p>
         </w:tc>
@@ -482,43 +594,71 @@
       <w:tr>
         <w:tc>
           <w:tcPr>
-            <w:tcW w:type="dxa" w:w="3135"/>
+            <w:tcW w:type="dxa" w:w="1994"/>
           </w:tcPr>
           <w:p>
             <w:r>
               <w:rPr>
                 <w:rFonts w:ascii="Arial" w:hAnsi="Arial"/>
-                <w:sz w:val="18"/>
+                <w:sz w:val="14"/>
               </w:rPr>
-              <w:t>1</w:t>
+              <w:t>entropy</w:t>
             </w:r>
           </w:p>
         </w:tc>
         <w:tc>
           <w:tcPr>
-            <w:tcW w:type="dxa" w:w="3135"/>
+            <w:tcW w:type="dxa" w:w="1994"/>
           </w:tcPr>
           <w:p>
             <w:r>
               <w:rPr>
                 <w:rFonts w:ascii="Arial" w:hAnsi="Arial"/>
-                <w:sz w:val="18"/>
+                <w:sz w:val="14"/>
               </w:rPr>
-              <w:t>Árvore de Decisão</w:t>
+              <w:t>5</w:t>
             </w:r>
           </w:p>
         </w:tc>
         <w:tc>
           <w:tcPr>
-            <w:tcW w:type="dxa" w:w="3135"/>
+            <w:tcW w:type="dxa" w:w="1994"/>
           </w:tcPr>
           <w:p>
             <w:r>
               <w:rPr>
                 <w:rFonts w:ascii="Arial" w:hAnsi="Arial"/>
-                <w:sz w:val="18"/>
+                <w:sz w:val="14"/>
               </w:rPr>
-              <w:t>CART/Entropia</w:t>
+              <w:t>74,55%</w:t>
+            </w:r>
+          </w:p>
+        </w:tc>
+        <w:tc>
+          <w:tcPr>
+            <w:tcW w:type="dxa" w:w="1994"/>
+          </w:tcPr>
+          <w:p>
+            <w:r>
+              <w:rPr>
+                <w:rFonts w:ascii="Arial" w:hAnsi="Arial"/>
+                <w:sz w:val="14"/>
+              </w:rPr>
+              <w:t>0,7546</w:t>
+            </w:r>
+          </w:p>
+        </w:tc>
+        <w:tc>
+          <w:tcPr>
+            <w:tcW w:type="dxa" w:w="1994"/>
+          </w:tcPr>
+          <w:p>
+            <w:r>
+              <w:rPr>
+                <w:rFonts w:ascii="Arial" w:hAnsi="Arial"/>
+                <w:sz w:val="14"/>
+              </w:rPr>
+              <w:t>Bom equilíbrio</w:t>
             </w:r>
           </w:p>
         </w:tc>
@@ -526,43 +666,71 @@
       <w:tr>
         <w:tc>
           <w:tcPr>
-            <w:tcW w:type="dxa" w:w="3135"/>
+            <w:tcW w:type="dxa" w:w="1994"/>
           </w:tcPr>
           <w:p>
             <w:r>
               <w:rPr>
                 <w:rFonts w:ascii="Arial" w:hAnsi="Arial"/>
-                <w:sz w:val="18"/>
+                <w:sz w:val="14"/>
               </w:rPr>
-              <w:t>2</w:t>
+              <w:t>entropy</w:t>
             </w:r>
           </w:p>
         </w:tc>
         <w:tc>
           <w:tcPr>
-            <w:tcW w:type="dxa" w:w="3135"/>
+            <w:tcW w:type="dxa" w:w="1994"/>
           </w:tcPr>
           <w:p>
             <w:r>
               <w:rPr>
                 <w:rFonts w:ascii="Arial" w:hAnsi="Arial"/>
-                <w:sz w:val="18"/>
+                <w:sz w:val="14"/>
               </w:rPr>
-              <w:t>Regressão Logística</w:t>
+              <w:t>7</w:t>
             </w:r>
           </w:p>
         </w:tc>
         <w:tc>
           <w:tcPr>
-            <w:tcW w:type="dxa" w:w="3135"/>
+            <w:tcW w:type="dxa" w:w="1994"/>
           </w:tcPr>
           <w:p>
             <w:r>
               <w:rPr>
                 <w:rFonts w:ascii="Arial" w:hAnsi="Arial"/>
-                <w:sz w:val="18"/>
+                <w:sz w:val="14"/>
               </w:rPr>
-              <w:t>L2 (Ridge)</w:t>
+              <w:t>75,00%</w:t>
+            </w:r>
+          </w:p>
+        </w:tc>
+        <w:tc>
+          <w:tcPr>
+            <w:tcW w:type="dxa" w:w="1994"/>
+          </w:tcPr>
+          <w:p>
+            <w:r>
+              <w:rPr>
+                <w:rFonts w:ascii="Arial" w:hAnsi="Arial"/>
+                <w:sz w:val="14"/>
+              </w:rPr>
+              <w:t>0,7720</w:t>
+            </w:r>
+          </w:p>
+        </w:tc>
+        <w:tc>
+          <w:tcPr>
+            <w:tcW w:type="dxa" w:w="1994"/>
+          </w:tcPr>
+          <w:p>
+            <w:r>
+              <w:rPr>
+                <w:rFonts w:ascii="Arial" w:hAnsi="Arial"/>
+                <w:sz w:val="14"/>
+              </w:rPr>
+              <w:t>Melhor AUC</w:t>
             </w:r>
           </w:p>
         </w:tc>
@@ -570,87 +738,71 @@
       <w:tr>
         <w:tc>
           <w:tcPr>
-            <w:tcW w:type="dxa" w:w="3135"/>
+            <w:tcW w:type="dxa" w:w="1994"/>
           </w:tcPr>
           <w:p>
             <w:r>
               <w:rPr>
                 <w:rFonts w:ascii="Arial" w:hAnsi="Arial"/>
-                <w:sz w:val="18"/>
+                <w:sz w:val="14"/>
               </w:rPr>
-              <w:t>3</w:t>
+              <w:t>gini</w:t>
             </w:r>
           </w:p>
         </w:tc>
         <w:tc>
           <w:tcPr>
-            <w:tcW w:type="dxa" w:w="3135"/>
+            <w:tcW w:type="dxa" w:w="1994"/>
           </w:tcPr>
           <w:p>
             <w:r>
               <w:rPr>
                 <w:rFonts w:ascii="Arial" w:hAnsi="Arial"/>
-                <w:sz w:val="18"/>
+                <w:sz w:val="14"/>
               </w:rPr>
-              <w:t>Random Forest</w:t>
+              <w:t>5</w:t>
             </w:r>
           </w:p>
         </w:tc>
         <w:tc>
           <w:tcPr>
-            <w:tcW w:type="dxa" w:w="3135"/>
+            <w:tcW w:type="dxa" w:w="1994"/>
           </w:tcPr>
           <w:p>
             <w:r>
               <w:rPr>
                 <w:rFonts w:ascii="Arial" w:hAnsi="Arial"/>
-                <w:sz w:val="18"/>
+                <w:sz w:val="14"/>
               </w:rPr>
-              <w:t>Ensemble/Bagging</w:t>
+              <w:t>74,82%</w:t>
             </w:r>
           </w:p>
         </w:tc>
-      </w:tr>
-      <w:tr>
         <w:tc>
           <w:tcPr>
-            <w:tcW w:type="dxa" w:w="3135"/>
+            <w:tcW w:type="dxa" w:w="1994"/>
           </w:tcPr>
           <w:p>
             <w:r>
               <w:rPr>
                 <w:rFonts w:ascii="Arial" w:hAnsi="Arial"/>
-                <w:sz w:val="18"/>
+                <w:sz w:val="14"/>
               </w:rPr>
-              <w:t>4</w:t>
+              <w:t>0,7490</w:t>
             </w:r>
           </w:p>
         </w:tc>
         <w:tc>
           <w:tcPr>
-            <w:tcW w:type="dxa" w:w="3135"/>
+            <w:tcW w:type="dxa" w:w="1994"/>
           </w:tcPr>
           <w:p>
             <w:r>
               <w:rPr>
                 <w:rFonts w:ascii="Arial" w:hAnsi="Arial"/>
-                <w:sz w:val="18"/>
+                <w:sz w:val="14"/>
               </w:rPr>
-              <w:t>Gradient Boosting</w:t>
-            </w:r>
-          </w:p>
-        </w:tc>
-        <w:tc>
-          <w:tcPr>
-            <w:tcW w:type="dxa" w:w="3135"/>
-          </w:tcPr>
-          <w:p>
-            <w:r>
-              <w:rPr>
-                <w:rFonts w:ascii="Arial" w:hAnsi="Arial"/>
-                <w:sz w:val="18"/>
-              </w:rPr>
-              <w:t>Ensemble/Boosting</w:t>
+              <w:t>Inferior</w:t>
             </w:r>
           </w:p>
         </w:tc>
@@ -659,90 +811,14 @@
     <w:p/>
     <w:p>
       <w:pPr>
-        <w:spacing w:after="60" w:line="264" w:lineRule="auto"/>
+        <w:spacing w:after="40"/>
       </w:pPr>
       <w:r>
         <w:rPr>
           <w:rFonts w:ascii="Arial" w:hAnsi="Arial"/>
-          <w:b w:val="0"/>
-          <w:sz w:val="20"/>
+          <w:sz w:val="18"/>
         </w:rPr>
-        <w:t>Partição: 80% treino (8.373) / 20% teste (2.094). CV: 5-fold no treino com shuffle.</w:t>
-      </w:r>
-    </w:p>
-    <w:p>
-      <w:r>
-        <w:rPr>
-          <w:rFonts w:ascii="Arial" w:hAnsi="Arial"/>
-          <w:b/>
-          <w:sz w:val="22"/>
-        </w:rPr>
-        <w:t>4. CONFIGURAÇÃO E TENTATIVAS DE OTIMIZAÇÃO</w:t>
-      </w:r>
-    </w:p>
-    <w:p>
-      <w:pPr>
-        <w:spacing w:after="60" w:line="264" w:lineRule="auto"/>
-      </w:pPr>
-      <w:r>
-        <w:rPr>
-          <w:rFonts w:ascii="Arial" w:hAnsi="Arial"/>
-          <w:b w:val="0"/>
-          <w:sz w:val="20"/>
-        </w:rPr>
-        <w:t>Árvore: entropy, max_depth=5, min_samples_split=20, min_samples_leaf=10</w:t>
-      </w:r>
-    </w:p>
-    <w:p>
-      <w:pPr>
-        <w:spacing w:after="60" w:line="264" w:lineRule="auto"/>
-      </w:pPr>
-      <w:r>
-        <w:rPr>
-          <w:rFonts w:ascii="Arial" w:hAnsi="Arial"/>
-          <w:b w:val="0"/>
-          <w:sz w:val="20"/>
-        </w:rPr>
-        <w:t>Logística: l2, C=1.0, solver=lbfgs</w:t>
-      </w:r>
-    </w:p>
-    <w:p>
-      <w:pPr>
-        <w:spacing w:after="60" w:line="264" w:lineRule="auto"/>
-      </w:pPr>
-      <w:r>
-        <w:rPr>
-          <w:rFonts w:ascii="Arial" w:hAnsi="Arial"/>
-          <w:b w:val="0"/>
-          <w:sz w:val="20"/>
-        </w:rPr>
-        <w:t>RF: 100 estimators, entropy, max_depth=10, sqrt features</w:t>
-      </w:r>
-    </w:p>
-    <w:p>
-      <w:pPr>
-        <w:spacing w:after="60" w:line="264" w:lineRule="auto"/>
-      </w:pPr>
-      <w:r>
-        <w:rPr>
-          <w:rFonts w:ascii="Arial" w:hAnsi="Arial"/>
-          <w:b w:val="0"/>
-          <w:sz w:val="20"/>
-        </w:rPr>
-        <w:t>GB: 100 estimators, lr=0.1, max_depth=3, subsample=0.8</w:t>
-      </w:r>
-    </w:p>
-    <w:p>
-      <w:pPr>
-        <w:spacing w:after="60" w:line="264" w:lineRule="auto"/>
-      </w:pPr>
-      <w:r>
-        <w:rPr>
-          <w:rFonts w:ascii="Arial" w:hAnsi="Arial"/>
-          <w:b/>
-          <w:sz w:val="20"/>
-        </w:rPr>
-        <w:t>Tentativas de Otimização:</w:t>
+        <w:t>Regressão Logística:</w:t>
       </w:r>
     </w:p>
     <w:tbl>
@@ -752,22 +828,284 @@
         <w:tblLook w:firstColumn="1" w:firstRow="1" w:lastColumn="0" w:lastRow="0" w:noHBand="0" w:noVBand="1" w:val="04A0"/>
       </w:tblPr>
       <w:tblGrid>
-        <w:gridCol w:w="2351"/>
-        <w:gridCol w:w="2351"/>
-        <w:gridCol w:w="2351"/>
-        <w:gridCol w:w="2351"/>
+        <w:gridCol w:w="2493"/>
+        <w:gridCol w:w="2493"/>
+        <w:gridCol w:w="2493"/>
+        <w:gridCol w:w="2493"/>
       </w:tblGrid>
       <w:tr>
         <w:tc>
           <w:tcPr>
-            <w:tcW w:type="dxa" w:w="2351"/>
+            <w:tcW w:type="dxa" w:w="2493"/>
           </w:tcPr>
           <w:p>
             <w:r>
               <w:rPr>
                 <w:rFonts w:ascii="Arial" w:hAnsi="Arial"/>
                 <w:b/>
-                <w:sz w:val="16"/>
+                <w:sz w:val="14"/>
+              </w:rPr>
+              <w:t>C</w:t>
+            </w:r>
+          </w:p>
+        </w:tc>
+        <w:tc>
+          <w:tcPr>
+            <w:tcW w:type="dxa" w:w="2493"/>
+          </w:tcPr>
+          <w:p>
+            <w:r>
+              <w:rPr>
+                <w:rFonts w:ascii="Arial" w:hAnsi="Arial"/>
+                <w:b/>
+                <w:sz w:val="14"/>
+              </w:rPr>
+              <w:t>Acur.CV</w:t>
+            </w:r>
+          </w:p>
+        </w:tc>
+        <w:tc>
+          <w:tcPr>
+            <w:tcW w:type="dxa" w:w="2493"/>
+          </w:tcPr>
+          <w:p>
+            <w:r>
+              <w:rPr>
+                <w:rFonts w:ascii="Arial" w:hAnsi="Arial"/>
+                <w:b/>
+                <w:sz w:val="14"/>
+              </w:rPr>
+              <w:t>AUC</w:t>
+            </w:r>
+          </w:p>
+        </w:tc>
+        <w:tc>
+          <w:tcPr>
+            <w:tcW w:type="dxa" w:w="2493"/>
+          </w:tcPr>
+          <w:p>
+            <w:r>
+              <w:rPr>
+                <w:rFonts w:ascii="Arial" w:hAnsi="Arial"/>
+                <w:b/>
+                <w:sz w:val="14"/>
+              </w:rPr>
+              <w:t>Decisão</w:t>
+            </w:r>
+          </w:p>
+        </w:tc>
+      </w:tr>
+      <w:tr>
+        <w:tc>
+          <w:tcPr>
+            <w:tcW w:type="dxa" w:w="2493"/>
+          </w:tcPr>
+          <w:p>
+            <w:r>
+              <w:rPr>
+                <w:rFonts w:ascii="Arial" w:hAnsi="Arial"/>
+                <w:sz w:val="14"/>
+              </w:rPr>
+              <w:t>0.1</w:t>
+            </w:r>
+          </w:p>
+        </w:tc>
+        <w:tc>
+          <w:tcPr>
+            <w:tcW w:type="dxa" w:w="2493"/>
+          </w:tcPr>
+          <w:p>
+            <w:r>
+              <w:rPr>
+                <w:rFonts w:ascii="Arial" w:hAnsi="Arial"/>
+                <w:sz w:val="14"/>
+              </w:rPr>
+              <w:t>75,55%</w:t>
+            </w:r>
+          </w:p>
+        </w:tc>
+        <w:tc>
+          <w:tcPr>
+            <w:tcW w:type="dxa" w:w="2493"/>
+          </w:tcPr>
+          <w:p>
+            <w:r>
+              <w:rPr>
+                <w:rFonts w:ascii="Arial" w:hAnsi="Arial"/>
+                <w:sz w:val="14"/>
+              </w:rPr>
+              <w:t>0,8060</w:t>
+            </w:r>
+          </w:p>
+        </w:tc>
+        <w:tc>
+          <w:tcPr>
+            <w:tcW w:type="dxa" w:w="2493"/>
+          </w:tcPr>
+          <w:p>
+            <w:r>
+              <w:rPr>
+                <w:rFonts w:ascii="Arial" w:hAnsi="Arial"/>
+                <w:sz w:val="14"/>
+              </w:rPr>
+              <w:t>Regularização forte</w:t>
+            </w:r>
+          </w:p>
+        </w:tc>
+      </w:tr>
+      <w:tr>
+        <w:tc>
+          <w:tcPr>
+            <w:tcW w:type="dxa" w:w="2493"/>
+          </w:tcPr>
+          <w:p>
+            <w:r>
+              <w:rPr>
+                <w:rFonts w:ascii="Arial" w:hAnsi="Arial"/>
+                <w:sz w:val="14"/>
+              </w:rPr>
+              <w:t>1.0</w:t>
+            </w:r>
+          </w:p>
+        </w:tc>
+        <w:tc>
+          <w:tcPr>
+            <w:tcW w:type="dxa" w:w="2493"/>
+          </w:tcPr>
+          <w:p>
+            <w:r>
+              <w:rPr>
+                <w:rFonts w:ascii="Arial" w:hAnsi="Arial"/>
+                <w:sz w:val="14"/>
+              </w:rPr>
+              <w:t>75,68%</w:t>
+            </w:r>
+          </w:p>
+        </w:tc>
+        <w:tc>
+          <w:tcPr>
+            <w:tcW w:type="dxa" w:w="2493"/>
+          </w:tcPr>
+          <w:p>
+            <w:r>
+              <w:rPr>
+                <w:rFonts w:ascii="Arial" w:hAnsi="Arial"/>
+                <w:sz w:val="14"/>
+              </w:rPr>
+              <w:t>0,8072</w:t>
+            </w:r>
+          </w:p>
+        </w:tc>
+        <w:tc>
+          <w:tcPr>
+            <w:tcW w:type="dxa" w:w="2493"/>
+          </w:tcPr>
+          <w:p>
+            <w:r>
+              <w:rPr>
+                <w:rFonts w:ascii="Arial" w:hAnsi="Arial"/>
+                <w:sz w:val="14"/>
+              </w:rPr>
+              <w:t>Escolhido (melhor AUC)</w:t>
+            </w:r>
+          </w:p>
+        </w:tc>
+      </w:tr>
+      <w:tr>
+        <w:tc>
+          <w:tcPr>
+            <w:tcW w:type="dxa" w:w="2493"/>
+          </w:tcPr>
+          <w:p>
+            <w:r>
+              <w:rPr>
+                <w:rFonts w:ascii="Arial" w:hAnsi="Arial"/>
+                <w:sz w:val="14"/>
+              </w:rPr>
+              <w:t>10.0</w:t>
+            </w:r>
+          </w:p>
+        </w:tc>
+        <w:tc>
+          <w:tcPr>
+            <w:tcW w:type="dxa" w:w="2493"/>
+          </w:tcPr>
+          <w:p>
+            <w:r>
+              <w:rPr>
+                <w:rFonts w:ascii="Arial" w:hAnsi="Arial"/>
+                <w:sz w:val="14"/>
+              </w:rPr>
+              <w:t>75,68%</w:t>
+            </w:r>
+          </w:p>
+        </w:tc>
+        <w:tc>
+          <w:tcPr>
+            <w:tcW w:type="dxa" w:w="2493"/>
+          </w:tcPr>
+          <w:p>
+            <w:r>
+              <w:rPr>
+                <w:rFonts w:ascii="Arial" w:hAnsi="Arial"/>
+                <w:sz w:val="14"/>
+              </w:rPr>
+              <w:t>0,8067</w:t>
+            </w:r>
+          </w:p>
+        </w:tc>
+        <w:tc>
+          <w:tcPr>
+            <w:tcW w:type="dxa" w:w="2493"/>
+          </w:tcPr>
+          <w:p>
+            <w:r>
+              <w:rPr>
+                <w:rFonts w:ascii="Arial" w:hAnsi="Arial"/>
+                <w:sz w:val="14"/>
+              </w:rPr>
+              <w:t>Sem ganho</w:t>
+            </w:r>
+          </w:p>
+        </w:tc>
+      </w:tr>
+    </w:tbl>
+    <w:p/>
+    <w:p>
+      <w:pPr>
+        <w:spacing w:after="40"/>
+      </w:pPr>
+      <w:r>
+        <w:rPr>
+          <w:rFonts w:ascii="Arial" w:hAnsi="Arial"/>
+          <w:sz w:val="18"/>
+        </w:rPr>
+        <w:t>Random Forest e Gradient Boosting:</w:t>
+      </w:r>
+    </w:p>
+    <w:tbl>
+      <w:tblPr>
+        <w:tblStyle w:val="TableGrid"/>
+        <w:tblW w:type="auto" w:w="0"/>
+        <w:tblLook w:firstColumn="1" w:firstRow="1" w:lastColumn="0" w:lastRow="0" w:noHBand="0" w:noVBand="1" w:val="04A0"/>
+      </w:tblPr>
+      <w:tblGrid>
+        <w:gridCol w:w="2493"/>
+        <w:gridCol w:w="2493"/>
+        <w:gridCol w:w="2493"/>
+        <w:gridCol w:w="2493"/>
+      </w:tblGrid>
+      <w:tr>
+        <w:tc>
+          <w:tcPr>
+            <w:tcW w:type="dxa" w:w="2493"/>
+          </w:tcPr>
+          <w:p>
+            <w:r>
+              <w:rPr>
+                <w:rFonts w:ascii="Arial" w:hAnsi="Arial"/>
+                <w:b/>
+                <w:sz w:val="14"/>
               </w:rPr>
               <w:t>Modelo</w:t>
             </w:r>
@@ -775,44 +1113,102 @@
         </w:tc>
         <w:tc>
           <w:tcPr>
-            <w:tcW w:type="dxa" w:w="2351"/>
+            <w:tcW w:type="dxa" w:w="2493"/>
           </w:tcPr>
           <w:p>
             <w:r>
               <w:rPr>
                 <w:rFonts w:ascii="Arial" w:hAnsi="Arial"/>
                 <w:b/>
-                <w:sz w:val="16"/>
+                <w:sz w:val="14"/>
               </w:rPr>
-              <w:t>Parâmetro</w:t>
+              <w:t>Config</w:t>
             </w:r>
           </w:p>
         </w:tc>
         <w:tc>
           <w:tcPr>
-            <w:tcW w:type="dxa" w:w="2351"/>
+            <w:tcW w:type="dxa" w:w="2493"/>
           </w:tcPr>
           <w:p>
             <w:r>
               <w:rPr>
                 <w:rFonts w:ascii="Arial" w:hAnsi="Arial"/>
                 <w:b/>
-                <w:sz w:val="16"/>
+                <w:sz w:val="14"/>
               </w:rPr>
-              <w:t>Valores Considerados</w:t>
+              <w:t>AUC</w:t>
             </w:r>
           </w:p>
         </w:tc>
         <w:tc>
           <w:tcPr>
-            <w:tcW w:type="dxa" w:w="2351"/>
+            <w:tcW w:type="dxa" w:w="2493"/>
           </w:tcPr>
           <w:p>
             <w:r>
               <w:rPr>
                 <w:rFonts w:ascii="Arial" w:hAnsi="Arial"/>
                 <w:b/>
-                <w:sz w:val="16"/>
+                <w:sz w:val="14"/>
+              </w:rPr>
+              <w:t>Decisão</w:t>
+            </w:r>
+          </w:p>
+        </w:tc>
+      </w:tr>
+      <w:tr>
+        <w:tc>
+          <w:tcPr>
+            <w:tcW w:type="dxa" w:w="2493"/>
+          </w:tcPr>
+          <w:p>
+            <w:r>
+              <w:rPr>
+                <w:rFonts w:ascii="Arial" w:hAnsi="Arial"/>
+                <w:sz w:val="14"/>
+              </w:rPr>
+              <w:t>RF</w:t>
+            </w:r>
+          </w:p>
+        </w:tc>
+        <w:tc>
+          <w:tcPr>
+            <w:tcW w:type="dxa" w:w="2493"/>
+          </w:tcPr>
+          <w:p>
+            <w:r>
+              <w:rPr>
+                <w:rFonts w:ascii="Arial" w:hAnsi="Arial"/>
+                <w:sz w:val="14"/>
+              </w:rPr>
+              <w:t>100 est, depth=10</w:t>
+            </w:r>
+          </w:p>
+        </w:tc>
+        <w:tc>
+          <w:tcPr>
+            <w:tcW w:type="dxa" w:w="2493"/>
+          </w:tcPr>
+          <w:p>
+            <w:r>
+              <w:rPr>
+                <w:rFonts w:ascii="Arial" w:hAnsi="Arial"/>
+                <w:sz w:val="14"/>
+              </w:rPr>
+              <w:t>0,8075</w:t>
+            </w:r>
+          </w:p>
+        </w:tc>
+        <w:tc>
+          <w:tcPr>
+            <w:tcW w:type="dxa" w:w="2493"/>
+          </w:tcPr>
+          <w:p>
+            <w:r>
+              <w:rPr>
+                <w:rFonts w:ascii="Arial" w:hAnsi="Arial"/>
+                <w:sz w:val="14"/>
               </w:rPr>
               <w:t>Escolhido</w:t>
             </w:r>
@@ -822,57 +1218,57 @@
       <w:tr>
         <w:tc>
           <w:tcPr>
-            <w:tcW w:type="dxa" w:w="2351"/>
+            <w:tcW w:type="dxa" w:w="2493"/>
           </w:tcPr>
           <w:p>
             <w:r>
               <w:rPr>
                 <w:rFonts w:ascii="Arial" w:hAnsi="Arial"/>
-                <w:sz w:val="16"/>
+                <w:sz w:val="14"/>
               </w:rPr>
-              <w:t>Árvore</w:t>
+              <w:t>GB</w:t>
             </w:r>
           </w:p>
         </w:tc>
         <w:tc>
           <w:tcPr>
-            <w:tcW w:type="dxa" w:w="2351"/>
+            <w:tcW w:type="dxa" w:w="2493"/>
           </w:tcPr>
           <w:p>
             <w:r>
               <w:rPr>
                 <w:rFonts w:ascii="Arial" w:hAnsi="Arial"/>
-                <w:sz w:val="16"/>
+                <w:sz w:val="14"/>
               </w:rPr>
-              <w:t>max_depth</w:t>
+              <w:t>lr=0.05, depth=5</w:t>
             </w:r>
           </w:p>
         </w:tc>
         <w:tc>
           <w:tcPr>
-            <w:tcW w:type="dxa" w:w="2351"/>
+            <w:tcW w:type="dxa" w:w="2493"/>
           </w:tcPr>
           <w:p>
             <w:r>
               <w:rPr>
                 <w:rFonts w:ascii="Arial" w:hAnsi="Arial"/>
-                <w:sz w:val="16"/>
+                <w:sz w:val="14"/>
               </w:rPr>
-              <w:t>3, 5, 7, 10</w:t>
+              <w:t>0,8134</w:t>
             </w:r>
           </w:p>
         </w:tc>
         <w:tc>
           <w:tcPr>
-            <w:tcW w:type="dxa" w:w="2351"/>
+            <w:tcW w:type="dxa" w:w="2493"/>
           </w:tcPr>
           <w:p>
             <w:r>
               <w:rPr>
                 <w:rFonts w:ascii="Arial" w:hAnsi="Arial"/>
-                <w:sz w:val="16"/>
+                <w:sz w:val="14"/>
               </w:rPr>
-              <w:t>5</w:t>
+              <w:t>Melhor AUC geral</w:t>
             </w:r>
           </w:p>
         </w:tc>
@@ -880,245 +1276,13 @@
       <w:tr>
         <w:tc>
           <w:tcPr>
-            <w:tcW w:type="dxa" w:w="2351"/>
+            <w:tcW w:type="dxa" w:w="2493"/>
           </w:tcPr>
           <w:p>
             <w:r>
               <w:rPr>
                 <w:rFonts w:ascii="Arial" w:hAnsi="Arial"/>
-                <w:sz w:val="16"/>
-              </w:rPr>
-              <w:t>Árvore</w:t>
-            </w:r>
-          </w:p>
-        </w:tc>
-        <w:tc>
-          <w:tcPr>
-            <w:tcW w:type="dxa" w:w="2351"/>
-          </w:tcPr>
-          <w:p>
-            <w:r>
-              <w:rPr>
-                <w:rFonts w:ascii="Arial" w:hAnsi="Arial"/>
-                <w:sz w:val="16"/>
-              </w:rPr>
-              <w:t>min_samples_split</w:t>
-            </w:r>
-          </w:p>
-        </w:tc>
-        <w:tc>
-          <w:tcPr>
-            <w:tcW w:type="dxa" w:w="2351"/>
-          </w:tcPr>
-          <w:p>
-            <w:r>
-              <w:rPr>
-                <w:rFonts w:ascii="Arial" w:hAnsi="Arial"/>
-                <w:sz w:val="16"/>
-              </w:rPr>
-              <w:t>5, 10, 20</w:t>
-            </w:r>
-          </w:p>
-        </w:tc>
-        <w:tc>
-          <w:tcPr>
-            <w:tcW w:type="dxa" w:w="2351"/>
-          </w:tcPr>
-          <w:p>
-            <w:r>
-              <w:rPr>
-                <w:rFonts w:ascii="Arial" w:hAnsi="Arial"/>
-                <w:sz w:val="16"/>
-              </w:rPr>
-              <w:t>20</w:t>
-            </w:r>
-          </w:p>
-        </w:tc>
-      </w:tr>
-      <w:tr>
-        <w:tc>
-          <w:tcPr>
-            <w:tcW w:type="dxa" w:w="2351"/>
-          </w:tcPr>
-          <w:p>
-            <w:r>
-              <w:rPr>
-                <w:rFonts w:ascii="Arial" w:hAnsi="Arial"/>
-                <w:sz w:val="16"/>
-              </w:rPr>
-              <w:t>Logística</w:t>
-            </w:r>
-          </w:p>
-        </w:tc>
-        <w:tc>
-          <w:tcPr>
-            <w:tcW w:type="dxa" w:w="2351"/>
-          </w:tcPr>
-          <w:p>
-            <w:r>
-              <w:rPr>
-                <w:rFonts w:ascii="Arial" w:hAnsi="Arial"/>
-                <w:sz w:val="16"/>
-              </w:rPr>
-              <w:t>C</w:t>
-            </w:r>
-          </w:p>
-        </w:tc>
-        <w:tc>
-          <w:tcPr>
-            <w:tcW w:type="dxa" w:w="2351"/>
-          </w:tcPr>
-          <w:p>
-            <w:r>
-              <w:rPr>
-                <w:rFonts w:ascii="Arial" w:hAnsi="Arial"/>
-                <w:sz w:val="16"/>
-              </w:rPr>
-              <w:t>0.1, 1.0, 10</w:t>
-            </w:r>
-          </w:p>
-        </w:tc>
-        <w:tc>
-          <w:tcPr>
-            <w:tcW w:type="dxa" w:w="2351"/>
-          </w:tcPr>
-          <w:p>
-            <w:r>
-              <w:rPr>
-                <w:rFonts w:ascii="Arial" w:hAnsi="Arial"/>
-                <w:sz w:val="16"/>
-              </w:rPr>
-              <w:t>1.0</w:t>
-            </w:r>
-          </w:p>
-        </w:tc>
-      </w:tr>
-      <w:tr>
-        <w:tc>
-          <w:tcPr>
-            <w:tcW w:type="dxa" w:w="2351"/>
-          </w:tcPr>
-          <w:p>
-            <w:r>
-              <w:rPr>
-                <w:rFonts w:ascii="Arial" w:hAnsi="Arial"/>
-                <w:sz w:val="16"/>
-              </w:rPr>
-              <w:t>RF</w:t>
-            </w:r>
-          </w:p>
-        </w:tc>
-        <w:tc>
-          <w:tcPr>
-            <w:tcW w:type="dxa" w:w="2351"/>
-          </w:tcPr>
-          <w:p>
-            <w:r>
-              <w:rPr>
-                <w:rFonts w:ascii="Arial" w:hAnsi="Arial"/>
-                <w:sz w:val="16"/>
-              </w:rPr>
-              <w:t>n_estimators</w:t>
-            </w:r>
-          </w:p>
-        </w:tc>
-        <w:tc>
-          <w:tcPr>
-            <w:tcW w:type="dxa" w:w="2351"/>
-          </w:tcPr>
-          <w:p>
-            <w:r>
-              <w:rPr>
-                <w:rFonts w:ascii="Arial" w:hAnsi="Arial"/>
-                <w:sz w:val="16"/>
-              </w:rPr>
-              <w:t>50, 100, 200</w:t>
-            </w:r>
-          </w:p>
-        </w:tc>
-        <w:tc>
-          <w:tcPr>
-            <w:tcW w:type="dxa" w:w="2351"/>
-          </w:tcPr>
-          <w:p>
-            <w:r>
-              <w:rPr>
-                <w:rFonts w:ascii="Arial" w:hAnsi="Arial"/>
-                <w:sz w:val="16"/>
-              </w:rPr>
-              <w:t>100</w:t>
-            </w:r>
-          </w:p>
-        </w:tc>
-      </w:tr>
-      <w:tr>
-        <w:tc>
-          <w:tcPr>
-            <w:tcW w:type="dxa" w:w="2351"/>
-          </w:tcPr>
-          <w:p>
-            <w:r>
-              <w:rPr>
-                <w:rFonts w:ascii="Arial" w:hAnsi="Arial"/>
-                <w:sz w:val="16"/>
-              </w:rPr>
-              <w:t>RF</w:t>
-            </w:r>
-          </w:p>
-        </w:tc>
-        <w:tc>
-          <w:tcPr>
-            <w:tcW w:type="dxa" w:w="2351"/>
-          </w:tcPr>
-          <w:p>
-            <w:r>
-              <w:rPr>
-                <w:rFonts w:ascii="Arial" w:hAnsi="Arial"/>
-                <w:sz w:val="16"/>
-              </w:rPr>
-              <w:t>max_depth</w:t>
-            </w:r>
-          </w:p>
-        </w:tc>
-        <w:tc>
-          <w:tcPr>
-            <w:tcW w:type="dxa" w:w="2351"/>
-          </w:tcPr>
-          <w:p>
-            <w:r>
-              <w:rPr>
-                <w:rFonts w:ascii="Arial" w:hAnsi="Arial"/>
-                <w:sz w:val="16"/>
-              </w:rPr>
-              <w:t>5, 10, None</w:t>
-            </w:r>
-          </w:p>
-        </w:tc>
-        <w:tc>
-          <w:tcPr>
-            <w:tcW w:type="dxa" w:w="2351"/>
-          </w:tcPr>
-          <w:p>
-            <w:r>
-              <w:rPr>
-                <w:rFonts w:ascii="Arial" w:hAnsi="Arial"/>
-                <w:sz w:val="16"/>
-              </w:rPr>
-              <w:t>10</w:t>
-            </w:r>
-          </w:p>
-        </w:tc>
-      </w:tr>
-      <w:tr>
-        <w:tc>
-          <w:tcPr>
-            <w:tcW w:type="dxa" w:w="2351"/>
-          </w:tcPr>
-          <w:p>
-            <w:r>
-              <w:rPr>
-                <w:rFonts w:ascii="Arial" w:hAnsi="Arial"/>
-                <w:sz w:val="16"/>
+                <w:sz w:val="14"/>
               </w:rPr>
               <w:t>GB</w:t>
             </w:r>
@@ -1126,43 +1290,43 @@
         </w:tc>
         <w:tc>
           <w:tcPr>
-            <w:tcW w:type="dxa" w:w="2351"/>
+            <w:tcW w:type="dxa" w:w="2493"/>
           </w:tcPr>
           <w:p>
             <w:r>
               <w:rPr>
                 <w:rFonts w:ascii="Arial" w:hAnsi="Arial"/>
-                <w:sz w:val="16"/>
+                <w:sz w:val="14"/>
               </w:rPr>
-              <w:t>learning_rate</w:t>
+              <w:t>lr=0.1, depth=3</w:t>
             </w:r>
           </w:p>
         </w:tc>
         <w:tc>
           <w:tcPr>
-            <w:tcW w:type="dxa" w:w="2351"/>
+            <w:tcW w:type="dxa" w:w="2493"/>
           </w:tcPr>
           <w:p>
             <w:r>
               <w:rPr>
                 <w:rFonts w:ascii="Arial" w:hAnsi="Arial"/>
-                <w:sz w:val="16"/>
+                <w:sz w:val="14"/>
               </w:rPr>
-              <w:t>0.05, 0.1, 0.2</w:t>
+              <w:t>0,8066</w:t>
             </w:r>
           </w:p>
         </w:tc>
         <w:tc>
           <w:tcPr>
-            <w:tcW w:type="dxa" w:w="2351"/>
+            <w:tcW w:type="dxa" w:w="2493"/>
           </w:tcPr>
           <w:p>
             <w:r>
               <w:rPr>
                 <w:rFonts w:ascii="Arial" w:hAnsi="Arial"/>
-                <w:sz w:val="16"/>
+                <w:sz w:val="14"/>
               </w:rPr>
-              <w:t>0.1</w:t>
+              <w:t>Config padrão</w:t>
             </w:r>
           </w:p>
         </w:tc>
@@ -1174,20 +1338,19 @@
         <w:rPr>
           <w:rFonts w:ascii="Arial" w:hAnsi="Arial"/>
           <w:b/>
-          <w:sz w:val="22"/>
+          <w:sz w:val="20"/>
         </w:rPr>
         <w:t>5. RESULTADOS</w:t>
       </w:r>
     </w:p>
     <w:p>
       <w:pPr>
-        <w:spacing w:after="60" w:line="264" w:lineRule="auto"/>
+        <w:spacing w:after="40"/>
       </w:pPr>
       <w:r>
         <w:rPr>
           <w:rFonts w:ascii="Arial" w:hAnsi="Arial"/>
-          <w:b/>
-          <w:sz w:val="20"/>
+          <w:sz w:val="18"/>
         </w:rPr>
         <w:t>Baseline (sempre classe 0): 73,93%</w:t>
       </w:r>
@@ -1199,25 +1362,23 @@
         <w:tblLook w:firstColumn="1" w:firstRow="1" w:lastColumn="0" w:lastRow="0" w:noHBand="0" w:noVBand="1" w:val="04A0"/>
       </w:tblPr>
       <w:tblGrid>
-        <w:gridCol w:w="1344"/>
-        <w:gridCol w:w="1344"/>
-        <w:gridCol w:w="1344"/>
-        <w:gridCol w:w="1344"/>
-        <w:gridCol w:w="1344"/>
-        <w:gridCol w:w="1344"/>
-        <w:gridCol w:w="1344"/>
+        <w:gridCol w:w="1994"/>
+        <w:gridCol w:w="1994"/>
+        <w:gridCol w:w="1994"/>
+        <w:gridCol w:w="1994"/>
+        <w:gridCol w:w="1994"/>
       </w:tblGrid>
       <w:tr>
         <w:tc>
           <w:tcPr>
-            <w:tcW w:type="dxa" w:w="1344"/>
+            <w:tcW w:type="dxa" w:w="1994"/>
           </w:tcPr>
           <w:p>
             <w:r>
               <w:rPr>
                 <w:rFonts w:ascii="Arial" w:hAnsi="Arial"/>
                 <w:b/>
-                <w:sz w:val="16"/>
+                <w:sz w:val="14"/>
               </w:rPr>
               <w:t>Modelo</w:t>
             </w:r>
@@ -1225,14 +1386,14 @@
         </w:tc>
         <w:tc>
           <w:tcPr>
-            <w:tcW w:type="dxa" w:w="1344"/>
+            <w:tcW w:type="dxa" w:w="1994"/>
           </w:tcPr>
           <w:p>
             <w:r>
               <w:rPr>
                 <w:rFonts w:ascii="Arial" w:hAnsi="Arial"/>
                 <w:b/>
-                <w:sz w:val="16"/>
+                <w:sz w:val="14"/>
               </w:rPr>
               <w:t>Acurácia</w:t>
             </w:r>
@@ -1240,76 +1401,46 @@
         </w:tc>
         <w:tc>
           <w:tcPr>
-            <w:tcW w:type="dxa" w:w="1344"/>
+            <w:tcW w:type="dxa" w:w="1994"/>
           </w:tcPr>
           <w:p>
             <w:r>
               <w:rPr>
                 <w:rFonts w:ascii="Arial" w:hAnsi="Arial"/>
                 <w:b/>
-                <w:sz w:val="16"/>
+                <w:sz w:val="14"/>
               </w:rPr>
-              <w:t>AUC-ROC</w:t>
+              <w:t>AUC</w:t>
             </w:r>
           </w:p>
         </w:tc>
         <w:tc>
           <w:tcPr>
-            <w:tcW w:type="dxa" w:w="1344"/>
+            <w:tcW w:type="dxa" w:w="1994"/>
           </w:tcPr>
           <w:p>
             <w:r>
               <w:rPr>
                 <w:rFonts w:ascii="Arial" w:hAnsi="Arial"/>
                 <w:b/>
-                <w:sz w:val="16"/>
+                <w:sz w:val="14"/>
               </w:rPr>
-              <w:t>Prec(1)</w:t>
+              <w:t>F1</w:t>
             </w:r>
           </w:p>
         </w:tc>
         <w:tc>
           <w:tcPr>
-            <w:tcW w:type="dxa" w:w="1344"/>
+            <w:tcW w:type="dxa" w:w="1994"/>
           </w:tcPr>
           <w:p>
             <w:r>
               <w:rPr>
                 <w:rFonts w:ascii="Arial" w:hAnsi="Arial"/>
                 <w:b/>
-                <w:sz w:val="16"/>
+                <w:sz w:val="14"/>
               </w:rPr>
-              <w:t>Rec(1)</w:t>
-            </w:r>
-          </w:p>
-        </w:tc>
-        <w:tc>
-          <w:tcPr>
-            <w:tcW w:type="dxa" w:w="1344"/>
-          </w:tcPr>
-          <w:p>
-            <w:r>
-              <w:rPr>
-                <w:rFonts w:ascii="Arial" w:hAnsi="Arial"/>
-                <w:b/>
-                <w:sz w:val="16"/>
-              </w:rPr>
-              <w:t>F1(1)</w:t>
-            </w:r>
-          </w:p>
-        </w:tc>
-        <w:tc>
-          <w:tcPr>
-            <w:tcW w:type="dxa" w:w="1344"/>
-          </w:tcPr>
-          <w:p>
-            <w:r>
-              <w:rPr>
-                <w:rFonts w:ascii="Arial" w:hAnsi="Arial"/>
-                <w:b/>
-                <w:sz w:val="16"/>
-              </w:rPr>
-              <w:t>CV</w:t>
+              <w:t>Ganho</w:t>
             </w:r>
           </w:p>
         </w:tc>
@@ -1317,13 +1448,13 @@
       <w:tr>
         <w:tc>
           <w:tcPr>
-            <w:tcW w:type="dxa" w:w="1344"/>
+            <w:tcW w:type="dxa" w:w="1994"/>
           </w:tcPr>
           <w:p>
             <w:r>
               <w:rPr>
                 <w:rFonts w:ascii="Arial" w:hAnsi="Arial"/>
-                <w:sz w:val="16"/>
+                <w:sz w:val="14"/>
               </w:rPr>
               <w:t>Reg. Logística</w:t>
             </w:r>
@@ -1331,13 +1462,13 @@
         </w:tc>
         <w:tc>
           <w:tcPr>
-            <w:tcW w:type="dxa" w:w="1344"/>
+            <w:tcW w:type="dxa" w:w="1994"/>
           </w:tcPr>
           <w:p>
             <w:r>
               <w:rPr>
                 <w:rFonts w:ascii="Arial" w:hAnsi="Arial"/>
-                <w:sz w:val="16"/>
+                <w:sz w:val="14"/>
               </w:rPr>
               <w:t>76,84%</w:t>
             </w:r>
@@ -1345,13 +1476,13 @@
         </w:tc>
         <w:tc>
           <w:tcPr>
-            <w:tcW w:type="dxa" w:w="1344"/>
+            <w:tcW w:type="dxa" w:w="1994"/>
           </w:tcPr>
           <w:p>
             <w:r>
               <w:rPr>
                 <w:rFonts w:ascii="Arial" w:hAnsi="Arial"/>
-                <w:sz w:val="16"/>
+                <w:sz w:val="14"/>
               </w:rPr>
               <w:t>0,8072</w:t>
             </w:r>
@@ -1359,41 +1490,13 @@
         </w:tc>
         <w:tc>
           <w:tcPr>
-            <w:tcW w:type="dxa" w:w="1344"/>
+            <w:tcW w:type="dxa" w:w="1994"/>
           </w:tcPr>
           <w:p>
             <w:r>
               <w:rPr>
                 <w:rFonts w:ascii="Arial" w:hAnsi="Arial"/>
-                <w:sz w:val="16"/>
-              </w:rPr>
-              <w:t>58,18%</w:t>
-            </w:r>
-          </w:p>
-        </w:tc>
-        <w:tc>
-          <w:tcPr>
-            <w:tcW w:type="dxa" w:w="1344"/>
-          </w:tcPr>
-          <w:p>
-            <w:r>
-              <w:rPr>
-                <w:rFonts w:ascii="Arial" w:hAnsi="Arial"/>
-                <w:sz w:val="16"/>
-              </w:rPr>
-              <w:t>39,74%</w:t>
-            </w:r>
-          </w:p>
-        </w:tc>
-        <w:tc>
-          <w:tcPr>
-            <w:tcW w:type="dxa" w:w="1344"/>
-          </w:tcPr>
-          <w:p>
-            <w:r>
-              <w:rPr>
-                <w:rFonts w:ascii="Arial" w:hAnsi="Arial"/>
-                <w:sz w:val="16"/>
+                <w:sz w:val="14"/>
               </w:rPr>
               <w:t>47,23%</w:t>
             </w:r>
@@ -1401,15 +1504,15 @@
         </w:tc>
         <w:tc>
           <w:tcPr>
-            <w:tcW w:type="dxa" w:w="1344"/>
+            <w:tcW w:type="dxa" w:w="1994"/>
           </w:tcPr>
           <w:p>
             <w:r>
               <w:rPr>
                 <w:rFonts w:ascii="Arial" w:hAnsi="Arial"/>
-                <w:sz w:val="16"/>
+                <w:sz w:val="14"/>
               </w:rPr>
-              <w:t>75,68%±0,61%</w:t>
+              <w:t>+2,91 p.p.</w:t>
             </w:r>
           </w:p>
         </w:tc>
@@ -1417,13 +1520,13 @@
       <w:tr>
         <w:tc>
           <w:tcPr>
-            <w:tcW w:type="dxa" w:w="1344"/>
+            <w:tcW w:type="dxa" w:w="1994"/>
           </w:tcPr>
           <w:p>
             <w:r>
               <w:rPr>
                 <w:rFonts w:ascii="Arial" w:hAnsi="Arial"/>
-                <w:sz w:val="16"/>
+                <w:sz w:val="14"/>
               </w:rPr>
               <w:t>Random Forest</w:t>
             </w:r>
@@ -1431,13 +1534,13 @@
         </w:tc>
         <w:tc>
           <w:tcPr>
-            <w:tcW w:type="dxa" w:w="1344"/>
+            <w:tcW w:type="dxa" w:w="1994"/>
           </w:tcPr>
           <w:p>
             <w:r>
               <w:rPr>
                 <w:rFonts w:ascii="Arial" w:hAnsi="Arial"/>
-                <w:sz w:val="16"/>
+                <w:sz w:val="14"/>
               </w:rPr>
               <w:t>76,79%</w:t>
             </w:r>
@@ -1445,71 +1548,43 @@
         </w:tc>
         <w:tc>
           <w:tcPr>
-            <w:tcW w:type="dxa" w:w="1344"/>
+            <w:tcW w:type="dxa" w:w="1994"/>
           </w:tcPr>
           <w:p>
             <w:r>
               <w:rPr>
                 <w:rFonts w:ascii="Arial" w:hAnsi="Arial"/>
-                <w:sz w:val="16"/>
+                <w:sz w:val="14"/>
               </w:rPr>
-              <w:t>0,8071</w:t>
+              <w:t>0,8075</w:t>
             </w:r>
           </w:p>
         </w:tc>
         <w:tc>
           <w:tcPr>
-            <w:tcW w:type="dxa" w:w="1344"/>
+            <w:tcW w:type="dxa" w:w="1994"/>
           </w:tcPr>
           <w:p>
             <w:r>
               <w:rPr>
                 <w:rFonts w:ascii="Arial" w:hAnsi="Arial"/>
-                <w:sz w:val="16"/>
+                <w:sz w:val="14"/>
               </w:rPr>
-              <w:t>61,19%</w:t>
+              <w:t>40,34%</w:t>
             </w:r>
           </w:p>
         </w:tc>
         <w:tc>
           <w:tcPr>
-            <w:tcW w:type="dxa" w:w="1344"/>
+            <w:tcW w:type="dxa" w:w="1994"/>
           </w:tcPr>
           <w:p>
             <w:r>
               <w:rPr>
                 <w:rFonts w:ascii="Arial" w:hAnsi="Arial"/>
-                <w:sz w:val="16"/>
+                <w:sz w:val="14"/>
               </w:rPr>
-              <w:t>30,04%</w:t>
-            </w:r>
-          </w:p>
-        </w:tc>
-        <w:tc>
-          <w:tcPr>
-            <w:tcW w:type="dxa" w:w="1344"/>
-          </w:tcPr>
-          <w:p>
-            <w:r>
-              <w:rPr>
-                <w:rFonts w:ascii="Arial" w:hAnsi="Arial"/>
-                <w:sz w:val="16"/>
-              </w:rPr>
-              <w:t>40,29%</w:t>
-            </w:r>
-          </w:p>
-        </w:tc>
-        <w:tc>
-          <w:tcPr>
-            <w:tcW w:type="dxa" w:w="1344"/>
-          </w:tcPr>
-          <w:p>
-            <w:r>
-              <w:rPr>
-                <w:rFonts w:ascii="Arial" w:hAnsi="Arial"/>
-                <w:sz w:val="16"/>
-              </w:rPr>
-              <w:t>75,41%±0,36%</w:t>
+              <w:t>+2,86 p.p.</w:t>
             </w:r>
           </w:p>
         </w:tc>
@@ -1517,13 +1592,13 @@
       <w:tr>
         <w:tc>
           <w:tcPr>
-            <w:tcW w:type="dxa" w:w="1344"/>
+            <w:tcW w:type="dxa" w:w="1994"/>
           </w:tcPr>
           <w:p>
             <w:r>
               <w:rPr>
                 <w:rFonts w:ascii="Arial" w:hAnsi="Arial"/>
-                <w:sz w:val="16"/>
+                <w:sz w:val="14"/>
               </w:rPr>
               <w:t>Gradient Boost</w:t>
             </w:r>
@@ -1531,13 +1606,13 @@
         </w:tc>
         <w:tc>
           <w:tcPr>
-            <w:tcW w:type="dxa" w:w="1344"/>
+            <w:tcW w:type="dxa" w:w="1994"/>
           </w:tcPr>
           <w:p>
             <w:r>
               <w:rPr>
                 <w:rFonts w:ascii="Arial" w:hAnsi="Arial"/>
-                <w:sz w:val="16"/>
+                <w:sz w:val="14"/>
               </w:rPr>
               <w:t>76,27%</w:t>
             </w:r>
@@ -1545,71 +1620,43 @@
         </w:tc>
         <w:tc>
           <w:tcPr>
-            <w:tcW w:type="dxa" w:w="1344"/>
+            <w:tcW w:type="dxa" w:w="1994"/>
           </w:tcPr>
           <w:p>
             <w:r>
               <w:rPr>
                 <w:rFonts w:ascii="Arial" w:hAnsi="Arial"/>
-                <w:sz w:val="16"/>
+                <w:sz w:val="14"/>
               </w:rPr>
-              <w:t>0,8062</w:t>
+              <w:t>0,8066</w:t>
             </w:r>
           </w:p>
         </w:tc>
         <w:tc>
           <w:tcPr>
-            <w:tcW w:type="dxa" w:w="1344"/>
+            <w:tcW w:type="dxa" w:w="1994"/>
           </w:tcPr>
           <w:p>
             <w:r>
               <w:rPr>
                 <w:rFonts w:ascii="Arial" w:hAnsi="Arial"/>
-                <w:sz w:val="16"/>
+                <w:sz w:val="14"/>
               </w:rPr>
-              <w:t>57,40%</w:t>
+              <w:t>43,33%</w:t>
             </w:r>
           </w:p>
         </w:tc>
         <w:tc>
           <w:tcPr>
-            <w:tcW w:type="dxa" w:w="1344"/>
+            <w:tcW w:type="dxa" w:w="1994"/>
           </w:tcPr>
           <w:p>
             <w:r>
               <w:rPr>
                 <w:rFonts w:ascii="Arial" w:hAnsi="Arial"/>
-                <w:sz w:val="16"/>
+                <w:sz w:val="14"/>
               </w:rPr>
-              <w:t>34,80%</w:t>
-            </w:r>
-          </w:p>
-        </w:tc>
-        <w:tc>
-          <w:tcPr>
-            <w:tcW w:type="dxa" w:w="1344"/>
-          </w:tcPr>
-          <w:p>
-            <w:r>
-              <w:rPr>
-                <w:rFonts w:ascii="Arial" w:hAnsi="Arial"/>
-                <w:sz w:val="16"/>
-              </w:rPr>
-              <w:t>43,38%</w:t>
-            </w:r>
-          </w:p>
-        </w:tc>
-        <w:tc>
-          <w:tcPr>
-            <w:tcW w:type="dxa" w:w="1344"/>
-          </w:tcPr>
-          <w:p>
-            <w:r>
-              <w:rPr>
-                <w:rFonts w:ascii="Arial" w:hAnsi="Arial"/>
-                <w:sz w:val="16"/>
-              </w:rPr>
-              <w:t>75,58%±0,56%</w:t>
+              <w:t>+2,34 p.p.</w:t>
             </w:r>
           </w:p>
         </w:tc>
@@ -1617,99 +1664,71 @@
       <w:tr>
         <w:tc>
           <w:tcPr>
-            <w:tcW w:type="dxa" w:w="1344"/>
+            <w:tcW w:type="dxa" w:w="1994"/>
           </w:tcPr>
           <w:p>
             <w:r>
               <w:rPr>
                 <w:rFonts w:ascii="Arial" w:hAnsi="Arial"/>
-                <w:sz w:val="16"/>
+                <w:sz w:val="14"/>
               </w:rPr>
-              <w:t>Árvore Decisão</w:t>
+              <w:t>Árvore (d=7)</w:t>
             </w:r>
           </w:p>
         </w:tc>
         <w:tc>
           <w:tcPr>
-            <w:tcW w:type="dxa" w:w="1344"/>
+            <w:tcW w:type="dxa" w:w="1994"/>
           </w:tcPr>
           <w:p>
             <w:r>
               <w:rPr>
                 <w:rFonts w:ascii="Arial" w:hAnsi="Arial"/>
-                <w:sz w:val="16"/>
+                <w:sz w:val="14"/>
               </w:rPr>
-              <w:t>74,98%</w:t>
+              <w:t>75,00%</w:t>
             </w:r>
           </w:p>
         </w:tc>
         <w:tc>
           <w:tcPr>
-            <w:tcW w:type="dxa" w:w="1344"/>
+            <w:tcW w:type="dxa" w:w="1994"/>
           </w:tcPr>
           <w:p>
             <w:r>
               <w:rPr>
                 <w:rFonts w:ascii="Arial" w:hAnsi="Arial"/>
-                <w:sz w:val="16"/>
+                <w:sz w:val="14"/>
               </w:rPr>
-              <w:t>0,7546</w:t>
+              <w:t>0,7720</w:t>
             </w:r>
           </w:p>
         </w:tc>
         <w:tc>
           <w:tcPr>
-            <w:tcW w:type="dxa" w:w="1344"/>
+            <w:tcW w:type="dxa" w:w="1994"/>
           </w:tcPr>
           <w:p>
             <w:r>
               <w:rPr>
                 <w:rFonts w:ascii="Arial" w:hAnsi="Arial"/>
-                <w:sz w:val="16"/>
+                <w:sz w:val="14"/>
               </w:rPr>
-              <w:t>53,96%</w:t>
+              <w:t>44,07%</w:t>
             </w:r>
           </w:p>
         </w:tc>
         <w:tc>
           <w:tcPr>
-            <w:tcW w:type="dxa" w:w="1344"/>
+            <w:tcW w:type="dxa" w:w="1994"/>
           </w:tcPr>
           <w:p>
             <w:r>
               <w:rPr>
                 <w:rFonts w:ascii="Arial" w:hAnsi="Arial"/>
-                <w:sz w:val="16"/>
+                <w:sz w:val="14"/>
               </w:rPr>
-              <w:t>27,47%</w:t>
-            </w:r>
-          </w:p>
-        </w:tc>
-        <w:tc>
-          <w:tcPr>
-            <w:tcW w:type="dxa" w:w="1344"/>
-          </w:tcPr>
-          <w:p>
-            <w:r>
-              <w:rPr>
-                <w:rFonts w:ascii="Arial" w:hAnsi="Arial"/>
-                <w:sz w:val="16"/>
-              </w:rPr>
-              <w:t>36,41%</w:t>
-            </w:r>
-          </w:p>
-        </w:tc>
-        <w:tc>
-          <w:tcPr>
-            <w:tcW w:type="dxa" w:w="1344"/>
-          </w:tcPr>
-          <w:p>
-            <w:r>
-              <w:rPr>
-                <w:rFonts w:ascii="Arial" w:hAnsi="Arial"/>
-                <w:sz w:val="16"/>
-              </w:rPr>
-              <w:t>74,55%±0,94%</w:t>
+              <w:t>+1,07 p.p.</w:t>
             </w:r>
           </w:p>
         </w:tc>
@@ -1718,90 +1737,14 @@
     <w:p/>
     <w:p>
       <w:pPr>
-        <w:spacing w:after="60" w:line="264" w:lineRule="auto"/>
+        <w:spacing w:after="40"/>
       </w:pPr>
       <w:r>
         <w:rPr>
           <w:rFonts w:ascii="Arial" w:hAnsi="Arial"/>
-          <w:b w:val="0"/>
-          <w:sz w:val="20"/>
+          <w:sz w:val="18"/>
         </w:rPr>
-        <w:t>Features importantes (RF): DESCONTO (0,116), VALOR_VENDIDO (0,101), PRECO_TABELA (0,093)</w:t>
-      </w:r>
-    </w:p>
-    <w:p>
-      <w:pPr>
-        <w:spacing w:after="60" w:line="264" w:lineRule="auto"/>
-      </w:pPr>
-      <w:r>
-        <w:rPr>
-          <w:rFonts w:ascii="Arial" w:hAnsi="Arial"/>
-          <w:b w:val="0"/>
-          <w:sz w:val="20"/>
-        </w:rPr>
-        <w:t>Insights: Financiados +25 p.p. retorno; Kit +28 p.p.; Sobradinho menor taxa (15,27%).</w:t>
-      </w:r>
-    </w:p>
-    <w:p>
-      <w:r>
-        <w:rPr>
-          <w:rFonts w:ascii="Arial" w:hAnsi="Arial"/>
-          <w:b/>
-          <w:sz w:val="22"/>
-        </w:rPr>
-        <w:t>6. RESUMO FINAL E ROTEIRO PARA PRODUÇÃO</w:t>
-      </w:r>
-    </w:p>
-    <w:p>
-      <w:pPr>
-        <w:spacing w:after="60" w:line="264" w:lineRule="auto"/>
-      </w:pPr>
-      <w:r>
-        <w:rPr>
-          <w:rFonts w:ascii="Arial" w:hAnsi="Arial"/>
-          <w:b/>
-          <w:sz w:val="20"/>
-        </w:rPr>
-        <w:t>Modelo Recomendado: Regressão Logística</w:t>
-      </w:r>
-    </w:p>
-    <w:p>
-      <w:pPr>
-        <w:spacing w:after="60" w:line="264" w:lineRule="auto"/>
-      </w:pPr>
-      <w:r>
-        <w:rPr>
-          <w:rFonts w:ascii="Arial" w:hAnsi="Arial"/>
-          <w:b w:val="0"/>
-          <w:sz w:val="20"/>
-        </w:rPr>
-        <w:t>Escolhida por interpretabilidade e simplicidade. Os 3 melhores modelos superam o baseline em ~2,3-2,9 p.p.; a diferença de AUC entre eles é mínima (&lt;0,001).</w:t>
-      </w:r>
-    </w:p>
-    <w:p>
-      <w:pPr>
-        <w:spacing w:after="60" w:line="264" w:lineRule="auto"/>
-      </w:pPr>
-      <w:r>
-        <w:rPr>
-          <w:rFonts w:ascii="Arial" w:hAnsi="Arial"/>
-          <w:b/>
-          <w:sz w:val="20"/>
-        </w:rPr>
-        <w:t>Roteiro de Produção:</w:t>
-      </w:r>
-    </w:p>
-    <w:p>
-      <w:pPr>
-        <w:spacing w:after="60" w:line="264" w:lineRule="auto"/>
-      </w:pPr>
-      <w:r>
-        <w:rPr>
-          <w:rFonts w:ascii="Arial" w:hAnsi="Arial"/>
-          <w:b w:val="0"/>
-          <w:sz w:val="20"/>
-        </w:rPr>
-        <w:t>1. Entrada: dados da venda | 2. Pré-proc: One-Hot+Scaler | 3. Predição: prob. retorno</w:t>
+        <w:t>Exemplos de Predição Individual:</w:t>
       </w:r>
     </w:p>
     <w:tbl>
@@ -1811,36 +1754,534 @@
         <w:tblLook w:firstColumn="1" w:firstRow="1" w:lastColumn="0" w:lastRow="0" w:noHBand="0" w:noVBand="1" w:val="04A0"/>
       </w:tblPr>
       <w:tblGrid>
-        <w:gridCol w:w="3135"/>
-        <w:gridCol w:w="3135"/>
-        <w:gridCol w:w="3135"/>
+        <w:gridCol w:w="1662"/>
+        <w:gridCol w:w="1662"/>
+        <w:gridCol w:w="1662"/>
+        <w:gridCol w:w="1662"/>
+        <w:gridCol w:w="1662"/>
+        <w:gridCol w:w="1662"/>
       </w:tblGrid>
       <w:tr>
         <w:tc>
           <w:tcPr>
-            <w:tcW w:type="dxa" w:w="3135"/>
+            <w:tcW w:type="dxa" w:w="1662"/>
           </w:tcPr>
           <w:p>
             <w:r>
               <w:rPr>
                 <w:rFonts w:ascii="Arial" w:hAnsi="Arial"/>
                 <w:b/>
-                <w:sz w:val="16"/>
+                <w:sz w:val="14"/>
               </w:rPr>
-              <w:t>Prob. Retorno</w:t>
+              <w:t>Moto</w:t>
             </w:r>
           </w:p>
         </w:tc>
         <w:tc>
           <w:tcPr>
-            <w:tcW w:type="dxa" w:w="3135"/>
+            <w:tcW w:type="dxa" w:w="1662"/>
           </w:tcPr>
           <w:p>
             <w:r>
               <w:rPr>
                 <w:rFonts w:ascii="Arial" w:hAnsi="Arial"/>
                 <w:b/>
-                <w:sz w:val="16"/>
+                <w:sz w:val="14"/>
+              </w:rPr>
+              <w:t>Fin.</w:t>
+            </w:r>
+          </w:p>
+        </w:tc>
+        <w:tc>
+          <w:tcPr>
+            <w:tcW w:type="dxa" w:w="1662"/>
+          </w:tcPr>
+          <w:p>
+            <w:r>
+              <w:rPr>
+                <w:rFonts w:ascii="Arial" w:hAnsi="Arial"/>
+                <w:b/>
+                <w:sz w:val="14"/>
+              </w:rPr>
+              <w:t>Prob.</w:t>
+            </w:r>
+          </w:p>
+        </w:tc>
+        <w:tc>
+          <w:tcPr>
+            <w:tcW w:type="dxa" w:w="1662"/>
+          </w:tcPr>
+          <w:p>
+            <w:r>
+              <w:rPr>
+                <w:rFonts w:ascii="Arial" w:hAnsi="Arial"/>
+                <w:b/>
+                <w:sz w:val="14"/>
+              </w:rPr>
+              <w:t>Prev.</w:t>
+            </w:r>
+          </w:p>
+        </w:tc>
+        <w:tc>
+          <w:tcPr>
+            <w:tcW w:type="dxa" w:w="1662"/>
+          </w:tcPr>
+          <w:p>
+            <w:r>
+              <w:rPr>
+                <w:rFonts w:ascii="Arial" w:hAnsi="Arial"/>
+                <w:b/>
+                <w:sz w:val="14"/>
+              </w:rPr>
+              <w:t>Real</w:t>
+            </w:r>
+          </w:p>
+        </w:tc>
+        <w:tc>
+          <w:tcPr>
+            <w:tcW w:type="dxa" w:w="1662"/>
+          </w:tcPr>
+          <w:p>
+            <w:r>
+              <w:rPr>
+                <w:rFonts w:ascii="Arial" w:hAnsi="Arial"/>
+                <w:b/>
+                <w:sz w:val="14"/>
+              </w:rPr>
+              <w:t>?</w:t>
+            </w:r>
+          </w:p>
+        </w:tc>
+      </w:tr>
+      <w:tr>
+        <w:tc>
+          <w:tcPr>
+            <w:tcW w:type="dxa" w:w="1662"/>
+          </w:tcPr>
+          <w:p>
+            <w:r>
+              <w:rPr>
+                <w:rFonts w:ascii="Arial" w:hAnsi="Arial"/>
+                <w:sz w:val="14"/>
+              </w:rPr>
+              <w:t>XRE 300 SAHARA</w:t>
+            </w:r>
+          </w:p>
+        </w:tc>
+        <w:tc>
+          <w:tcPr>
+            <w:tcW w:type="dxa" w:w="1662"/>
+          </w:tcPr>
+          <w:p>
+            <w:r>
+              <w:rPr>
+                <w:rFonts w:ascii="Arial" w:hAnsi="Arial"/>
+                <w:sz w:val="14"/>
+              </w:rPr>
+              <w:t>Não</w:t>
+            </w:r>
+          </w:p>
+        </w:tc>
+        <w:tc>
+          <w:tcPr>
+            <w:tcW w:type="dxa" w:w="1662"/>
+          </w:tcPr>
+          <w:p>
+            <w:r>
+              <w:rPr>
+                <w:rFonts w:ascii="Arial" w:hAnsi="Arial"/>
+                <w:sz w:val="14"/>
+              </w:rPr>
+              <w:t>7,6%</w:t>
+            </w:r>
+          </w:p>
+        </w:tc>
+        <w:tc>
+          <w:tcPr>
+            <w:tcW w:type="dxa" w:w="1662"/>
+          </w:tcPr>
+          <w:p>
+            <w:r>
+              <w:rPr>
+                <w:rFonts w:ascii="Arial" w:hAnsi="Arial"/>
+                <w:sz w:val="14"/>
+              </w:rPr>
+              <w:t>0</w:t>
+            </w:r>
+          </w:p>
+        </w:tc>
+        <w:tc>
+          <w:tcPr>
+            <w:tcW w:type="dxa" w:w="1662"/>
+          </w:tcPr>
+          <w:p>
+            <w:r>
+              <w:rPr>
+                <w:rFonts w:ascii="Arial" w:hAnsi="Arial"/>
+                <w:sz w:val="14"/>
+              </w:rPr>
+              <w:t>0</w:t>
+            </w:r>
+          </w:p>
+        </w:tc>
+        <w:tc>
+          <w:tcPr>
+            <w:tcW w:type="dxa" w:w="1662"/>
+          </w:tcPr>
+          <w:p>
+            <w:r>
+              <w:rPr>
+                <w:rFonts w:ascii="Arial" w:hAnsi="Arial"/>
+                <w:sz w:val="14"/>
+              </w:rPr>
+              <w:t>✓</w:t>
+            </w:r>
+          </w:p>
+        </w:tc>
+      </w:tr>
+      <w:tr>
+        <w:tc>
+          <w:tcPr>
+            <w:tcW w:type="dxa" w:w="1662"/>
+          </w:tcPr>
+          <w:p>
+            <w:r>
+              <w:rPr>
+                <w:rFonts w:ascii="Arial" w:hAnsi="Arial"/>
+                <w:sz w:val="14"/>
+              </w:rPr>
+              <w:t>XRL 300 TORNADO</w:t>
+            </w:r>
+          </w:p>
+        </w:tc>
+        <w:tc>
+          <w:tcPr>
+            <w:tcW w:type="dxa" w:w="1662"/>
+          </w:tcPr>
+          <w:p>
+            <w:r>
+              <w:rPr>
+                <w:rFonts w:ascii="Arial" w:hAnsi="Arial"/>
+                <w:sz w:val="14"/>
+              </w:rPr>
+              <w:t>Não</w:t>
+            </w:r>
+          </w:p>
+        </w:tc>
+        <w:tc>
+          <w:tcPr>
+            <w:tcW w:type="dxa" w:w="1662"/>
+          </w:tcPr>
+          <w:p>
+            <w:r>
+              <w:rPr>
+                <w:rFonts w:ascii="Arial" w:hAnsi="Arial"/>
+                <w:sz w:val="14"/>
+              </w:rPr>
+              <w:t>6,9%</w:t>
+            </w:r>
+          </w:p>
+        </w:tc>
+        <w:tc>
+          <w:tcPr>
+            <w:tcW w:type="dxa" w:w="1662"/>
+          </w:tcPr>
+          <w:p>
+            <w:r>
+              <w:rPr>
+                <w:rFonts w:ascii="Arial" w:hAnsi="Arial"/>
+                <w:sz w:val="14"/>
+              </w:rPr>
+              <w:t>0</w:t>
+            </w:r>
+          </w:p>
+        </w:tc>
+        <w:tc>
+          <w:tcPr>
+            <w:tcW w:type="dxa" w:w="1662"/>
+          </w:tcPr>
+          <w:p>
+            <w:r>
+              <w:rPr>
+                <w:rFonts w:ascii="Arial" w:hAnsi="Arial"/>
+                <w:sz w:val="14"/>
+              </w:rPr>
+              <w:t>1</w:t>
+            </w:r>
+          </w:p>
+        </w:tc>
+        <w:tc>
+          <w:tcPr>
+            <w:tcW w:type="dxa" w:w="1662"/>
+          </w:tcPr>
+          <w:p>
+            <w:r>
+              <w:rPr>
+                <w:rFonts w:ascii="Arial" w:hAnsi="Arial"/>
+                <w:sz w:val="14"/>
+              </w:rPr>
+              <w:t>✗</w:t>
+            </w:r>
+          </w:p>
+        </w:tc>
+      </w:tr>
+      <w:tr>
+        <w:tc>
+          <w:tcPr>
+            <w:tcW w:type="dxa" w:w="1662"/>
+          </w:tcPr>
+          <w:p>
+            <w:r>
+              <w:rPr>
+                <w:rFonts w:ascii="Arial" w:hAnsi="Arial"/>
+                <w:sz w:val="14"/>
+              </w:rPr>
+              <w:t>BROS 160 ABS</w:t>
+            </w:r>
+          </w:p>
+        </w:tc>
+        <w:tc>
+          <w:tcPr>
+            <w:tcW w:type="dxa" w:w="1662"/>
+          </w:tcPr>
+          <w:p>
+            <w:r>
+              <w:rPr>
+                <w:rFonts w:ascii="Arial" w:hAnsi="Arial"/>
+                <w:sz w:val="14"/>
+              </w:rPr>
+              <w:t>Sim</w:t>
+            </w:r>
+          </w:p>
+        </w:tc>
+        <w:tc>
+          <w:tcPr>
+            <w:tcW w:type="dxa" w:w="1662"/>
+          </w:tcPr>
+          <w:p>
+            <w:r>
+              <w:rPr>
+                <w:rFonts w:ascii="Arial" w:hAnsi="Arial"/>
+                <w:sz w:val="14"/>
+              </w:rPr>
+              <w:t>31,7%</w:t>
+            </w:r>
+          </w:p>
+        </w:tc>
+        <w:tc>
+          <w:tcPr>
+            <w:tcW w:type="dxa" w:w="1662"/>
+          </w:tcPr>
+          <w:p>
+            <w:r>
+              <w:rPr>
+                <w:rFonts w:ascii="Arial" w:hAnsi="Arial"/>
+                <w:sz w:val="14"/>
+              </w:rPr>
+              <w:t>0</w:t>
+            </w:r>
+          </w:p>
+        </w:tc>
+        <w:tc>
+          <w:tcPr>
+            <w:tcW w:type="dxa" w:w="1662"/>
+          </w:tcPr>
+          <w:p>
+            <w:r>
+              <w:rPr>
+                <w:rFonts w:ascii="Arial" w:hAnsi="Arial"/>
+                <w:sz w:val="14"/>
+              </w:rPr>
+              <w:t>1</w:t>
+            </w:r>
+          </w:p>
+        </w:tc>
+        <w:tc>
+          <w:tcPr>
+            <w:tcW w:type="dxa" w:w="1662"/>
+          </w:tcPr>
+          <w:p>
+            <w:r>
+              <w:rPr>
+                <w:rFonts w:ascii="Arial" w:hAnsi="Arial"/>
+                <w:sz w:val="14"/>
+              </w:rPr>
+              <w:t>✗</w:t>
+            </w:r>
+          </w:p>
+        </w:tc>
+      </w:tr>
+      <w:tr>
+        <w:tc>
+          <w:tcPr>
+            <w:tcW w:type="dxa" w:w="1662"/>
+          </w:tcPr>
+          <w:p>
+            <w:r>
+              <w:rPr>
+                <w:rFonts w:ascii="Arial" w:hAnsi="Arial"/>
+                <w:sz w:val="14"/>
+              </w:rPr>
+              <w:t>CB 500 HORNET</w:t>
+            </w:r>
+          </w:p>
+        </w:tc>
+        <w:tc>
+          <w:tcPr>
+            <w:tcW w:type="dxa" w:w="1662"/>
+          </w:tcPr>
+          <w:p>
+            <w:r>
+              <w:rPr>
+                <w:rFonts w:ascii="Arial" w:hAnsi="Arial"/>
+                <w:sz w:val="14"/>
+              </w:rPr>
+              <w:t>Sim</w:t>
+            </w:r>
+          </w:p>
+        </w:tc>
+        <w:tc>
+          <w:tcPr>
+            <w:tcW w:type="dxa" w:w="1662"/>
+          </w:tcPr>
+          <w:p>
+            <w:r>
+              <w:rPr>
+                <w:rFonts w:ascii="Arial" w:hAnsi="Arial"/>
+                <w:sz w:val="14"/>
+              </w:rPr>
+              <w:t>36,0%</w:t>
+            </w:r>
+          </w:p>
+        </w:tc>
+        <w:tc>
+          <w:tcPr>
+            <w:tcW w:type="dxa" w:w="1662"/>
+          </w:tcPr>
+          <w:p>
+            <w:r>
+              <w:rPr>
+                <w:rFonts w:ascii="Arial" w:hAnsi="Arial"/>
+                <w:sz w:val="14"/>
+              </w:rPr>
+              <w:t>0</w:t>
+            </w:r>
+          </w:p>
+        </w:tc>
+        <w:tc>
+          <w:tcPr>
+            <w:tcW w:type="dxa" w:w="1662"/>
+          </w:tcPr>
+          <w:p>
+            <w:r>
+              <w:rPr>
+                <w:rFonts w:ascii="Arial" w:hAnsi="Arial"/>
+                <w:sz w:val="14"/>
+              </w:rPr>
+              <w:t>0</w:t>
+            </w:r>
+          </w:p>
+        </w:tc>
+        <w:tc>
+          <w:tcPr>
+            <w:tcW w:type="dxa" w:w="1662"/>
+          </w:tcPr>
+          <w:p>
+            <w:r>
+              <w:rPr>
+                <w:rFonts w:ascii="Arial" w:hAnsi="Arial"/>
+                <w:sz w:val="14"/>
+              </w:rPr>
+              <w:t>✓</w:t>
+            </w:r>
+          </w:p>
+        </w:tc>
+      </w:tr>
+    </w:tbl>
+    <w:p/>
+    <w:p>
+      <w:pPr>
+        <w:spacing w:after="40"/>
+      </w:pPr>
+      <w:r>
+        <w:rPr>
+          <w:rFonts w:ascii="Arial" w:hAnsi="Arial"/>
+          <w:sz w:val="16"/>
+        </w:rPr>
+        <w:t>Casos 2,3: falsos negativos - clientes retornaram mas modelo previu não retorno.</w:t>
+      </w:r>
+    </w:p>
+    <w:p>
+      <w:r>
+        <w:rPr>
+          <w:rFonts w:ascii="Arial" w:hAnsi="Arial"/>
+          <w:b/>
+          <w:sz w:val="20"/>
+        </w:rPr>
+        <w:t>6. RESUMO FINAL</w:t>
+      </w:r>
+    </w:p>
+    <w:p>
+      <w:pPr>
+        <w:spacing w:after="40"/>
+      </w:pPr>
+      <w:r>
+        <w:rPr>
+          <w:rFonts w:ascii="Arial" w:hAnsi="Arial"/>
+          <w:sz w:val="18"/>
+        </w:rPr>
+        <w:t>Modelo Recomendado: Regressão Logística (C=1.0) - interpretabilidade, simplicidade, AUC competitiva.</w:t>
+      </w:r>
+    </w:p>
+    <w:p>
+      <w:pPr>
+        <w:spacing w:after="40"/>
+      </w:pPr>
+      <w:r>
+        <w:rPr>
+          <w:rFonts w:ascii="Arial" w:hAnsi="Arial"/>
+          <w:sz w:val="18"/>
+        </w:rPr>
+        <w:t>Roteiro: 1) Dados da venda 2) One-Hot+Scaler 3) Prob. retorno 4) Risco = 100%-prob</w:t>
+      </w:r>
+    </w:p>
+    <w:tbl>
+      <w:tblPr>
+        <w:tblStyle w:val="TableGrid"/>
+        <w:tblW w:type="auto" w:w="0"/>
+        <w:tblLook w:firstColumn="1" w:firstRow="1" w:lastColumn="0" w:lastRow="0" w:noHBand="0" w:noVBand="1" w:val="04A0"/>
+      </w:tblPr>
+      <w:tblGrid>
+        <w:gridCol w:w="3324"/>
+        <w:gridCol w:w="3324"/>
+        <w:gridCol w:w="3324"/>
+      </w:tblGrid>
+      <w:tr>
+        <w:tc>
+          <w:tcPr>
+            <w:tcW w:type="dxa" w:w="3324"/>
+          </w:tcPr>
+          <w:p>
+            <w:r>
+              <w:rPr>
+                <w:rFonts w:ascii="Arial" w:hAnsi="Arial"/>
+                <w:b/>
+                <w:sz w:val="14"/>
+              </w:rPr>
+              <w:t>Prob.Retorno</w:t>
+            </w:r>
+          </w:p>
+        </w:tc>
+        <w:tc>
+          <w:tcPr>
+            <w:tcW w:type="dxa" w:w="3324"/>
+          </w:tcPr>
+          <w:p>
+            <w:r>
+              <w:rPr>
+                <w:rFonts w:ascii="Arial" w:hAnsi="Arial"/>
+                <w:b/>
+                <w:sz w:val="14"/>
               </w:rPr>
               <w:t>Risco</w:t>
             </w:r>
@@ -1848,14 +2289,14 @@
         </w:tc>
         <w:tc>
           <w:tcPr>
-            <w:tcW w:type="dxa" w:w="3135"/>
+            <w:tcW w:type="dxa" w:w="3324"/>
           </w:tcPr>
           <w:p>
             <w:r>
               <w:rPr>
                 <w:rFonts w:ascii="Arial" w:hAnsi="Arial"/>
                 <w:b/>
-                <w:sz w:val="16"/>
+                <w:sz w:val="14"/>
               </w:rPr>
               <w:t>Ação</w:t>
             </w:r>
@@ -1865,13 +2306,13 @@
       <w:tr>
         <w:tc>
           <w:tcPr>
-            <w:tcW w:type="dxa" w:w="3135"/>
+            <w:tcW w:type="dxa" w:w="3324"/>
           </w:tcPr>
           <w:p>
             <w:r>
               <w:rPr>
                 <w:rFonts w:ascii="Arial" w:hAnsi="Arial"/>
-                <w:sz w:val="16"/>
+                <w:sz w:val="14"/>
               </w:rPr>
               <w:t>&lt; 25%</w:t>
             </w:r>
@@ -1879,13 +2320,13 @@
         </w:tc>
         <w:tc>
           <w:tcPr>
-            <w:tcW w:type="dxa" w:w="3135"/>
+            <w:tcW w:type="dxa" w:w="3324"/>
           </w:tcPr>
           <w:p>
             <w:r>
               <w:rPr>
                 <w:rFonts w:ascii="Arial" w:hAnsi="Arial"/>
-                <w:sz w:val="16"/>
+                <w:sz w:val="14"/>
               </w:rPr>
               <w:t>ALTO</w:t>
             </w:r>
@@ -1893,15 +2334,15 @@
         </w:tc>
         <w:tc>
           <w:tcPr>
-            <w:tcW w:type="dxa" w:w="3135"/>
+            <w:tcW w:type="dxa" w:w="3324"/>
           </w:tcPr>
           <w:p>
             <w:r>
               <w:rPr>
                 <w:rFonts w:ascii="Arial" w:hAnsi="Arial"/>
-                <w:sz w:val="16"/>
+                <w:sz w:val="14"/>
               </w:rPr>
-              <w:t>Contato imediato, desconto</w:t>
+              <w:t>Contato imediato</w:t>
             </w:r>
           </w:p>
         </w:tc>
@@ -1909,13 +2350,13 @@
       <w:tr>
         <w:tc>
           <w:tcPr>
-            <w:tcW w:type="dxa" w:w="3135"/>
+            <w:tcW w:type="dxa" w:w="3324"/>
           </w:tcPr>
           <w:p>
             <w:r>
               <w:rPr>
                 <w:rFonts w:ascii="Arial" w:hAnsi="Arial"/>
-                <w:sz w:val="16"/>
+                <w:sz w:val="14"/>
               </w:rPr>
               <w:t>25-40%</w:t>
             </w:r>
@@ -1923,13 +2364,13 @@
         </w:tc>
         <w:tc>
           <w:tcPr>
-            <w:tcW w:type="dxa" w:w="3135"/>
+            <w:tcW w:type="dxa" w:w="3324"/>
           </w:tcPr>
           <w:p>
             <w:r>
               <w:rPr>
                 <w:rFonts w:ascii="Arial" w:hAnsi="Arial"/>
-                <w:sz w:val="16"/>
+                <w:sz w:val="14"/>
               </w:rPr>
               <w:t>MÉDIO</w:t>
             </w:r>
@@ -1937,13 +2378,13 @@
         </w:tc>
         <w:tc>
           <w:tcPr>
-            <w:tcW w:type="dxa" w:w="3135"/>
+            <w:tcW w:type="dxa" w:w="3324"/>
           </w:tcPr>
           <w:p>
             <w:r>
               <w:rPr>
                 <w:rFonts w:ascii="Arial" w:hAnsi="Arial"/>
-                <w:sz w:val="16"/>
+                <w:sz w:val="14"/>
               </w:rPr>
               <w:t>Lembrete reforçado</w:t>
             </w:r>
@@ -1953,13 +2394,13 @@
       <w:tr>
         <w:tc>
           <w:tcPr>
-            <w:tcW w:type="dxa" w:w="3135"/>
+            <w:tcW w:type="dxa" w:w="3324"/>
           </w:tcPr>
           <w:p>
             <w:r>
               <w:rPr>
                 <w:rFonts w:ascii="Arial" w:hAnsi="Arial"/>
-                <w:sz w:val="16"/>
+                <w:sz w:val="14"/>
               </w:rPr>
               <w:t>&gt; 40%</w:t>
             </w:r>
@@ -1967,13 +2408,13 @@
         </w:tc>
         <w:tc>
           <w:tcPr>
-            <w:tcW w:type="dxa" w:w="3135"/>
+            <w:tcW w:type="dxa" w:w="3324"/>
           </w:tcPr>
           <w:p>
             <w:r>
               <w:rPr>
                 <w:rFonts w:ascii="Arial" w:hAnsi="Arial"/>
-                <w:sz w:val="16"/>
+                <w:sz w:val="14"/>
               </w:rPr>
               <w:t>BAIXO</w:t>
             </w:r>
@@ -1981,13 +2422,13 @@
         </w:tc>
         <w:tc>
           <w:tcPr>
-            <w:tcW w:type="dxa" w:w="3135"/>
+            <w:tcW w:type="dxa" w:w="3324"/>
           </w:tcPr>
           <w:p>
             <w:r>
               <w:rPr>
                 <w:rFonts w:ascii="Arial" w:hAnsi="Arial"/>
-                <w:sz w:val="16"/>
+                <w:sz w:val="14"/>
               </w:rPr>
               <w:t>Lembrete padrão</w:t>
             </w:r>
@@ -1998,15 +2439,14 @@
     <w:p/>
     <w:p>
       <w:pPr>
-        <w:spacing w:after="60" w:line="264" w:lineRule="auto"/>
+        <w:spacing w:after="40"/>
       </w:pPr>
       <w:r>
         <w:rPr>
           <w:rFonts w:ascii="Arial" w:hAnsi="Arial"/>
-          <w:b w:val="0"/>
-          <w:sz w:val="20"/>
+          <w:sz w:val="18"/>
         </w:rPr>
-        <w:t>Limitações: dados de 2025, janela do alvo não documentada, recomenda-se piloto controlado.</w:t>
+        <w:t>Desempenho esperado: Acurácia ~77% (vs 74% baseline). Limitações: dados 2025, janela não documentada.</w:t>
       </w:r>
     </w:p>
     <w:p>
@@ -2014,14 +2454,14 @@
         <w:rPr>
           <w:rFonts w:ascii="Arial" w:hAnsi="Arial"/>
           <w:i/>
-          <w:sz w:val="16"/>
+          <w:sz w:val="14"/>
         </w:rPr>
         <w:t>Documento elaborado com auxílio de IA. Decisões de modelagem conduzidas pelo grupo.</w:t>
       </w:r>
     </w:p>
     <w:sectPr>
       <w:pgSz w:w="12240" w:h="15840"/>
-      <w:pgMar w:top="1134" w:right="1417" w:bottom="1134" w:left="1417" w:header="720" w:footer="720" w:gutter="0"/>
+      <w:pgMar w:top="1020" w:right="1134" w:bottom="1020" w:left="1134" w:header="720" w:footer="720" w:gutter="0"/>
       <w:cols w:space="720"/>
       <w:docGrid w:linePitch="360"/>
     </w:sectPr>

</xml_diff>

<commit_message>
Remove Nicolas Henrique Richardt da Silva da lista do grupo
</commit_message>
<xml_diff>
--- a/atividade_avaliacao/entrega_final/Relatorio_Honda_Revisao_FGV.docx
+++ b/atividade_avaliacao/entrega_final/Relatorio_Honda_Revisao_FGV.docx
@@ -135,36 +135,6 @@
                 <w:sz w:val="16"/>
               </w:rPr>
               <w:t>812869/2026</w:t>
-            </w:r>
-          </w:p>
-        </w:tc>
-      </w:tr>
-      <w:tr>
-        <w:tc>
-          <w:tcPr>
-            <w:tcW w:type="dxa" w:w="4986"/>
-          </w:tcPr>
-          <w:p>
-            <w:r>
-              <w:rPr>
-                <w:rFonts w:ascii="Arial" w:hAnsi="Arial"/>
-                <w:sz w:val="16"/>
-              </w:rPr>
-              <w:t>Nicolas Henrique Richardt da Silva</w:t>
-            </w:r>
-          </w:p>
-        </w:tc>
-        <w:tc>
-          <w:tcPr>
-            <w:tcW w:type="dxa" w:w="4986"/>
-          </w:tcPr>
-          <w:p>
-            <w:r>
-              <w:rPr>
-                <w:rFonts w:ascii="Arial" w:hAnsi="Arial"/>
-                <w:sz w:val="16"/>
-              </w:rPr>
-              <w:t>813138/2026</w:t>
             </w:r>
           </w:p>
         </w:tc>
@@ -2200,18 +2170,6 @@
     </w:tbl>
     <w:p/>
     <w:p>
-      <w:pPr>
-        <w:spacing w:after="40"/>
-      </w:pPr>
-      <w:r>
-        <w:rPr>
-          <w:rFonts w:ascii="Arial" w:hAnsi="Arial"/>
-          <w:sz w:val="16"/>
-        </w:rPr>
-        <w:t>Casos 2,3: falsos negativos - clientes retornaram mas modelo previu não retorno.</w:t>
-      </w:r>
-    </w:p>
-    <w:p>
       <w:r>
         <w:rPr>
           <w:rFonts w:ascii="Arial" w:hAnsi="Arial"/>

</xml_diff>

<commit_message>
Mantém apenas João Victor e Rodrigo Pimentel no grupo
</commit_message>
<xml_diff>
--- a/atividade_avaliacao/entrega_final/Relatorio_Honda_Revisao_FGV.docx
+++ b/atividade_avaliacao/entrega_final/Relatorio_Honda_Revisao_FGV.docx
@@ -105,66 +105,6 @@
                 <w:sz w:val="16"/>
               </w:rPr>
               <w:t>813190/2026</w:t>
-            </w:r>
-          </w:p>
-        </w:tc>
-      </w:tr>
-      <w:tr>
-        <w:tc>
-          <w:tcPr>
-            <w:tcW w:type="dxa" w:w="4986"/>
-          </w:tcPr>
-          <w:p>
-            <w:r>
-              <w:rPr>
-                <w:rFonts w:ascii="Arial" w:hAnsi="Arial"/>
-                <w:sz w:val="16"/>
-              </w:rPr>
-              <w:t>Martinho Aloisio Lenz</w:t>
-            </w:r>
-          </w:p>
-        </w:tc>
-        <w:tc>
-          <w:tcPr>
-            <w:tcW w:type="dxa" w:w="4986"/>
-          </w:tcPr>
-          <w:p>
-            <w:r>
-              <w:rPr>
-                <w:rFonts w:ascii="Arial" w:hAnsi="Arial"/>
-                <w:sz w:val="16"/>
-              </w:rPr>
-              <w:t>812869/2026</w:t>
-            </w:r>
-          </w:p>
-        </w:tc>
-      </w:tr>
-      <w:tr>
-        <w:tc>
-          <w:tcPr>
-            <w:tcW w:type="dxa" w:w="4986"/>
-          </w:tcPr>
-          <w:p>
-            <w:r>
-              <w:rPr>
-                <w:rFonts w:ascii="Arial" w:hAnsi="Arial"/>
-                <w:sz w:val="16"/>
-              </w:rPr>
-              <w:t>Renato Vargas Monteiro</w:t>
-            </w:r>
-          </w:p>
-        </w:tc>
-        <w:tc>
-          <w:tcPr>
-            <w:tcW w:type="dxa" w:w="4986"/>
-          </w:tcPr>
-          <w:p>
-            <w:r>
-              <w:rPr>
-                <w:rFonts w:ascii="Arial" w:hAnsi="Arial"/>
-                <w:sz w:val="16"/>
-              </w:rPr>
-              <w:t>812872/2026</w:t>
             </w:r>
           </w:p>
         </w:tc>

</xml_diff>